<commit_message>
Part 4 V2 Complete
</commit_message>
<xml_diff>
--- a/_book/Achieving-True-Liberation.docx
+++ b/_book/Achieving-True-Liberation.docx
@@ -31,7 +31,7 @@
         <w:pStyle w:val="Date"/>
       </w:pPr>
       <w:r>
-        <w:t>2026-03-01</w:t>
+        <w:t>2026-03-04</w:t>
       </w:r>
     </w:p>
     <w:sdt>
@@ -44,7 +44,7 @@
           <w:sz w:val="22"/>
           <w:szCs w:val="22"/>
         </w:rPr>
-        <w:id w:val="-1289970987"/>
+        <w:id w:val="404962935"/>
         <w:docPartObj>
           <w:docPartGallery w:val="Table of Contents"/>
           <w:docPartUnique/>
@@ -78,7 +78,7 @@
           <w:r>
             <w:fldChar w:fldCharType="separate"/>
           </w:r>
-          <w:hyperlink w:anchor="_Toc223295688" w:history="1">
+          <w:hyperlink w:anchor="_Toc223511198" w:history="1">
             <w:r>
               <w:rPr>
                 <w:rStyle w:val="Hyperlink"/>
@@ -105,7 +105,7 @@
                 <w:noProof/>
                 <w:webHidden/>
               </w:rPr>
-              <w:instrText xml:space="preserve"> PAGEREF _Toc223295688 \h </w:instrText>
+              <w:instrText xml:space="preserve"> PAGEREF _Toc223511198 \h </w:instrText>
             </w:r>
             <w:r>
               <w:rPr>
@@ -146,7 +146,7 @@
               <w:noProof/>
             </w:rPr>
           </w:pPr>
-          <w:hyperlink w:anchor="_Toc223295689" w:history="1">
+          <w:hyperlink w:anchor="_Toc223511199" w:history="1">
             <w:r>
               <w:rPr>
                 <w:rStyle w:val="Hyperlink"/>
@@ -173,7 +173,7 @@
                 <w:noProof/>
                 <w:webHidden/>
               </w:rPr>
-              <w:instrText xml:space="preserve"> PAGEREF _Toc223295689 \h </w:instrText>
+              <w:instrText xml:space="preserve"> PAGEREF _Toc223511199 \h </w:instrText>
             </w:r>
             <w:r>
               <w:rPr>
@@ -214,7 +214,7 @@
               <w:noProof/>
             </w:rPr>
           </w:pPr>
-          <w:hyperlink w:anchor="_Toc223295690" w:history="1">
+          <w:hyperlink w:anchor="_Toc223511200" w:history="1">
             <w:r>
               <w:rPr>
                 <w:rStyle w:val="Hyperlink"/>
@@ -241,7 +241,7 @@
                 <w:noProof/>
                 <w:webHidden/>
               </w:rPr>
-              <w:instrText xml:space="preserve"> PAGEREF _Toc223295690 \h </w:instrText>
+              <w:instrText xml:space="preserve"> PAGEREF _Toc223511200 \h </w:instrText>
             </w:r>
             <w:r>
               <w:rPr>
@@ -282,7 +282,7 @@
               <w:noProof/>
             </w:rPr>
           </w:pPr>
-          <w:hyperlink w:anchor="_Toc223295691" w:history="1">
+          <w:hyperlink w:anchor="_Toc223511201" w:history="1">
             <w:r>
               <w:rPr>
                 <w:rStyle w:val="Hyperlink"/>
@@ -309,7 +309,7 @@
                 <w:noProof/>
                 <w:webHidden/>
               </w:rPr>
-              <w:instrText xml:space="preserve"> PAGEREF _Toc223295691 \h </w:instrText>
+              <w:instrText xml:space="preserve"> PAGEREF _Toc223511201 \h </w:instrText>
             </w:r>
             <w:r>
               <w:rPr>
@@ -350,7 +350,7 @@
               <w:noProof/>
             </w:rPr>
           </w:pPr>
-          <w:hyperlink w:anchor="_Toc223295692" w:history="1">
+          <w:hyperlink w:anchor="_Toc223511202" w:history="1">
             <w:r>
               <w:rPr>
                 <w:rStyle w:val="Hyperlink"/>
@@ -377,7 +377,7 @@
                 <w:noProof/>
                 <w:webHidden/>
               </w:rPr>
-              <w:instrText xml:space="preserve"> PAGEREF _Toc223295692 \h </w:instrText>
+              <w:instrText xml:space="preserve"> PAGEREF _Toc223511202 \h </w:instrText>
             </w:r>
             <w:r>
               <w:rPr>
@@ -418,7 +418,7 @@
               <w:noProof/>
             </w:rPr>
           </w:pPr>
-          <w:hyperlink w:anchor="_Toc223295693" w:history="1">
+          <w:hyperlink w:anchor="_Toc223511203" w:history="1">
             <w:r>
               <w:rPr>
                 <w:rStyle w:val="Hyperlink"/>
@@ -445,7 +445,7 @@
                 <w:noProof/>
                 <w:webHidden/>
               </w:rPr>
-              <w:instrText xml:space="preserve"> PAGEREF _Toc223295693 \h </w:instrText>
+              <w:instrText xml:space="preserve"> PAGEREF _Toc223511203 \h </w:instrText>
             </w:r>
             <w:r>
               <w:rPr>
@@ -486,7 +486,7 @@
               <w:noProof/>
             </w:rPr>
           </w:pPr>
-          <w:hyperlink w:anchor="_Toc223295694" w:history="1">
+          <w:hyperlink w:anchor="_Toc223511204" w:history="1">
             <w:r>
               <w:rPr>
                 <w:rStyle w:val="Hyperlink"/>
@@ -513,7 +513,7 @@
                 <w:noProof/>
                 <w:webHidden/>
               </w:rPr>
-              <w:instrText xml:space="preserve"> PAGEREF _Toc223295694 \h </w:instrText>
+              <w:instrText xml:space="preserve"> PAGEREF _Toc223511204 \h </w:instrText>
             </w:r>
             <w:r>
               <w:rPr>
@@ -554,7 +554,7 @@
               <w:noProof/>
             </w:rPr>
           </w:pPr>
-          <w:hyperlink w:anchor="_Toc223295695" w:history="1">
+          <w:hyperlink w:anchor="_Toc223511205" w:history="1">
             <w:r>
               <w:rPr>
                 <w:rStyle w:val="Hyperlink"/>
@@ -581,7 +581,7 @@
                 <w:noProof/>
                 <w:webHidden/>
               </w:rPr>
-              <w:instrText xml:space="preserve"> PAGEREF _Toc223295695 \h </w:instrText>
+              <w:instrText xml:space="preserve"> PAGEREF _Toc223511205 \h </w:instrText>
             </w:r>
             <w:r>
               <w:rPr>
@@ -622,7 +622,7 @@
               <w:noProof/>
             </w:rPr>
           </w:pPr>
-          <w:hyperlink w:anchor="_Toc223295696" w:history="1">
+          <w:hyperlink w:anchor="_Toc223511206" w:history="1">
             <w:r>
               <w:rPr>
                 <w:rStyle w:val="Hyperlink"/>
@@ -649,7 +649,7 @@
                 <w:noProof/>
                 <w:webHidden/>
               </w:rPr>
-              <w:instrText xml:space="preserve"> PAGEREF _Toc223295696 \h </w:instrText>
+              <w:instrText xml:space="preserve"> PAGEREF _Toc223511206 \h </w:instrText>
             </w:r>
             <w:r>
               <w:rPr>
@@ -690,7 +690,7 @@
               <w:noProof/>
             </w:rPr>
           </w:pPr>
-          <w:hyperlink w:anchor="_Toc223295697" w:history="1">
+          <w:hyperlink w:anchor="_Toc223511207" w:history="1">
             <w:r>
               <w:rPr>
                 <w:rStyle w:val="Hyperlink"/>
@@ -717,7 +717,7 @@
                 <w:noProof/>
                 <w:webHidden/>
               </w:rPr>
-              <w:instrText xml:space="preserve"> PAGEREF _Toc223295697 \h </w:instrText>
+              <w:instrText xml:space="preserve"> PAGEREF _Toc223511207 \h </w:instrText>
             </w:r>
             <w:r>
               <w:rPr>
@@ -758,7 +758,7 @@
               <w:noProof/>
             </w:rPr>
           </w:pPr>
-          <w:hyperlink w:anchor="_Toc223295698" w:history="1">
+          <w:hyperlink w:anchor="_Toc223511208" w:history="1">
             <w:r>
               <w:rPr>
                 <w:rStyle w:val="Hyperlink"/>
@@ -785,7 +785,7 @@
                 <w:noProof/>
                 <w:webHidden/>
               </w:rPr>
-              <w:instrText xml:space="preserve"> PAGEREF _Toc223295698 \h </w:instrText>
+              <w:instrText xml:space="preserve"> PAGEREF _Toc223511208 \h </w:instrText>
             </w:r>
             <w:r>
               <w:rPr>
@@ -826,7 +826,7 @@
               <w:noProof/>
             </w:rPr>
           </w:pPr>
-          <w:hyperlink w:anchor="_Toc223295699" w:history="1">
+          <w:hyperlink w:anchor="_Toc223511209" w:history="1">
             <w:r>
               <w:rPr>
                 <w:rStyle w:val="Hyperlink"/>
@@ -853,7 +853,7 @@
                 <w:noProof/>
                 <w:webHidden/>
               </w:rPr>
-              <w:instrText xml:space="preserve"> PAGEREF _Toc223295699 \h </w:instrText>
+              <w:instrText xml:space="preserve"> PAGEREF _Toc223511209 \h </w:instrText>
             </w:r>
             <w:r>
               <w:rPr>
@@ -894,7 +894,7 @@
               <w:noProof/>
             </w:rPr>
           </w:pPr>
-          <w:hyperlink w:anchor="_Toc223295700" w:history="1">
+          <w:hyperlink w:anchor="_Toc223511210" w:history="1">
             <w:r>
               <w:rPr>
                 <w:rStyle w:val="Hyperlink"/>
@@ -921,7 +921,7 @@
                 <w:noProof/>
                 <w:webHidden/>
               </w:rPr>
-              <w:instrText xml:space="preserve"> PAGEREF _Toc223295700 \h </w:instrText>
+              <w:instrText xml:space="preserve"> PAGEREF _Toc223511210 \h </w:instrText>
             </w:r>
             <w:r>
               <w:rPr>
@@ -962,7 +962,7 @@
               <w:noProof/>
             </w:rPr>
           </w:pPr>
-          <w:hyperlink w:anchor="_Toc223295701" w:history="1">
+          <w:hyperlink w:anchor="_Toc223511211" w:history="1">
             <w:r>
               <w:rPr>
                 <w:rStyle w:val="Hyperlink"/>
@@ -989,7 +989,7 @@
                 <w:noProof/>
                 <w:webHidden/>
               </w:rPr>
-              <w:instrText xml:space="preserve"> PAGEREF _Toc223295701 \h </w:instrText>
+              <w:instrText xml:space="preserve"> PAGEREF _Toc223511211 \h </w:instrText>
             </w:r>
             <w:r>
               <w:rPr>
@@ -1030,7 +1030,7 @@
               <w:noProof/>
             </w:rPr>
           </w:pPr>
-          <w:hyperlink w:anchor="_Toc223295702" w:history="1">
+          <w:hyperlink w:anchor="_Toc223511212" w:history="1">
             <w:r>
               <w:rPr>
                 <w:rStyle w:val="Hyperlink"/>
@@ -1057,7 +1057,7 @@
                 <w:noProof/>
                 <w:webHidden/>
               </w:rPr>
-              <w:instrText xml:space="preserve"> PAGEREF _Toc223295702 \h </w:instrText>
+              <w:instrText xml:space="preserve"> PAGEREF _Toc223511212 \h </w:instrText>
             </w:r>
             <w:r>
               <w:rPr>
@@ -1098,7 +1098,7 @@
               <w:noProof/>
             </w:rPr>
           </w:pPr>
-          <w:hyperlink w:anchor="_Toc223295703" w:history="1">
+          <w:hyperlink w:anchor="_Toc223511213" w:history="1">
             <w:r>
               <w:rPr>
                 <w:rStyle w:val="Hyperlink"/>
@@ -1125,7 +1125,7 @@
                 <w:noProof/>
                 <w:webHidden/>
               </w:rPr>
-              <w:instrText xml:space="preserve"> PAGEREF _Toc223295703 \h </w:instrText>
+              <w:instrText xml:space="preserve"> PAGEREF _Toc223511213 \h </w:instrText>
             </w:r>
             <w:r>
               <w:rPr>
@@ -1166,7 +1166,7 @@
               <w:noProof/>
             </w:rPr>
           </w:pPr>
-          <w:hyperlink w:anchor="_Toc223295704" w:history="1">
+          <w:hyperlink w:anchor="_Toc223511214" w:history="1">
             <w:r>
               <w:rPr>
                 <w:rStyle w:val="Hyperlink"/>
@@ -1193,7 +1193,7 @@
                 <w:noProof/>
                 <w:webHidden/>
               </w:rPr>
-              <w:instrText xml:space="preserve"> PAGEREF _Toc223295704 \h </w:instrText>
+              <w:instrText xml:space="preserve"> PAGEREF _Toc223511214 \h </w:instrText>
             </w:r>
             <w:r>
               <w:rPr>
@@ -1234,7 +1234,7 @@
               <w:noProof/>
             </w:rPr>
           </w:pPr>
-          <w:hyperlink w:anchor="_Toc223295705" w:history="1">
+          <w:hyperlink w:anchor="_Toc223511215" w:history="1">
             <w:r>
               <w:rPr>
                 <w:rStyle w:val="Hyperlink"/>
@@ -1261,7 +1261,7 @@
                 <w:noProof/>
                 <w:webHidden/>
               </w:rPr>
-              <w:instrText xml:space="preserve"> PAGEREF _Toc223295705 \h </w:instrText>
+              <w:instrText xml:space="preserve"> PAGEREF _Toc223511215 \h </w:instrText>
             </w:r>
             <w:r>
               <w:rPr>
@@ -1302,7 +1302,7 @@
               <w:noProof/>
             </w:rPr>
           </w:pPr>
-          <w:hyperlink w:anchor="_Toc223295706" w:history="1">
+          <w:hyperlink w:anchor="_Toc223511216" w:history="1">
             <w:r>
               <w:rPr>
                 <w:rStyle w:val="Hyperlink"/>
@@ -1329,7 +1329,7 @@
                 <w:noProof/>
                 <w:webHidden/>
               </w:rPr>
-              <w:instrText xml:space="preserve"> PAGEREF _Toc223295706 \h </w:instrText>
+              <w:instrText xml:space="preserve"> PAGEREF _Toc223511216 \h </w:instrText>
             </w:r>
             <w:r>
               <w:rPr>
@@ -1370,7 +1370,7 @@
               <w:noProof/>
             </w:rPr>
           </w:pPr>
-          <w:hyperlink w:anchor="_Toc223295707" w:history="1">
+          <w:hyperlink w:anchor="_Toc223511217" w:history="1">
             <w:r>
               <w:rPr>
                 <w:rStyle w:val="Hyperlink"/>
@@ -1397,7 +1397,7 @@
                 <w:noProof/>
                 <w:webHidden/>
               </w:rPr>
-              <w:instrText xml:space="preserve"> PAGEREF _Toc223295707 \h </w:instrText>
+              <w:instrText xml:space="preserve"> PAGEREF _Toc223511217 \h </w:instrText>
             </w:r>
             <w:r>
               <w:rPr>
@@ -1438,7 +1438,7 @@
               <w:noProof/>
             </w:rPr>
           </w:pPr>
-          <w:hyperlink w:anchor="_Toc223295708" w:history="1">
+          <w:hyperlink w:anchor="_Toc223511218" w:history="1">
             <w:r>
               <w:rPr>
                 <w:rStyle w:val="Hyperlink"/>
@@ -1465,7 +1465,7 @@
                 <w:noProof/>
                 <w:webHidden/>
               </w:rPr>
-              <w:instrText xml:space="preserve"> PAGEREF _Toc223295708 \h </w:instrText>
+              <w:instrText xml:space="preserve"> PAGEREF _Toc223511218 \h </w:instrText>
             </w:r>
             <w:r>
               <w:rPr>
@@ -1506,7 +1506,7 @@
               <w:noProof/>
             </w:rPr>
           </w:pPr>
-          <w:hyperlink w:anchor="_Toc223295709" w:history="1">
+          <w:hyperlink w:anchor="_Toc223511219" w:history="1">
             <w:r>
               <w:rPr>
                 <w:rStyle w:val="Hyperlink"/>
@@ -1533,7 +1533,7 @@
                 <w:noProof/>
                 <w:webHidden/>
               </w:rPr>
-              <w:instrText xml:space="preserve"> PAGEREF _Toc223295709 \h </w:instrText>
+              <w:instrText xml:space="preserve"> PAGEREF _Toc223511219 \h </w:instrText>
             </w:r>
             <w:r>
               <w:rPr>
@@ -1574,7 +1574,7 @@
               <w:noProof/>
             </w:rPr>
           </w:pPr>
-          <w:hyperlink w:anchor="_Toc223295710" w:history="1">
+          <w:hyperlink w:anchor="_Toc223511220" w:history="1">
             <w:r>
               <w:rPr>
                 <w:rStyle w:val="Hyperlink"/>
@@ -1601,7 +1601,7 @@
                 <w:noProof/>
                 <w:webHidden/>
               </w:rPr>
-              <w:instrText xml:space="preserve"> PAGEREF _Toc223295710 \h </w:instrText>
+              <w:instrText xml:space="preserve"> PAGEREF _Toc223511220 \h </w:instrText>
             </w:r>
             <w:r>
               <w:rPr>
@@ -1642,7 +1642,7 @@
               <w:noProof/>
             </w:rPr>
           </w:pPr>
-          <w:hyperlink w:anchor="_Toc223295711" w:history="1">
+          <w:hyperlink w:anchor="_Toc223511221" w:history="1">
             <w:r>
               <w:rPr>
                 <w:rStyle w:val="Hyperlink"/>
@@ -1669,7 +1669,7 @@
                 <w:noProof/>
                 <w:webHidden/>
               </w:rPr>
-              <w:instrText xml:space="preserve"> PAGEREF _Toc223295711 \h </w:instrText>
+              <w:instrText xml:space="preserve"> PAGEREF _Toc223511221 \h </w:instrText>
             </w:r>
             <w:r>
               <w:rPr>
@@ -1710,7 +1710,7 @@
               <w:noProof/>
             </w:rPr>
           </w:pPr>
-          <w:hyperlink w:anchor="_Toc223295712" w:history="1">
+          <w:hyperlink w:anchor="_Toc223511222" w:history="1">
             <w:r>
               <w:rPr>
                 <w:rStyle w:val="Hyperlink"/>
@@ -1737,7 +1737,7 @@
                 <w:noProof/>
                 <w:webHidden/>
               </w:rPr>
-              <w:instrText xml:space="preserve"> PAGEREF _Toc223295712 \h </w:instrText>
+              <w:instrText xml:space="preserve"> PAGEREF _Toc223511222 \h </w:instrText>
             </w:r>
             <w:r>
               <w:rPr>
@@ -1778,7 +1778,7 @@
               <w:noProof/>
             </w:rPr>
           </w:pPr>
-          <w:hyperlink w:anchor="_Toc223295713" w:history="1">
+          <w:hyperlink w:anchor="_Toc223511223" w:history="1">
             <w:r>
               <w:rPr>
                 <w:rStyle w:val="Hyperlink"/>
@@ -1805,7 +1805,7 @@
                 <w:noProof/>
                 <w:webHidden/>
               </w:rPr>
-              <w:instrText xml:space="preserve"> PAGEREF _Toc223295713 \h </w:instrText>
+              <w:instrText xml:space="preserve"> PAGEREF _Toc223511223 \h </w:instrText>
             </w:r>
             <w:r>
               <w:rPr>
@@ -1846,7 +1846,7 @@
               <w:noProof/>
             </w:rPr>
           </w:pPr>
-          <w:hyperlink w:anchor="_Toc223295714" w:history="1">
+          <w:hyperlink w:anchor="_Toc223511224" w:history="1">
             <w:r>
               <w:rPr>
                 <w:rStyle w:val="Hyperlink"/>
@@ -1873,7 +1873,7 @@
                 <w:noProof/>
                 <w:webHidden/>
               </w:rPr>
-              <w:instrText xml:space="preserve"> PAGEREF _Toc223295714 \h </w:instrText>
+              <w:instrText xml:space="preserve"> PAGEREF _Toc223511224 \h </w:instrText>
             </w:r>
             <w:r>
               <w:rPr>
@@ -1914,7 +1914,7 @@
               <w:noProof/>
             </w:rPr>
           </w:pPr>
-          <w:hyperlink w:anchor="_Toc223295715" w:history="1">
+          <w:hyperlink w:anchor="_Toc223511225" w:history="1">
             <w:r>
               <w:rPr>
                 <w:rStyle w:val="Hyperlink"/>
@@ -1941,7 +1941,7 @@
                 <w:noProof/>
                 <w:webHidden/>
               </w:rPr>
-              <w:instrText xml:space="preserve"> PAGEREF _Toc223295715 \h </w:instrText>
+              <w:instrText xml:space="preserve"> PAGEREF _Toc223511225 \h </w:instrText>
             </w:r>
             <w:r>
               <w:rPr>
@@ -1961,7 +1961,7 @@
                 <w:noProof/>
                 <w:webHidden/>
               </w:rPr>
-              <w:t>241</w:t>
+              <w:t>242</w:t>
             </w:r>
             <w:r>
               <w:rPr>
@@ -1982,7 +1982,7 @@
               <w:noProof/>
             </w:rPr>
           </w:pPr>
-          <w:hyperlink w:anchor="_Toc223295716" w:history="1">
+          <w:hyperlink w:anchor="_Toc223511226" w:history="1">
             <w:r>
               <w:rPr>
                 <w:rStyle w:val="Hyperlink"/>
@@ -2009,7 +2009,7 @@
                 <w:noProof/>
                 <w:webHidden/>
               </w:rPr>
-              <w:instrText xml:space="preserve"> PAGEREF _Toc223295716 \h </w:instrText>
+              <w:instrText xml:space="preserve"> PAGEREF _Toc223511226 \h </w:instrText>
             </w:r>
             <w:r>
               <w:rPr>
@@ -2029,7 +2029,7 @@
                 <w:noProof/>
                 <w:webHidden/>
               </w:rPr>
-              <w:t>247</w:t>
+              <w:t>249</w:t>
             </w:r>
             <w:r>
               <w:rPr>
@@ -2050,7 +2050,7 @@
               <w:noProof/>
             </w:rPr>
           </w:pPr>
-          <w:hyperlink w:anchor="_Toc223295717" w:history="1">
+          <w:hyperlink w:anchor="_Toc223511227" w:history="1">
             <w:r>
               <w:rPr>
                 <w:rStyle w:val="Hyperlink"/>
@@ -2077,7 +2077,7 @@
                 <w:noProof/>
                 <w:webHidden/>
               </w:rPr>
-              <w:instrText xml:space="preserve"> PAGEREF _Toc223295717 \h </w:instrText>
+              <w:instrText xml:space="preserve"> PAGEREF _Toc223511227 \h </w:instrText>
             </w:r>
             <w:r>
               <w:rPr>
@@ -2097,7 +2097,7 @@
                 <w:noProof/>
                 <w:webHidden/>
               </w:rPr>
-              <w:t>252</w:t>
+              <w:t>254</w:t>
             </w:r>
             <w:r>
               <w:rPr>
@@ -2118,7 +2118,7 @@
               <w:noProof/>
             </w:rPr>
           </w:pPr>
-          <w:hyperlink w:anchor="_Toc223295718" w:history="1">
+          <w:hyperlink w:anchor="_Toc223511228" w:history="1">
             <w:r>
               <w:rPr>
                 <w:rStyle w:val="Hyperlink"/>
@@ -2145,7 +2145,7 @@
                 <w:noProof/>
                 <w:webHidden/>
               </w:rPr>
-              <w:instrText xml:space="preserve"> PAGEREF _Toc223295718 \h </w:instrText>
+              <w:instrText xml:space="preserve"> PAGEREF _Toc223511228 \h </w:instrText>
             </w:r>
             <w:r>
               <w:rPr>
@@ -2165,7 +2165,7 @@
                 <w:noProof/>
                 <w:webHidden/>
               </w:rPr>
-              <w:t>253</w:t>
+              <w:t>255</w:t>
             </w:r>
             <w:r>
               <w:rPr>
@@ -2186,7 +2186,7 @@
               <w:noProof/>
             </w:rPr>
           </w:pPr>
-          <w:hyperlink w:anchor="_Toc223295719" w:history="1">
+          <w:hyperlink w:anchor="_Toc223511229" w:history="1">
             <w:r>
               <w:rPr>
                 <w:rStyle w:val="Hyperlink"/>
@@ -2213,7 +2213,7 @@
                 <w:noProof/>
                 <w:webHidden/>
               </w:rPr>
-              <w:instrText xml:space="preserve"> PAGEREF _Toc223295719 \h </w:instrText>
+              <w:instrText xml:space="preserve"> PAGEREF _Toc223511229 \h </w:instrText>
             </w:r>
             <w:r>
               <w:rPr>
@@ -2233,7 +2233,7 @@
                 <w:noProof/>
                 <w:webHidden/>
               </w:rPr>
-              <w:t>254</w:t>
+              <w:t>256</w:t>
             </w:r>
             <w:r>
               <w:rPr>
@@ -2254,7 +2254,7 @@
               <w:noProof/>
             </w:rPr>
           </w:pPr>
-          <w:hyperlink w:anchor="_Toc223295720" w:history="1">
+          <w:hyperlink w:anchor="_Toc223511230" w:history="1">
             <w:r>
               <w:rPr>
                 <w:rStyle w:val="Hyperlink"/>
@@ -2281,7 +2281,7 @@
                 <w:noProof/>
                 <w:webHidden/>
               </w:rPr>
-              <w:instrText xml:space="preserve"> PAGEREF _Toc223295720 \h </w:instrText>
+              <w:instrText xml:space="preserve"> PAGEREF _Toc223511230 \h </w:instrText>
             </w:r>
             <w:r>
               <w:rPr>
@@ -2301,7 +2301,7 @@
                 <w:noProof/>
                 <w:webHidden/>
               </w:rPr>
-              <w:t>257</w:t>
+              <w:t>259</w:t>
             </w:r>
             <w:r>
               <w:rPr>
@@ -2322,7 +2322,7 @@
               <w:noProof/>
             </w:rPr>
           </w:pPr>
-          <w:hyperlink w:anchor="_Toc223295721" w:history="1">
+          <w:hyperlink w:anchor="_Toc223511231" w:history="1">
             <w:r>
               <w:rPr>
                 <w:rStyle w:val="Hyperlink"/>
@@ -2349,7 +2349,7 @@
                 <w:noProof/>
                 <w:webHidden/>
               </w:rPr>
-              <w:instrText xml:space="preserve"> PAGEREF _Toc223295721 \h </w:instrText>
+              <w:instrText xml:space="preserve"> PAGEREF _Toc223511231 \h </w:instrText>
             </w:r>
             <w:r>
               <w:rPr>
@@ -2369,7 +2369,7 @@
                 <w:noProof/>
                 <w:webHidden/>
               </w:rPr>
-              <w:t>259</w:t>
+              <w:t>261</w:t>
             </w:r>
             <w:r>
               <w:rPr>
@@ -2390,7 +2390,7 @@
               <w:noProof/>
             </w:rPr>
           </w:pPr>
-          <w:hyperlink w:anchor="_Toc223295722" w:history="1">
+          <w:hyperlink w:anchor="_Toc223511232" w:history="1">
             <w:r>
               <w:rPr>
                 <w:rStyle w:val="Hyperlink"/>
@@ -2417,7 +2417,7 @@
                 <w:noProof/>
                 <w:webHidden/>
               </w:rPr>
-              <w:instrText xml:space="preserve"> PAGEREF _Toc223295722 \h </w:instrText>
+              <w:instrText xml:space="preserve"> PAGEREF _Toc223511232 \h </w:instrText>
             </w:r>
             <w:r>
               <w:rPr>
@@ -2437,7 +2437,7 @@
                 <w:noProof/>
                 <w:webHidden/>
               </w:rPr>
-              <w:t>261</w:t>
+              <w:t>263</w:t>
             </w:r>
             <w:r>
               <w:rPr>
@@ -2458,7 +2458,7 @@
               <w:noProof/>
             </w:rPr>
           </w:pPr>
-          <w:hyperlink w:anchor="_Toc223295723" w:history="1">
+          <w:hyperlink w:anchor="_Toc223511233" w:history="1">
             <w:r>
               <w:rPr>
                 <w:rStyle w:val="Hyperlink"/>
@@ -2485,7 +2485,7 @@
                 <w:noProof/>
                 <w:webHidden/>
               </w:rPr>
-              <w:instrText xml:space="preserve"> PAGEREF _Toc223295723 \h </w:instrText>
+              <w:instrText xml:space="preserve"> PAGEREF _Toc223511233 \h </w:instrText>
             </w:r>
             <w:r>
               <w:rPr>
@@ -2505,7 +2505,7 @@
                 <w:noProof/>
                 <w:webHidden/>
               </w:rPr>
-              <w:t>262</w:t>
+              <w:t>264</w:t>
             </w:r>
             <w:r>
               <w:rPr>
@@ -2526,7 +2526,7 @@
               <w:noProof/>
             </w:rPr>
           </w:pPr>
-          <w:hyperlink w:anchor="_Toc223295724" w:history="1">
+          <w:hyperlink w:anchor="_Toc223511234" w:history="1">
             <w:r>
               <w:rPr>
                 <w:rStyle w:val="Hyperlink"/>
@@ -2553,7 +2553,7 @@
                 <w:noProof/>
                 <w:webHidden/>
               </w:rPr>
-              <w:instrText xml:space="preserve"> PAGEREF _Toc223295724 \h </w:instrText>
+              <w:instrText xml:space="preserve"> PAGEREF _Toc223511234 \h </w:instrText>
             </w:r>
             <w:r>
               <w:rPr>
@@ -2573,7 +2573,7 @@
                 <w:noProof/>
                 <w:webHidden/>
               </w:rPr>
-              <w:t>266</w:t>
+              <w:t>268</w:t>
             </w:r>
             <w:r>
               <w:rPr>
@@ -2594,7 +2594,7 @@
               <w:noProof/>
             </w:rPr>
           </w:pPr>
-          <w:hyperlink w:anchor="_Toc223295725" w:history="1">
+          <w:hyperlink w:anchor="_Toc223511235" w:history="1">
             <w:r>
               <w:rPr>
                 <w:rStyle w:val="Hyperlink"/>
@@ -2621,7 +2621,7 @@
                 <w:noProof/>
                 <w:webHidden/>
               </w:rPr>
-              <w:instrText xml:space="preserve"> PAGEREF _Toc223295725 \h </w:instrText>
+              <w:instrText xml:space="preserve"> PAGEREF _Toc223511235 \h </w:instrText>
             </w:r>
             <w:r>
               <w:rPr>
@@ -2641,7 +2641,7 @@
                 <w:noProof/>
                 <w:webHidden/>
               </w:rPr>
-              <w:t>269</w:t>
+              <w:t>271</w:t>
             </w:r>
             <w:r>
               <w:rPr>
@@ -2662,7 +2662,7 @@
               <w:noProof/>
             </w:rPr>
           </w:pPr>
-          <w:hyperlink w:anchor="_Toc223295726" w:history="1">
+          <w:hyperlink w:anchor="_Toc223511236" w:history="1">
             <w:r>
               <w:rPr>
                 <w:rStyle w:val="Hyperlink"/>
@@ -2689,7 +2689,7 @@
                 <w:noProof/>
                 <w:webHidden/>
               </w:rPr>
-              <w:instrText xml:space="preserve"> PAGEREF _Toc223295726 \h </w:instrText>
+              <w:instrText xml:space="preserve"> PAGEREF _Toc223511236 \h </w:instrText>
             </w:r>
             <w:r>
               <w:rPr>
@@ -2709,7 +2709,7 @@
                 <w:noProof/>
                 <w:webHidden/>
               </w:rPr>
-              <w:t>272</w:t>
+              <w:t>274</w:t>
             </w:r>
             <w:r>
               <w:rPr>
@@ -2732,7 +2732,7 @@
         <w:pStyle w:val="Heading1"/>
       </w:pPr>
       <w:bookmarkStart w:id="0" w:name="sec-cover"/>
-      <w:bookmarkStart w:id="1" w:name="_Toc223295688"/>
+      <w:bookmarkStart w:id="1" w:name="_Toc223511198"/>
       <w:r>
         <w:lastRenderedPageBreak/>
         <w:t>Cover</w:t>
@@ -2749,7 +2749,7 @@
         </w:rPr>
         <w:lastRenderedPageBreak/>
         <w:drawing>
-          <wp:inline distT="0" distB="0" distL="0" distR="0" wp14:anchorId="79C55BD4" wp14:editId="2360BD84">
+          <wp:inline distT="0" distB="0" distL="0" distR="0" wp14:anchorId="2ACB90E6" wp14:editId="5E82964E">
             <wp:extent cx="5943600" cy="8915400"/>
             <wp:effectExtent l="0" t="0" r="0" b="0"/>
             <wp:docPr id="21" name="Picture" descr="Generated using ChatGPT 5.2"/>
@@ -2810,7 +2810,7 @@
         <w:pStyle w:val="Heading1"/>
       </w:pPr>
       <w:bookmarkStart w:id="2" w:name="sec-introduction"/>
-      <w:bookmarkStart w:id="3" w:name="_Toc223295689"/>
+      <w:bookmarkStart w:id="3" w:name="_Toc223511199"/>
       <w:bookmarkEnd w:id="0"/>
       <w:r>
         <w:lastRenderedPageBreak/>
@@ -2917,7 +2917,7 @@
         <w:pStyle w:val="Heading1"/>
       </w:pPr>
       <w:bookmarkStart w:id="4" w:name="belief-in-god"/>
-      <w:bookmarkStart w:id="5" w:name="_Toc223295690"/>
+      <w:bookmarkStart w:id="5" w:name="_Toc223511200"/>
       <w:bookmarkEnd w:id="2"/>
       <w:r>
         <w:lastRenderedPageBreak/>
@@ -4280,7 +4280,7 @@
         <w:pStyle w:val="Heading1"/>
       </w:pPr>
       <w:bookmarkStart w:id="31" w:name="belief-in-the-human-soul"/>
-      <w:bookmarkStart w:id="32" w:name="_Toc223295691"/>
+      <w:bookmarkStart w:id="32" w:name="_Toc223511201"/>
       <w:bookmarkEnd w:id="4"/>
       <w:bookmarkEnd w:id="30"/>
       <w:r>
@@ -4860,7 +4860,7 @@
         <w:pStyle w:val="Heading1"/>
       </w:pPr>
       <w:bookmarkStart w:id="38" w:name="belief-in-the-worlds-of-god"/>
-      <w:bookmarkStart w:id="39" w:name="_Toc223295692"/>
+      <w:bookmarkStart w:id="39" w:name="_Toc223511202"/>
       <w:bookmarkEnd w:id="31"/>
       <w:bookmarkEnd w:id="37"/>
       <w:r>
@@ -5608,7 +5608,7 @@
         <w:pStyle w:val="Heading1"/>
       </w:pPr>
       <w:bookmarkStart w:id="48" w:name="belief-in-the-day-of-resurrection"/>
-      <w:bookmarkStart w:id="49" w:name="_Toc223295693"/>
+      <w:bookmarkStart w:id="49" w:name="_Toc223511203"/>
       <w:bookmarkEnd w:id="38"/>
       <w:bookmarkEnd w:id="47"/>
       <w:r>
@@ -6414,7 +6414,7 @@
         <w:pStyle w:val="Heading1"/>
       </w:pPr>
       <w:bookmarkStart w:id="61" w:name="belief-in-the-commands-of-god"/>
-      <w:bookmarkStart w:id="62" w:name="_Toc223295694"/>
+      <w:bookmarkStart w:id="62" w:name="_Toc223511204"/>
       <w:bookmarkEnd w:id="48"/>
       <w:bookmarkEnd w:id="60"/>
       <w:r>
@@ -7361,7 +7361,7 @@
         <w:pStyle w:val="Heading1"/>
       </w:pPr>
       <w:bookmarkStart w:id="74" w:name="belief-in-the-manifestation-of-god"/>
-      <w:bookmarkStart w:id="75" w:name="_Toc223295695"/>
+      <w:bookmarkStart w:id="75" w:name="_Toc223511205"/>
       <w:bookmarkEnd w:id="61"/>
       <w:bookmarkEnd w:id="73"/>
       <w:r>
@@ -7981,7 +7981,7 @@
         <w:pStyle w:val="Heading1"/>
       </w:pPr>
       <w:bookmarkStart w:id="83" w:name="foundational-virtues"/>
-      <w:bookmarkStart w:id="84" w:name="_Toc223295696"/>
+      <w:bookmarkStart w:id="84" w:name="_Toc223511206"/>
       <w:bookmarkEnd w:id="74"/>
       <w:bookmarkEnd w:id="82"/>
       <w:r>
@@ -9059,7 +9059,7 @@
         <w:pStyle w:val="Heading1"/>
       </w:pPr>
       <w:bookmarkStart w:id="102" w:name="prayer"/>
-      <w:bookmarkStart w:id="103" w:name="_Toc223295697"/>
+      <w:bookmarkStart w:id="103" w:name="_Toc223511207"/>
       <w:bookmarkEnd w:id="83"/>
       <w:bookmarkEnd w:id="101"/>
       <w:r>
@@ -10018,7 +10018,7 @@
         <w:pStyle w:val="Heading1"/>
       </w:pPr>
       <w:bookmarkStart w:id="125" w:name="recitation"/>
-      <w:bookmarkStart w:id="126" w:name="_Toc223295698"/>
+      <w:bookmarkStart w:id="126" w:name="_Toc223511208"/>
       <w:bookmarkEnd w:id="102"/>
       <w:bookmarkEnd w:id="124"/>
       <w:r>
@@ -10496,7 +10496,7 @@
         <w:pStyle w:val="Heading1"/>
       </w:pPr>
       <w:bookmarkStart w:id="141" w:name="remembrance"/>
-      <w:bookmarkStart w:id="142" w:name="_Toc223295699"/>
+      <w:bookmarkStart w:id="142" w:name="_Toc223511209"/>
       <w:bookmarkEnd w:id="125"/>
       <w:bookmarkEnd w:id="140"/>
       <w:r>
@@ -11293,7 +11293,7 @@
         <w:pStyle w:val="Heading1"/>
       </w:pPr>
       <w:bookmarkStart w:id="160" w:name="reflection"/>
-      <w:bookmarkStart w:id="161" w:name="_Toc223295700"/>
+      <w:bookmarkStart w:id="161" w:name="_Toc223511210"/>
       <w:bookmarkEnd w:id="141"/>
       <w:bookmarkEnd w:id="159"/>
       <w:r>
@@ -12015,7 +12015,7 @@
         <w:pStyle w:val="Heading1"/>
       </w:pPr>
       <w:bookmarkStart w:id="182" w:name="honoring-god"/>
-      <w:bookmarkStart w:id="183" w:name="_Toc223295701"/>
+      <w:bookmarkStart w:id="183" w:name="_Toc223511211"/>
       <w:bookmarkEnd w:id="160"/>
       <w:bookmarkEnd w:id="181"/>
       <w:r>
@@ -13206,7 +13206,7 @@
         <w:pStyle w:val="Heading1"/>
       </w:pPr>
       <w:bookmarkStart w:id="208" w:name="unity"/>
-      <w:bookmarkStart w:id="209" w:name="_Toc223295702"/>
+      <w:bookmarkStart w:id="209" w:name="_Toc223511212"/>
       <w:bookmarkEnd w:id="182"/>
       <w:bookmarkEnd w:id="207"/>
       <w:r>
@@ -13684,7 +13684,7 @@
         <w:pStyle w:val="Heading1"/>
       </w:pPr>
       <w:bookmarkStart w:id="225" w:name="from-birth-to-maturity"/>
-      <w:bookmarkStart w:id="226" w:name="_Toc223295703"/>
+      <w:bookmarkStart w:id="226" w:name="_Toc223511213"/>
       <w:bookmarkEnd w:id="208"/>
       <w:bookmarkEnd w:id="224"/>
       <w:r>
@@ -14663,7 +14663,7 @@
         <w:pStyle w:val="Heading1"/>
       </w:pPr>
       <w:bookmarkStart w:id="251" w:name="from-maturity-to-devotion"/>
-      <w:bookmarkStart w:id="252" w:name="_Toc223295704"/>
+      <w:bookmarkStart w:id="252" w:name="_Toc223511214"/>
       <w:bookmarkEnd w:id="225"/>
       <w:bookmarkEnd w:id="250"/>
       <w:r>
@@ -15475,7 +15475,7 @@
         <w:pStyle w:val="Heading1"/>
       </w:pPr>
       <w:bookmarkStart w:id="270" w:name="the-private-self"/>
-      <w:bookmarkStart w:id="271" w:name="_Toc223295705"/>
+      <w:bookmarkStart w:id="271" w:name="_Toc223511215"/>
       <w:bookmarkEnd w:id="251"/>
       <w:bookmarkEnd w:id="269"/>
       <w:r>
@@ -16671,7 +16671,7 @@
         <w:pStyle w:val="Heading1"/>
       </w:pPr>
       <w:bookmarkStart w:id="285" w:name="the-constructive-social-life"/>
-      <w:bookmarkStart w:id="286" w:name="_Toc223295706"/>
+      <w:bookmarkStart w:id="286" w:name="_Toc223511216"/>
       <w:bookmarkEnd w:id="270"/>
       <w:bookmarkEnd w:id="284"/>
       <w:r>
@@ -17282,7 +17282,7 @@
         <w:pStyle w:val="Heading1"/>
       </w:pPr>
       <w:bookmarkStart w:id="290" w:name="the-protective-social-life"/>
-      <w:bookmarkStart w:id="291" w:name="_Toc223295707"/>
+      <w:bookmarkStart w:id="291" w:name="_Toc223511217"/>
       <w:bookmarkEnd w:id="285"/>
       <w:bookmarkEnd w:id="289"/>
       <w:r>
@@ -18210,7 +18210,7 @@
         <w:pStyle w:val="Heading1"/>
       </w:pPr>
       <w:bookmarkStart w:id="309" w:name="affectionate-relationships"/>
-      <w:bookmarkStart w:id="310" w:name="_Toc223295708"/>
+      <w:bookmarkStart w:id="310" w:name="_Toc223511218"/>
       <w:bookmarkEnd w:id="290"/>
       <w:bookmarkEnd w:id="307"/>
       <w:bookmarkEnd w:id="308"/>
@@ -19218,7 +19218,7 @@
         <w:pStyle w:val="Heading1"/>
       </w:pPr>
       <w:bookmarkStart w:id="332" w:name="trusteeship"/>
-      <w:bookmarkStart w:id="333" w:name="_Toc223295709"/>
+      <w:bookmarkStart w:id="333" w:name="_Toc223511219"/>
       <w:bookmarkEnd w:id="309"/>
       <w:bookmarkEnd w:id="331"/>
       <w:r>
@@ -21081,7 +21081,7 @@
         <w:pStyle w:val="Heading1"/>
       </w:pPr>
       <w:bookmarkStart w:id="358" w:name="consultation"/>
-      <w:bookmarkStart w:id="359" w:name="_Toc223295710"/>
+      <w:bookmarkStart w:id="359" w:name="_Toc223511220"/>
       <w:bookmarkEnd w:id="332"/>
       <w:bookmarkEnd w:id="357"/>
       <w:r>
@@ -21622,7 +21622,7 @@
         <w:pStyle w:val="Heading1"/>
       </w:pPr>
       <w:bookmarkStart w:id="367" w:name="houses-of-justice"/>
-      <w:bookmarkStart w:id="368" w:name="_Toc223295711"/>
+      <w:bookmarkStart w:id="368" w:name="_Toc223511221"/>
       <w:bookmarkEnd w:id="358"/>
       <w:bookmarkEnd w:id="366"/>
       <w:r>
@@ -22609,7 +22609,7 @@
         <w:pStyle w:val="Heading1"/>
       </w:pPr>
       <w:bookmarkStart w:id="384" w:name="political-leadership"/>
-      <w:bookmarkStart w:id="385" w:name="_Toc223295712"/>
+      <w:bookmarkStart w:id="385" w:name="_Toc223511222"/>
       <w:bookmarkEnd w:id="367"/>
       <w:bookmarkEnd w:id="383"/>
       <w:r>
@@ -23953,7 +23953,7 @@
         <w:pStyle w:val="Heading1"/>
       </w:pPr>
       <w:bookmarkStart w:id="411" w:name="spiritual-leadership"/>
-      <w:bookmarkStart w:id="412" w:name="_Toc223295713"/>
+      <w:bookmarkStart w:id="412" w:name="_Toc223511223"/>
       <w:bookmarkEnd w:id="384"/>
       <w:bookmarkEnd w:id="410"/>
       <w:r>
@@ -24824,7 +24824,7 @@
         <w:pStyle w:val="Heading1"/>
       </w:pPr>
       <w:bookmarkStart w:id="423" w:name="spiritual-successorship"/>
-      <w:bookmarkStart w:id="424" w:name="_Toc223295714"/>
+      <w:bookmarkStart w:id="424" w:name="_Toc223511224"/>
       <w:bookmarkEnd w:id="411"/>
       <w:bookmarkEnd w:id="420"/>
       <w:bookmarkEnd w:id="422"/>
@@ -24839,7 +24839,7 @@
         <w:pStyle w:val="FirstParagraph"/>
       </w:pPr>
       <w:r>
-        <w:t>Spiritual successorship describes Baha’u’llah’s plans for when He is no longer with us in person. The Kitab-i-Aqdas has a few paragraphs which outline His vision. This chapter will discuss these plans, as well as Baha’u’llah’s explanations of these plans in His other writings. We learned some examples in the last chapter of the type of leadership Baha’u’llah did not intend. Elsewhere in the book, we have also learned about the various practices from prior religions Baha’u’llah has abolished. Now, we take these lessons and look forward. What was the future supposed to look like from 1892 up to today? How will we shape the future in Baha’u’llah’s vision after today?</w:t>
+        <w:t>Spiritual successorship describes Bahá’u’lláh’s plans for when He is no longer with us in person. The Kitáb-i-Aqdas has a few paragraphs which outline His vision. This chapter will discuss these plans, as well as Bahá’u’lláh’s explanations of these plans in His other writings. We learned some examples in the last chapter of the type of leadership Bahá’u’lláh did not intend. Elsewhere in the book, we have also learned about the various practices from prior religions Bahá’u’lláh has abolished. Now, we take these lessons and look forward. What was the future supposed to look like from 1892 up to today? How will we shape the future in Bahá’u’lláh’s vision after today? This is where spiritual authority, community responsibility, and the work of true liberation meet in practical form.</w:t>
       </w:r>
     </w:p>
     <w:p>
@@ -24856,23 +24856,23 @@
         <w:pStyle w:val="FirstParagraph"/>
       </w:pPr>
       <w:r>
-        <w:t>I want to introduce The Book of My Testament After Me, designated as BH11278. I am unsure exactly when it was written, but as Baha’u’llah Himself named it the “Testament After Me,” I feel it would still be relevant at any point after Him.</w:t>
-      </w:r>
-    </w:p>
-    <w:p>
-      <w:pPr>
-        <w:pStyle w:val="BodyText"/>
-      </w:pPr>
-      <w:r>
-        <w:t>The book is uncompromising in its nature of spiritual successorship. Authority passes through God to the Manifestation and is non-transferable. Baha’u’llah says “Can anyone share with Him in authority? Nay, by the Lord, though all may claim such for themselves.” The true focal point of authority is the Book itself. No one may alter, interpret, or legislate apart from what God has revealed. He asks “Do you find any changer besides God or any interpreter apart from Him?”</w:t>
-      </w:r>
-    </w:p>
-    <w:p>
-      <w:pPr>
-        <w:pStyle w:val="BodyText"/>
-      </w:pPr>
-      <w:r>
-        <w:t>Succession is about recognition, not an inheritance. This recognition is borne of belief and submission to the Divine command, even when the Manifestation is no longer among us. Spiritual legitamancy is measured by fidelity to the divine light. Baha’u’llah says “The Remnant of God in these days is the Manifestation of Light.” Without this light, claims of authority are like shadows, they don’t reflect the light in the mirror of their soul. It may have form, but it lacks substance.</w:t>
+        <w:t>I want to introduce “The Book of My Testament After Me”, designated as BH11278. I am unsure exactly when it was written, but as Bahá’u’lláh Himself named it the “Testament After Me,” I feel it would still be relevant at any point after Him.</w:t>
+      </w:r>
+    </w:p>
+    <w:p>
+      <w:pPr>
+        <w:pStyle w:val="BodyText"/>
+      </w:pPr>
+      <w:r>
+        <w:t>The book is uncompromising in its nature of spiritual successorship. Authority passes through God to the Manifestation and is not transferable. Bahá’u’lláh says “Can anyone share with Him in authority? Nay, by the Lord, though all may claim such for themselves.” The true focal point of authority is the Book itself. No one may alter, interpret, or legislate apart from what God has revealed. He asks “Do you find any changer besides God or any interpreter apart from Him?”</w:t>
+      </w:r>
+    </w:p>
+    <w:p>
+      <w:pPr>
+        <w:pStyle w:val="BodyText"/>
+      </w:pPr>
+      <w:r>
+        <w:t>Succession is about recognition, not an inheritance. This recognition is borne of belief and submission to the Divine command, even when the Manifestation is no longer among us. Spiritual legitimacy is measured by fidelity to the divine light. Bahá’u’lláh says “The Remnant of God in these days is the Manifestation of Light.” Without this light, claims of authority are like shadows. They do not reflect the light in the mirror of their soul. They may have form, but they lack substance.</w:t>
       </w:r>
     </w:p>
     <w:p>
@@ -24881,6 +24881,26 @@
       </w:pPr>
       <w:r>
         <w:t>Finally, BH11278 establishes a model of successorship where all authority after the Manifestation is custodial, conditional, and answerable to God alone. It is not absolute, it is not infallible, and it does not grant any rights to any leader unless explicitly granted by God.</w:t>
+      </w:r>
+    </w:p>
+    <w:p>
+      <w:pPr>
+        <w:pStyle w:val="BodyText"/>
+      </w:pPr>
+      <w:r>
+        <w:rPr>
+          <w:i/>
+          <w:iCs/>
+        </w:rPr>
+        <w:t>Reflection: What changes in your sense of responsibility when you treat the Book as the center of authority, rather than any person who speaks about it?</w:t>
+      </w:r>
+    </w:p>
+    <w:p>
+      <w:pPr>
+        <w:pStyle w:val="BodyText"/>
+      </w:pPr>
+      <w:r>
+        <w:t>This question matters because it shifts spiritual life from dependence to trusteeship.</w:t>
       </w:r>
     </w:p>
     <w:p>
@@ -24898,7 +24918,7 @@
         <w:pStyle w:val="FirstParagraph"/>
       </w:pPr>
       <w:r>
-        <w:t>Baha’u’llah says “no one is permitted to manage them except with permission of the Source of Revelation.”</w:t>
+        <w:t>Bahá’u’lláh says “no one is permitted to manage them except with permission of the Source of Revelation.”</w:t>
       </w:r>
       <w:r>
         <w:rPr>
@@ -24907,34 +24927,57 @@
         <w:footnoteReference w:id="550"/>
       </w:r>
       <w:r>
-        <w:t xml:space="preserve"> He continues by saying endowments is passed to the Aghsán, after them the institution of the House of Justice if it is established in the land. If not, endowments revert to the people of Baha. These endowments can only be used as specified in the Book. The specifications are for charitable purposes and in elevated places for the Cause.</w:t>
-      </w:r>
-    </w:p>
-    <w:p>
-      <w:pPr>
-        <w:pStyle w:val="BodyText"/>
-      </w:pPr>
+        <w:t xml:space="preserve"> He continues by saying endowments are passed to the Aghsán, after them the institution </w:t>
+      </w:r>
       <w:r>
         <w:lastRenderedPageBreak/>
-        <w:t>In BH08767, Baha’u’llah says all endowments revert to the Huquq’u’llah. Chapter 12.4 describes the various ways Baha’u’llah had utilized these endowments. This was reiterated by Baha’u’llah in BH00979.</w:t>
-      </w:r>
-    </w:p>
-    <w:p>
-      <w:pPr>
-        <w:pStyle w:val="BodyText"/>
-      </w:pPr>
-      <w:r>
-        <w:t>Baha’u’llah begins the Kitab-i-Ahd (The Book of My Covenant) with a sermon regarding wealth. The Kitab-i-Ahd, which is reflects His Will and Trust says He did not leave treasures. “There is hidden fear and concealed danger in wealth… The wealth of the world is untrustworthy.” Baha’u’llah adds specifically for the Aghsan that “God has not granted them any right to the property of others.” Outside of collecting Huquq’u’llah as an endowment for charity and the Cause of God, the Aghsan had to still earn a living. They have no right to collect any additional property from anyone. They are not the Cause of God.</w:t>
+        <w:t>of the House of Justice if it is established in the land. If not, endowments revert to the people of Baha. These endowments can only be used as specified in the Book. The specifications are for charitable purposes and in elevated places for the Cause.</w:t>
+      </w:r>
+    </w:p>
+    <w:p>
+      <w:pPr>
+        <w:pStyle w:val="BodyText"/>
+      </w:pPr>
+      <w:r>
+        <w:t>In BH08767, Bahá’u’lláh says all endowments revert to the Huqúqu’lláh. Chapter 12.4 describes the various ways Bahá’u’lláh had utilized these endowments. This was reiterated by Bahá’u’lláh in BH00979.</w:t>
+      </w:r>
+    </w:p>
+    <w:p>
+      <w:pPr>
+        <w:pStyle w:val="BodyText"/>
+      </w:pPr>
+      <w:r>
+        <w:t>Bahá’u’lláh begins the Kitáb-i-’Ahd (The Book of My Covenant) with a sermon regarding wealth. The Kitáb-i-’Ahd, which reflects His Will and Trust, says He did not leave treasures. “There is hidden fear and concealed danger in wealth… The wealth of the world is untrustworthy.” Bahá’u’lláh adds specifically for the Aghsán that “God has not granted them any right to the property of others.” Outside of collecting Huqúqu’lláh as an endowment for charity and the Cause of God, the Aghsán had to still earn a living. They have no right to collect any additional property from anyone. They are not the Cause of God.</w:t>
+      </w:r>
+    </w:p>
+    <w:p>
+      <w:pPr>
+        <w:pStyle w:val="BodyText"/>
+      </w:pPr>
+      <w:r>
+        <w:rPr>
+          <w:i/>
+          <w:iCs/>
+        </w:rPr>
+        <w:t>Reflection: If wealth can quietly distort spiritual purpose, what safeguards keep an endowment aligned with mercy rather than control?</w:t>
+      </w:r>
+    </w:p>
+    <w:p>
+      <w:pPr>
+        <w:pStyle w:val="BodyText"/>
+      </w:pPr>
+      <w:r>
+        <w:t>That safeguard matters because trusteeship rises or falls on how resources are handled.</w:t>
       </w:r>
     </w:p>
     <w:p>
       <w:pPr>
         <w:pStyle w:val="Heading2"/>
       </w:pPr>
-      <w:bookmarkStart w:id="427" w:name="aghsán-the-branches-of-bahaullah"/>
+      <w:bookmarkStart w:id="427" w:name="aghsán-the-branches-of-baháulláh"/>
       <w:bookmarkEnd w:id="426"/>
       <w:r>
-        <w:t>25.3 Aghsán (The Branches of Baha’u’llah)</w:t>
+        <w:t>25.3 Aghsán (The Branches of Bahá’u’lláh)</w:t>
       </w:r>
     </w:p>
     <w:p>
@@ -24942,40 +24985,43 @@
         <w:pStyle w:val="FirstParagraph"/>
       </w:pPr>
       <w:r>
-        <w:t>There are 2 collections of letters Baha’u’llah wrote which are unnamed. One is BH00023 which are letters to the Yazd community through Varqa, a well-respected follower in the time of Baha’u’llah. The other is BH00057, addressed to believers in Zanjan. Each has a portion which is entirely identical to each other, and both were written in 1881. They are explanations of certain parts of the Kitab-i-Aqdas, and will be referenced regularly in this chapter.</w:t>
-      </w:r>
-    </w:p>
-    <w:p>
-      <w:pPr>
-        <w:pStyle w:val="BodyText"/>
-      </w:pPr>
-      <w:r>
-        <w:t>With the revelation of the Kitab-i-Aqdas and thereafter, Baha’u’llah would refer to branches which were not Himself or a Manifestation of God. Baha’u’llah defines the Aghsan as “the present branches.” Among them are two Great Branches. After the present branches, souls are considered fruits and leaves. The branches are His sons. The Great Branches are the Ghusn-i-Azam (Abbas Effendi) which means Most Great Branch and then Ghusn-i-Akbar (Mirza Muhammad Ali) which means the Most Mighty Branch. Both are titles given by Baha’u’llah are relate to names of God. There were two other present branches, Ghusn-i-Anwar (Badi’u’llah) whose title means Luminous. There was also Diya’u’llah, who I am unable to locate a given Ghusn title. BH00017 (unnamed) does describe Diya as a Branch. Diya means Radiant. Another son, Ghusn-i-Athar (Mirza Mihdi) had passed away while in the prison in Akka in 1870. His title meant Pure.</w:t>
-      </w:r>
-    </w:p>
-    <w:p>
-      <w:pPr>
-        <w:pStyle w:val="BodyText"/>
-      </w:pPr>
-      <w:r>
-        <w:t>For every son, there was either a title or name which related to a name of God. In Chapter 1, we described many of the names of God as well as potential dangers if we remove a name of God from our belief. I consider the entire tree of God, the Sundrat-ul-Muntaha, would bear the most fruits if all the branches were allowed to manifest these names of God fully.</w:t>
-      </w:r>
-    </w:p>
-    <w:p>
-      <w:pPr>
-        <w:pStyle w:val="BodyText"/>
-      </w:pPr>
-      <w:r>
-        <w:t>In terms of endowments, after Baha’u’llah passed away, the Aghsán were responsible for endowments such as Huquq’u’llah. Baha’u’llah did not say one Branch, but all were responsible until the Houses of Justice are created. The Aghsán were to operate as a consultative body, where once again, consultation is guided by the Holy Spirit. They were to serve as trustees and examples of the future Houses of Justice. They were not to profit from these endowments. This did not happen. As one Branch tool sole responsibility of endowments, the Holy Spirit was not able to guide their use towards charity and the elevated places of God, such as Mashriq’ul-Adhkars, and the Sacred Houses in Shiraz and Baghdad.</w:t>
-      </w:r>
-    </w:p>
-    <w:p>
-      <w:pPr>
-        <w:pStyle w:val="BodyText"/>
-      </w:pPr>
+        <w:t>There are 2 collections of letters Bahá’u’lláh wrote which are unnamed. One is BH00023 which are letters to the Yazd community through Varqa, a well respected follower in the time of Bahá’u’lláh. The other is BH00057, addressed to believers in Zanjan. Each has a portion which is entirely identical to each other, and both were written in 1881. They include explanations of certain parts of the Kitáb-i-Aqdas, and will be referenced regularly in this chapter.</w:t>
+      </w:r>
+    </w:p>
+    <w:p>
+      <w:pPr>
+        <w:pStyle w:val="BodyText"/>
+      </w:pPr>
+      <w:r>
+        <w:t>With the revelation of the Kitáb-i-Aqdas and thereafter, Bahá’u’lláh would refer to branches which were not Himself or a Manifestation of God. Bahá’u’lláh defines the Aghsán as “the present branches.” Among them are two Great Branches. After the present branches, souls are considered fruits and leaves. The branches are His sons. The Great Branches are the Ghusn-i-A‘zam (’Abbás Effendi) which means Most Great Branch and then Ghusn-i-Akbar (Mírzá Muḥammad ’Alí) which means the Most Mighty Branch. Both are titles given by Bahá’u’lláh and relate to names of God. There were two other present branches, Ghusn-i-Anwar (Badí’u’lláh) whose title means Luminous. There was also Ḍíyá’u’lláh, who I am unable to locate a given Ghusn title. BH00017 (unnamed) does describe Ḍíyá as a Branch. Ḍíyá means Radiant. Another son, Ghusn-i-Athar (Mírzá Mihdí) had passed away while in the prison in Akka in 1870. His title meant Pure.</w:t>
+      </w:r>
+    </w:p>
+    <w:p>
+      <w:pPr>
+        <w:pStyle w:val="BodyText"/>
+      </w:pPr>
+      <w:r>
+        <w:t>For every son, there was either a title or name which related to a name of God. In Chapter 1, we described many of the names of God as well as potential dangers if we remove a name of God from our belief. I consider the entire tree of God, the Sundrat ul Muntahá, would bear the most fruits if all the branches were allowed to manifest these names of God fully.</w:t>
+      </w:r>
+    </w:p>
+    <w:p>
+      <w:pPr>
+        <w:pStyle w:val="BodyText"/>
+      </w:pPr>
+      <w:r>
+        <w:t xml:space="preserve">In terms of endowments, after Bahá’u’lláh passed away, the Aghsán were responsible for endowments such as Huqúqu’lláh. Bahá’u’lláh did not say one Branch, but all were responsible until the Houses of </w:t>
+      </w:r>
       <w:r>
         <w:lastRenderedPageBreak/>
-        <w:t>After Ghusn-i-Akbar (Mirza Muhammad Ali) passed away, the Aghsán were no longer responsible for endowments. Until there are Houses of Justice, such as in your city, these endowments are to be managed by the people of Baha. The people of Baha are not to profit from them.</w:t>
+        <w:t>Justice are created. The Aghsán were to operate as a consultative body, where once again, consultation is guided by the Holy Spirit. They were to serve as trustees and examples of the future Houses of Justice. They were not to profit from these endowments. This did not happen. As one Branch took sole responsibility of endowments, the Holy Spirit was not able to guide their use towards charity and the elevated places of God, such as Mashriq’ul Adhkárs, and the Sacred Houses in Shiraz and Baghdad.</w:t>
+      </w:r>
+    </w:p>
+    <w:p>
+      <w:pPr>
+        <w:pStyle w:val="BodyText"/>
+      </w:pPr>
+      <w:r>
+        <w:t>After Ghusn-i-Akbar (Mírzá Muḥammad ’Alí) passed away, the Aghsán were no longer responsible for endowments. Until there are Houses of Justice, such as in your city, these endowments are to be managed by the People of Bahá. The People of Bahá are not to profit from them.</w:t>
       </w:r>
     </w:p>
     <w:p>
@@ -24992,25 +25038,25 @@
         <w:pStyle w:val="FirstParagraph"/>
       </w:pPr>
       <w:r>
-        <w:t>After the Kitab-i-Aqdas was written and Baha’u’llah and His followers gained more freedoms in the Akka and Haifa areas, He would receive believers as pilgrims and letters from across Persia and the Ottoman Empire. In the context of receiving believers, their news, requests, and giving decisions, support, and guidance, Baha’u’llah would refer to His place as the Sacred Throne with the Sacred Court.</w:t>
-      </w:r>
-    </w:p>
-    <w:p>
-      <w:pPr>
-        <w:pStyle w:val="BodyText"/>
-      </w:pPr>
-      <w:r>
-        <w:t>The Aghsán served this Throne and Court. Abbas Effendi and Mirza Muhammad Ali during the entire period from 1873 - 1892. As Diya’u’llah and Badi’u’llah aged into maturity, they also served. The entire family was in support in various capacities. Unrelated followers, such as Mirza Aqa Jan, served as an amenuencis who recorded Baha’u’llah’s words in His pen. For each Aghsán, I will provide an example of their service and another example of the praise Baha’u’llah gave them.</w:t>
+        <w:t>After the Kitáb-i-Aqdas was written and Bahá’u’lláh and His followers gained more freedoms in the Akka and Haifa areas, He would receive believers as pilgrims and letters from across Persia and the Ottoman Empire. In the context of receiving believers, their news, requests, and giving decisions, support, and guidance, Bahá’u’lláh would refer to His place as the Sacred Throne with the Sacred Court.</w:t>
+      </w:r>
+    </w:p>
+    <w:p>
+      <w:pPr>
+        <w:pStyle w:val="BodyText"/>
+      </w:pPr>
+      <w:r>
+        <w:t>The Aghsán served this Throne and Court. ’Abbás Effendi and Mírzá Muḥammad ’Alí served on the Holy Court during the entire period from 1873 to 1892. As Ḍíyá’u’lláh and Badí’u’lláh aged into maturity, they also served. The entire family was in support in various capacities. Unrelated followers, such as Mírzá Áqá Ján, served as an amanuensis who recorded Bahá’u’lláh’s words in His pen. For each Aghsán, I will provide an example of their service and another example of the praise Bahá’u’lláh gave them.</w:t>
       </w:r>
     </w:p>
     <w:p>
       <w:pPr>
         <w:pStyle w:val="Heading3"/>
       </w:pPr>
-      <w:bookmarkStart w:id="429" w:name="in-honor-of-abbas-effendi"/>
+      <w:bookmarkStart w:id="429" w:name="in-honor-of-abbás-effendi"/>
       <w:bookmarkEnd w:id="428"/>
       <w:r>
-        <w:t>25.3.2 In Honor of Abbas Effendi</w:t>
+        <w:t>25.3.2 In Honor of ’Abbás Effendi</w:t>
       </w:r>
     </w:p>
     <w:p>
@@ -25026,7 +25072,7 @@
         <w:pStyle w:val="BlockText"/>
       </w:pPr>
       <w:r>
-        <w:t>“O My Name! Upon thee be My Glory! The Most Great Branch hath presented thy letter and mentioned it before the face of the Wronged One. We have answered thee with that which no treasuries of utterance can equal, and when it was sent down, the necks of the just bowed before it.”</w:t>
+        <w:t>“O My Name! Upon thee be My Glory! The Most Great Branch hath presented thy letter and mentioned it before the face of the Wronged One. We have answered thee with that which no treasuries of utterance can equal, and when it was sent down, the necks of the just bowed before it.”</w:t>
       </w:r>
       <w:r>
         <w:rPr>
@@ -25056,11 +25102,11 @@
         <w:pStyle w:val="BlockText"/>
       </w:pPr>
       <w:r>
-        <w:t xml:space="preserve">O My Most Great Branch! Before the Wronged One has appeared thy letter, and We have heard that which thou didst commune with God, the Lord of the worlds. We have made thee a protection for all the worlds, and a guardian for all who are in the heavens and on earth, and a fortress for those who have believed in God, the One, the All-Knowing. We beseech God to protect them through thee, to enrich them through thee, to nourish them through thee, and to inspire thee with that which will make thee the Dawning-Place of wealth for all created things, the Ocean of bounty for all in the world, and the Dayspring of grace unto all peoples. He, verily, is the All-Powerful, the All-Knowing, the All-Wise. We beseech Him to water through thee the earth and all that is therein, that there may grow from it the grass of wisdom and utterance, and the ears of knowledge and understanding. He, verily, is the Protector of </w:t>
+        <w:t xml:space="preserve">O My Most Great Branch! Before the Wronged One has appeared thy letter, and We have heard that which thou didst commune with God, the Lord of the worlds. We have made thee a protection for all the worlds, and a guardian for all who are in the heavens and on earth, and a fortress for those who have believed in God, the One, the All-Knowing. We beseech God to protect them through thee, to enrich them through thee, to nourish them through thee, and to inspire thee with that which will make thee the Dawning-Place of wealth for all created things, the Ocean of bounty for all in the world, and the Dayspring of grace unto all peoples. </w:t>
       </w:r>
       <w:r>
         <w:lastRenderedPageBreak/>
-        <w:t>whosoever turneth unto Him and the Helper of whosoever calleth upon Him. There is none other God but Him, the Mighty, the Praised One.”</w:t>
+        <w:t>He, verily, is the All-Powerful, the All-Knowing, the All-Wise. We beseech Him to water through thee the earth and all that is therein, that there may grow from it the grass of wisdom and utterance, and the ears of knowledge and understanding. He, verily, is the Protector of whosoever turneth unto Him and the Helper of whosoever calleth upon Him. There is none other God but Him, the Mighty, the Praised One.”</w:t>
       </w:r>
       <w:r>
         <w:rPr>
@@ -25073,10 +25119,10 @@
       <w:pPr>
         <w:pStyle w:val="Heading3"/>
       </w:pPr>
-      <w:bookmarkStart w:id="430" w:name="in-honor-of-mirza-muhammad-ali"/>
+      <w:bookmarkStart w:id="430" w:name="in-honor-of-mírzá-muḥammad-alí"/>
       <w:bookmarkEnd w:id="429"/>
       <w:r>
-        <w:t>25.3.3 In Honor of Mirza Muhammad Ali</w:t>
+        <w:t>25.3.3 In Honor of Mírzá Muḥammad ’Alí</w:t>
       </w:r>
     </w:p>
     <w:p>
@@ -25092,7 +25138,7 @@
         <w:pStyle w:val="BlockText"/>
       </w:pPr>
       <w:r>
-        <w:t>“O Jamalu’d-Din! Upon thee be the Glory of God, the True, the Manifest King. The letters which thou didst send were presented before the Most Holy Court by the Greater Branch. We beseech God to assist thee, to confirm thee, and to aid thee in that which will draw thee closer to Him in all conditions, and to exalt through thee His mention among His servants. In these days certain passages have been revealed under the name of “Traveler” - there would be no harm if they were sent to European lands.”</w:t>
+        <w:t>“O Jamalu’d-Din! Upon thee be the Glory of God, the True, the Manifest King. The letters which thou didst send were presented before the Most Holy Court by the Greater Branch. We beseech God to assist thee, to confirm thee, and to aid thee in that which will draw thee closer to Him in all conditions, and to exalt through thee His mention among His servants. In these days certain passages have been revealed under the name of “Traveler” there would be no harm if they were sent to European lands.”</w:t>
       </w:r>
       <w:r>
         <w:rPr>
@@ -25114,7 +25160,15 @@
         <w:pStyle w:val="BlockText"/>
       </w:pPr>
       <w:r>
-        <w:t>“Blessed is he who seeketh shelter beneath the shade of the Branch of God, his Lord and the Lord of the Throne and the Lord of all the worlds. O My Branch! Be thou as the spring cloud of My loving-kindness, then shower upon all things in My wondrous Name. O My Branch! We have chosen thee by virtue of Him Who is the Chosen One choosing thee. Say: Praise be unto Thee, O God of the worlds! O Greater Branch! We have chosen thee for the triumph of My Cause. Arise to achieve a wondrous triumph. Subdue the cities of names through My Name, the Sovereign over all that He willeth. O thou Ocean! Surge by My Name, the All-Compelling, the Most Great. Open thou the cities of hearts through My Name, the Best-Beloved, the Mighty, the Impregnable. Every deed hath been made dependent upon thy love. Blessed is he who hath attained unto that which his Lord, the All-Knowing, hath willed. Blessed is he who hath heard thy call and turned to thee out of love for God, the Lord of the worlds.”</w:t>
+        <w:t>“Blessed is he who seeketh shelter beneath the shade of the Branch of God, his Lord and the Lord of the Throne and the Lord of all the worlds. O My Branch! Be thou as the spring cloud of My loving-kindness, then shower upon all things in My wondrous Name. O My Branch! We have chosen thee by virtue of Him Who is the Chosen One choosing thee. Say: Praise be unto Thee, O God of the worlds!</w:t>
+      </w:r>
+    </w:p>
+    <w:p>
+      <w:pPr>
+        <w:pStyle w:val="BlockText"/>
+      </w:pPr>
+      <w:r>
+        <w:t>O Greater Branch! We have chosen thee for the triumph of My Cause. Arise to achieve a wondrous triumph. Subdue the cities of names through My Name, the Sovereign over all that He willeth. O thou Ocean! Surge by My Name, the All-Compelling, the Most Great. Open thou the cities of hearts through My Name, the Best-Beloved, the Mighty, the Impregnable. Every deed hath been made dependent upon thy love. Blessed is he who hath attained unto that which his Lord, the All-Knowing, hath willed. Blessed is he who hath heard thy call and turned to thee out of love for God, the Lord of the worlds.”</w:t>
       </w:r>
       <w:r>
         <w:rPr>
@@ -25127,10 +25181,10 @@
       <w:pPr>
         <w:pStyle w:val="Heading3"/>
       </w:pPr>
-      <w:bookmarkStart w:id="431" w:name="X3f4957e67c8aa14c4aff3dfe87d15ac01791ac0"/>
+      <w:bookmarkStart w:id="431" w:name="X2cc47e32ac164e957b77528e526c4c2f79e532d"/>
       <w:bookmarkEnd w:id="430"/>
       <w:r>
-        <w:t>25.3.4 In Honor of Diya’u’llah (Also known as Ziya’u’llah)</w:t>
+        <w:t>25.3.4 In Honor of Ḍíyá’u’lláh (Also known as Zíyá’u’lláh)</w:t>
       </w:r>
     </w:p>
     <w:p>
@@ -25146,7 +25200,11 @@
         <w:pStyle w:val="BlockText"/>
       </w:pPr>
       <w:r>
-        <w:t>“O people of Manshad! Upon you be the Glory of God, His grace, the mercy of God and His peace. Verily the Kingdom of Utterance hath turned toward you and made mention of you in such wise that all mention in the world hath bowed low at its revelation, that ye might rejoice and be numbered among the thankful. His honor Diya, one of My Branches, hath presented your letter and made mention of you before Our presence.”</w:t>
+        <w:t xml:space="preserve">“O people of Manshad! Upon you be the Glory of God, His grace, the mercy of God and His peace. Verily the Kingdom of Utterance hath turned toward you and made mention of you in </w:t>
+      </w:r>
+      <w:r>
+        <w:lastRenderedPageBreak/>
+        <w:t>such wise that all mention in the world hath bowed low at its revelation, that ye might rejoice and be numbered among the thankful. His honor Ḍíyá, one of My Branches, hath presented your letter and made mention of you before Our presence.”</w:t>
       </w:r>
       <w:r>
         <w:rPr>
@@ -25160,7 +25218,6 @@
         <w:pStyle w:val="FirstParagraph"/>
       </w:pPr>
       <w:r>
-        <w:lastRenderedPageBreak/>
         <w:t>In honor of his station:</w:t>
       </w:r>
     </w:p>
@@ -25169,7 +25226,7 @@
         <w:pStyle w:val="BlockText"/>
       </w:pPr>
       <w:r>
-        <w:t>“At this moment, one of the Branches of the Blessed Tree, His Holiness Diya, is present before Us. We have commanded him to pen this Tablet, from whose horizon’s heaven hath shone forth the light of God’s mercy, the Lord of the worlds.”</w:t>
+        <w:t>“At this moment, one of the Branches of the Blessed Tree, His Holiness Ḍíyá, is present before Us. We have commanded him to pen this Tablet, from whose horizon’s heaven hath shone forth the light of God’s mercy, the Lord of the worlds.”</w:t>
       </w:r>
       <w:r>
         <w:rPr>
@@ -25182,10 +25239,10 @@
       <w:pPr>
         <w:pStyle w:val="Heading3"/>
       </w:pPr>
-      <w:bookmarkStart w:id="432" w:name="in-honor-of-badiullah"/>
+      <w:bookmarkStart w:id="432" w:name="in-honor-of-badíulláh"/>
       <w:bookmarkEnd w:id="431"/>
       <w:r>
-        <w:t>25.3.5 In Honor of Badi’u’llah</w:t>
+        <w:t>25.3.5 In Honor of Badí’u’lláh</w:t>
       </w:r>
     </w:p>
     <w:p>
@@ -25209,7 +25266,7 @@
         <w:pStyle w:val="BlockText"/>
       </w:pPr>
       <w:r>
-        <w:t>In My Name, the Caller between earth and heaven! One of My Branches, who hath been named Badi’u’llah, hath presented thy letter before Our Face. We answer thee through this perspicuous Tablet.”</w:t>
+        <w:t>In My Name, the Caller between earth and heaven! One of My Branches, who hath been named Badí’u’lláh, hath presented thy letter before Our Face. We answer thee through this perspicuous Tablet.”</w:t>
       </w:r>
       <w:r>
         <w:rPr>
@@ -25231,13 +25288,33 @@
         <w:pStyle w:val="BlockText"/>
       </w:pPr>
       <w:r>
-        <w:t>“He is the Mighty. The fire of separation, after the comfort of the days of union and communion, has burned the soul and melted the heart. The heart is with you - ask it about the state of affairs. We hope through God’s grace that He will soon grant nearness and reunion. We long to see and yearn to speak with the Spirit of Life, Ziya’u’r-Rahman, that we may hear sweet words from those sugar-sweet lips in Samarkand. We remember Badi’u’llah with our tongue, seek him with our heart, and yearn for him with our soul. May my soul be sacrificed for thy nearness and thy words, O Badi’.”</w:t>
+        <w:t>“He is the Mighty. The fire of separation, after the comfort of the days of union and communion, has burned the soul and melted the heart. The heart is with you ask it about the state of affairs. We hope through God’s grace that He will soon grant nearness and reunion. We long to see and yearn to speak with the Spirit of Life, Ziya’u’r-Rahman, that we may hear sweet words from those sugar-sweet lips in Samarkand. We remember Badí’u’lláh with our tongue, seek him with our heart, and yearn for him with our soul. May my soul be sacrificed for thy nearness and thy words, O Badí’.”</w:t>
       </w:r>
       <w:r>
         <w:rPr>
           <w:rStyle w:val="FootnoteReference"/>
         </w:rPr>
         <w:footnoteReference w:id="558"/>
+      </w:r>
+    </w:p>
+    <w:p>
+      <w:pPr>
+        <w:pStyle w:val="FirstParagraph"/>
+      </w:pPr>
+      <w:r>
+        <w:rPr>
+          <w:i/>
+          <w:iCs/>
+        </w:rPr>
+        <w:t>Reflection: What kind of leadership becomes possible when service, consultation, and restraint are treated as the signs of spiritual station?</w:t>
+      </w:r>
+    </w:p>
+    <w:p>
+      <w:pPr>
+        <w:pStyle w:val="BodyText"/>
+      </w:pPr>
+      <w:r>
+        <w:t>This prepares us to see what the Book actually asks of those entrusted with guidance.</w:t>
       </w:r>
     </w:p>
     <w:p>
@@ -25248,6 +25325,7 @@
       <w:bookmarkEnd w:id="427"/>
       <w:bookmarkEnd w:id="432"/>
       <w:r>
+        <w:lastRenderedPageBreak/>
         <w:t>25.4 Answering Questions About the Book</w:t>
       </w:r>
     </w:p>
@@ -25256,7 +25334,7 @@
         <w:pStyle w:val="FirstParagraph"/>
       </w:pPr>
       <w:r>
-        <w:t>Baha’u’llah instructs us to “refer what you do not understand from the Book to the Branch that has branched forth from this mighty Root.”</w:t>
+        <w:t>Bahá’u’lláh instructs us to “refer what you do not understand from the Book to the Branch that has branched forth from this mighty Root.”</w:t>
       </w:r>
       <w:r>
         <w:rPr>
@@ -25265,43 +25343,39 @@
         <w:footnoteReference w:id="559"/>
       </w:r>
       <w:r>
-        <w:t xml:space="preserve"> He further explains this in the letters to Yazd and Zanjan. He says the Book refers to the Kitab-i-Aqdas and the Branch that has branched forth from this mighty Root refers to the Aghsán.</w:t>
-      </w:r>
-    </w:p>
-    <w:p>
-      <w:pPr>
-        <w:pStyle w:val="BodyText"/>
-      </w:pPr>
-      <w:r>
-        <w:t xml:space="preserve">This is an extremely specific responsibility for the Aghsán as a consultative body. As we have learned throughout this book, Baha’u’llah repeatedly nurtures this sense of self-discovery, these opportunities to immerse yourself within God’s consciousness on your own terms. This is your experience. This is your </w:t>
-      </w:r>
-      <w:r>
-        <w:lastRenderedPageBreak/>
-        <w:t>soul. This is your free-will. Liberation is your right, and liberation is the responsibility we have to ourselves and others. With this said, let’s look closely at this verse.</w:t>
-      </w:r>
-    </w:p>
-    <w:p>
-      <w:pPr>
-        <w:pStyle w:val="BodyText"/>
-      </w:pPr>
-      <w:r>
-        <w:t>Baha’u’llah starts the counsel with a conditional statement. “Refer what you do not understand.” Baha’u’llah invites us in paragraph #53 to refer what is revealed from Him. We have a responsibility to attempt understanding through the spiritual practices of recitation, reflection, and where possible, actions which embody these teachings. Sometimes understanding unfolds over time as we pass through the spiritual worlds. Sometimes we feel stuck on an idea. To refer what we do not understand does not absolve our responsibility to attempt understanding on our own. We refer only once we have tried.</w:t>
-      </w:r>
-    </w:p>
-    <w:p>
-      <w:pPr>
-        <w:pStyle w:val="BodyText"/>
-      </w:pPr>
-      <w:r>
-        <w:t>The second phrase says “from the Book.” This phrase purposefully narrows the scope even further. In BH00023 and BH00057, the Book is explicitly defined as the Kitab-i-Aqdas and the Kitab-i-Aqdas only. This means we refer only what we do not understand of the Kitab-i-Aqdas. This does not include any other book or writing.</w:t>
-      </w:r>
-    </w:p>
-    <w:p>
-      <w:pPr>
-        <w:pStyle w:val="BodyText"/>
-      </w:pPr>
-      <w:r>
-        <w:t>As it appears, the Aghsán were to consult together where any particular believer attempted to understand the Kitab-i-Aqdas but were unable to. The result of this consultation would be guided by the Holy Spirit. Baha’u’llah did not express any teaching the understanding of the Aghsan would replace other believer’s understandings. The consultation was for the individual who did not understand, completely within the context of what they asked and understood already. I envision the Aghsán’s role to be like that of scholars Baha’u’llah commanded us to turn to. While guided by the Holy Spirit, it may not encompass the entirety of the Most Great Ocean. This consultation would be incredibly valuable for the community.</w:t>
+        <w:t xml:space="preserve"> He further explains this in the letters to Yazd and Zanjan. He says the Book refers to the Kitáb-i-Aqdas and the Branch that has branched forth from this mighty Root refers to the Aghsán.</w:t>
+      </w:r>
+    </w:p>
+    <w:p>
+      <w:pPr>
+        <w:pStyle w:val="BodyText"/>
+      </w:pPr>
+      <w:r>
+        <w:t>This is an extremely specific responsibility for the Aghsán as a consultative body. As we have learned throughout this book, Bahá’u’lláh repeatedly nurtures this sense of self discovery, these opportunities to immerse yourself within God’s consciousness on your own terms. This is your experience. This is your soul. This is your free will. Liberation is your right, and liberation is the responsibility we have to ourselves and others. With this said, let’s look closely at this verse.</w:t>
+      </w:r>
+    </w:p>
+    <w:p>
+      <w:pPr>
+        <w:pStyle w:val="BodyText"/>
+      </w:pPr>
+      <w:r>
+        <w:t>Bahá’u’lláh starts the counsel with a conditional statement. “Refer what you do not understand.” Bahá’u’lláh invites us in paragraph #53 to refer what is revealed from Him. We have a responsibility to attempt understanding through the spiritual practices of recitation, reflection, and where possible, actions which embody these teachings. Sometimes understanding unfolds over time as we pass through the spiritual worlds. Sometimes we feel stuck on an idea. To refer what we do not understand does not absolve our responsibility to attempt understanding on our own. We refer only once we have tried.</w:t>
+      </w:r>
+    </w:p>
+    <w:p>
+      <w:pPr>
+        <w:pStyle w:val="BodyText"/>
+      </w:pPr>
+      <w:r>
+        <w:t>The second phrase says “from the Book.” This phrase purposefully narrows the scope even further. In BH00023 and BH00057, the Book is explicitly defined as the Kitáb-i-Aqdas and the Kitáb-i-Aqdas only. This means we refer only what we do not understand of the Kitáb-i-Aqdas. This does not include any other book or writing.</w:t>
+      </w:r>
+    </w:p>
+    <w:p>
+      <w:pPr>
+        <w:pStyle w:val="BodyText"/>
+      </w:pPr>
+      <w:r>
+        <w:t>As it appears, the Aghsán were to consult together where any particular believer attempted to understand the Kitáb-i-Aqdas but were unable to. The result of this consultation would be guided by the Holy Spirit. Bahá’u’lláh did not express any teaching the understanding of the Aghsán would replace other believers’ understandings. The consultation was for the individual who did not understand, completely within the context of what they asked and understood already. I envision the Aghsán’s role to be like that of scholars Bahá’u’lláh commanded us to turn to. While guided by the Holy Spirit, it may not encompass the entirety of the Most Great Ocean. This consultation would be incredibly valuable for the community.</w:t>
       </w:r>
     </w:p>
     <w:p>
@@ -25310,6 +25384,26 @@
       </w:pPr>
       <w:r>
         <w:t>Again, this did not happen.</w:t>
+      </w:r>
+    </w:p>
+    <w:p>
+      <w:pPr>
+        <w:pStyle w:val="BodyText"/>
+      </w:pPr>
+      <w:r>
+        <w:rPr>
+          <w:i/>
+          <w:iCs/>
+        </w:rPr>
+        <w:t>Reflection: When you struggle to understand a law, what would it look like to seek help without surrendering your own conscience and responsibility?</w:t>
+      </w:r>
+    </w:p>
+    <w:p>
+      <w:pPr>
+        <w:pStyle w:val="BodyText"/>
+      </w:pPr>
+      <w:r>
+        <w:t>That balance matters because a community can either mature through consultation or regress into dependence.</w:t>
       </w:r>
     </w:p>
     <w:p>
@@ -25319,6 +25413,7 @@
       <w:bookmarkStart w:id="434" w:name="the-branch-to-turn-towards"/>
       <w:bookmarkEnd w:id="433"/>
       <w:r>
+        <w:lastRenderedPageBreak/>
         <w:t>25.5 The Branch to Turn Towards</w:t>
       </w:r>
     </w:p>
@@ -25327,11 +25422,7 @@
         <w:pStyle w:val="FirstParagraph"/>
       </w:pPr>
       <w:r>
-        <w:t>The last part of the Kitab-i-Aqdas which describes spiritual successorship is from the paragraph 121.</w:t>
-      </w:r>
-      <w:r>
-        <w:br/>
-        <w:t>“When the sea of reunion is stilled, and the Book of Origin reaches its end, turn towards Him whom God has willed, the one who branched from this ancient Root.” The letters to Yazd and Zanjan also explain this. Baha’u’llah responds clearly to the inquiry:</w:t>
+        <w:t>The last part of the Kitáb-i-Aqdas which describes spiritual successorship is from paragraph 121. “When the sea of reunion is stilled, and the Book of Origin reaches its end, turn towards Him whom God has willed, the one who branched from this ancient Root.” The letters to Yazd and Zanjan also explain this. Bahá’u’lláh responds clearly to the inquiry:</w:t>
       </w:r>
     </w:p>
     <w:p>
@@ -25347,45 +25438,106 @@
         <w:pStyle w:val="FirstParagraph"/>
       </w:pPr>
       <w:r>
-        <w:t>Baha’u’llah bestows great honor upon Abbas Effendi and Mirza Muhammad Ali. Baha’u’llah used the phrase “turn towards.” I understand this as Abbas Effendi has a responsibility, but he is not given any particular rights. While holding a high station, Baha’u’llah’s leadership model does not change. Throughout the book, we describe how Baha’u’llah taught trusteeship in every level of society. Parents and monarchs and every level in between are to lead as trustees over that which they are entrusted to.</w:t>
-      </w:r>
-    </w:p>
-    <w:p>
-      <w:pPr>
-        <w:pStyle w:val="BodyText"/>
-      </w:pPr>
-      <w:r>
-        <w:t xml:space="preserve">The Aghsán still exist to manage endowments and to explain what is not understood from the Kitab-i-Aqdas. I understand Abbas Effendi’s role to be custodial, much as Mirza Yahya’s was to be. Baha’u’llah </w:t>
+        <w:t>Bahá’u’lláh bestows great honor upon ’Abbás Effendi and Mírzá Muḥammad ’Alí. Bahá’u’lláh used the phrase “turn towards.” I understand this as ’Abbás Effendi has a responsibility, but he is not given any particular rights. While holding a high station, Bahá’u’lláh’s leadership model does not change. Throughout the book, we describe how Bahá’u’lláh taught trusteeship in every level of society. Parents and monarchs and every level in between are to lead as trustees over that which they are entrusted to.</w:t>
+      </w:r>
+    </w:p>
+    <w:p>
+      <w:pPr>
+        <w:pStyle w:val="BodyText"/>
+      </w:pPr>
+      <w:r>
+        <w:t>The Aghsán still exist to manage endowments and to explain what is not understood from the Kitáb-i-Aqdas. I understand ’Abbás Effendi’s role to be custodial, much as Mírzá Yaḥyá’s was to be. Bahá’u’lláh from 1873 until His passing in 1892 strove to teach the Kitáb-i-Aqdas, show love towards His family and kinsmen (all believers), and nurture the liberation of souls in an environment which was quite oppressive.</w:t>
+      </w:r>
+    </w:p>
+    <w:p>
+      <w:pPr>
+        <w:pStyle w:val="BodyText"/>
+      </w:pPr>
+      <w:r>
+        <w:t>The Aghsán were meant to be the ultimate trustees, not the source. They were to protect the Kitáb-i-Aqdas (the Trust) and ensure the People of Baha (the Beneficiary of the Trust) had direct access to it. When a Trustee begins to act as the owner of the trust, the liberation of the soul is replaced by subjugation to the Trustee.</w:t>
+      </w:r>
+    </w:p>
+    <w:p>
+      <w:pPr>
+        <w:pStyle w:val="BodyText"/>
+      </w:pPr>
+      <w:r>
+        <w:t>None of the Branches had the authority to deprive any person of their rights, to deny anyone of their responsibilities, nor to change the law of Bahá’u’lláh. Again, this did not happen.</w:t>
+      </w:r>
+    </w:p>
+    <w:p>
+      <w:pPr>
+        <w:pStyle w:val="BodyText"/>
+      </w:pPr>
+      <w:r>
+        <w:rPr>
+          <w:i/>
+          <w:iCs/>
+        </w:rPr>
+        <w:t>Reflection: If “turning towards” can be read as responsibility without entitlement, what protections does that create for the soul?</w:t>
+      </w:r>
+    </w:p>
+    <w:p>
+      <w:pPr>
+        <w:pStyle w:val="BodyText"/>
+      </w:pPr>
+      <w:r>
+        <w:t>Those protections matter because spiritual successorship only works when the Book remains the standard.</w:t>
+      </w:r>
+    </w:p>
+    <w:p>
+      <w:pPr>
+        <w:pStyle w:val="Heading2"/>
+      </w:pPr>
+      <w:bookmarkStart w:id="435" w:name="the-kitáb-i-ahd-the-book-of-my-covenant"/>
+      <w:bookmarkEnd w:id="434"/>
+      <w:r>
+        <w:t>25.6 The Kitáb-i-’Ahd (The Book of My Covenant)</w:t>
+      </w:r>
+    </w:p>
+    <w:p>
+      <w:pPr>
+        <w:pStyle w:val="FirstParagraph"/>
+      </w:pPr>
+      <w:r>
+        <w:t>After Bahá’u’lláh passed away, this document was read and shared with the community. We shared the very first teaching within it regarding wealth. Bahá’u’lláh teaches the purpose of His revelation was “to extinguish the flames of malice and hatred, so that the horizons of the hearts of the people of the world may be illuminated with the light of unity and attain true tranquility.” He promises our human station is great. He reminds us to hold firm to the Divine Command.</w:t>
+      </w:r>
+    </w:p>
+    <w:p>
+      <w:pPr>
+        <w:pStyle w:val="BodyText"/>
+      </w:pPr>
+      <w:r>
+        <w:t xml:space="preserve">Bahá’u’lláh describes all religion to be for love and unity. Strife and contention are forbidden. He offers blessings for those who lead, especially those who believe in the Divine Command. His purpose is for the </w:t>
       </w:r>
       <w:r>
         <w:lastRenderedPageBreak/>
-        <w:t>from 1873 until His passing in 1892 strove to teach the Kitab-i-Aqdas, show love towards His family and kinsmen (all believers), and nurture the liberation of souls in an environment which was quite oppressive.</w:t>
-      </w:r>
-    </w:p>
-    <w:p>
-      <w:pPr>
-        <w:pStyle w:val="BodyText"/>
-      </w:pPr>
-      <w:r>
-        <w:t>The Aghsán were meant to be the ultimate trustees, not the source. They were to protect the Kitab-i-Aqdas (the Trust) and ensure the People of Baha (the Beneficiary of the Trust) had direct access to it. When a Trustee begins to act as the owner of the trust, the liberation of the soul is replaced by subjugation to the Trustee.</w:t>
-      </w:r>
-    </w:p>
-    <w:p>
-      <w:pPr>
-        <w:pStyle w:val="BodyText"/>
-      </w:pPr>
-      <w:r>
-        <w:t>None of the Branches had the authority to deprive any person of their rights, to deny anyone of their responsibilities, nor to change the law of Baha’u’llah. Again, this did not happen.</w:t>
-      </w:r>
-    </w:p>
-    <w:p>
-      <w:pPr>
-        <w:pStyle w:val="Heading2"/>
-      </w:pPr>
-      <w:bookmarkStart w:id="435" w:name="the-kitab-i-ahd-the-book-of-my-covenant"/>
-      <w:bookmarkEnd w:id="434"/>
-      <w:r>
-        <w:t>25.6 The Kitab-i-Ahd (The Book of My Covenant)</w:t>
+        <w:t>Kitáb-i-Aqdas to shine radiantly and rise in the horizon. He warns us not to make the Cause of God a tool for disorder and division. We are to say “All are from God.”</w:t>
+      </w:r>
+    </w:p>
+    <w:p>
+      <w:pPr>
+        <w:pStyle w:val="BodyText"/>
+      </w:pPr>
+      <w:r>
+        <w:t>Bahá’u’lláh reiterates His explanations from the letters to Zanjan and Yazd. He says “We have chosen the Most Mighty Branch after the Most Great Branch as a matter from the All Knowing, the All Aware.” He counsels love for the branches is incumbent upon everyone, without exceptions. He later says respect and regard for the branches are required, as well as for the entire family of Bahá’u’lláh, the Afnán (the Báb’s family). Finally, all are counseled to serve the nations and reform the world. I want to clearly state one thing about the family. In the letters which have been mostly been unavailable to the People of Baha, the Sacred Family is honored repeatedly for their service and devotion to the Cause of God. Their respect and love is well earned.</w:t>
+      </w:r>
+    </w:p>
+    <w:p>
+      <w:pPr>
+        <w:pStyle w:val="BodyText"/>
+      </w:pPr>
+      <w:r>
+        <w:t>Sadly, these things in the Kitáb-i-’Ahd did not happen.</w:t>
+      </w:r>
+    </w:p>
+    <w:p>
+      <w:pPr>
+        <w:pStyle w:val="Heading3"/>
+      </w:pPr>
+      <w:bookmarkStart w:id="436" w:name="the-testament-requires-trusteeship"/>
+      <w:r>
+        <w:t>25.6.1 The Testament Requires Trusteeship</w:t>
       </w:r>
     </w:p>
     <w:p>
@@ -25393,40 +25545,43 @@
         <w:pStyle w:val="FirstParagraph"/>
       </w:pPr>
       <w:r>
-        <w:t>After Baha’u’llah passed away, this document was read and shared with the community. We shared the very first teaching within it regarding wealth. Baha’u’llah teaches the purpose of His revelation was “to extinguish the flames of malice and hatred, so that the horizons of the hearts of the people of the world may be illuminated with the light of unity and attain true tranquility.” He promises our human station is great. He reminds us to hold firm to the Divine Command.</w:t>
-      </w:r>
-    </w:p>
-    <w:p>
-      <w:pPr>
-        <w:pStyle w:val="BodyText"/>
-      </w:pPr>
-      <w:r>
-        <w:t>Baha’ullah describes all religion to be for love and unity. Strife and contention are forbidden. He offers blessings for those who lead, especially those who believe in the Divine Command. He purpose is for the Kitab-i-Aqdas to shine radiantly and rise in the horizon. He warns us not to make the Cause of God a tool for disorder and division. We are to say “All are from God.”</w:t>
-      </w:r>
-    </w:p>
-    <w:p>
-      <w:pPr>
-        <w:pStyle w:val="BodyText"/>
-      </w:pPr>
-      <w:r>
-        <w:t>Baha’u’llah reiterates His explanations from the letters to Zanjan and Yazd. He says “We have chosen the Most Mighty Branch after the Most Great Branch as a matter from the All-Knowing, the All-Aware.” He counsels love for the branches is incumbent upon everyone, without exceptions. He later says respect and regard for the branches are required, as well as for the entire family of Baha’u’llah, the Afnán (the Bab’s family). Finally, all are counseled to serve the nations and reform the world. I want to clearly state one thing about the family. In the letters which have been mostly been unavailable to the People of Baha, the Sacred Family is honored repeatedly for their service and devotion to the Cause of God. Their respect and love is well-earned.</w:t>
-      </w:r>
-    </w:p>
-    <w:p>
-      <w:pPr>
-        <w:pStyle w:val="BodyText"/>
-      </w:pPr>
-      <w:r>
-        <w:t>Sadly, these things in the Kitab-i-Ahd did not happen.</w:t>
-      </w:r>
-    </w:p>
-    <w:p>
-      <w:pPr>
-        <w:pStyle w:val="Heading3"/>
-      </w:pPr>
-      <w:bookmarkStart w:id="436" w:name="the-testament-requires-trusteeship"/>
-      <w:r>
-        <w:t>25.6.1 The Testament Requires Trusteeship</w:t>
+        <w:t>The Kitáb-i-’Ahd and BH11278 were both testaments from Bahá’u’lláh. ’Abbás Effendi was entrusted to execute the final testament of Bahá’u’lláh. He was to witness, to be a trustee, and to help. Nothing more and nothing less. It was an incredible honor and reflection of the high hopes Bahá’u’lláh had for his eldest son. It was also a difficult position to be in. I will not explain further, but I can only say Bahá’u’lláh’s final testament was not fulfilled. God’s All-Knowing nature, while aware of all the probabilities any outcome could have, knew there was a chance of success and a chance of failure. I feel the greatest failure stemmed from self exaltation and the proceeding inability to consult. When one Branch took sole authority, the subtle design, it broke the equation of Oneness. Consultation, guided by the Holy Spirit, requires the process designed by God through Bahá’u’lláh. By reducing consultation to a single person’s decree, the Holy Spirit could no longer be active.</w:t>
+      </w:r>
+    </w:p>
+    <w:p>
+      <w:pPr>
+        <w:pStyle w:val="BodyText"/>
+      </w:pPr>
+      <w:r>
+        <w:t>The People of Baha were denied the active force of the Holy Spirit.</w:t>
+      </w:r>
+    </w:p>
+    <w:p>
+      <w:pPr>
+        <w:pStyle w:val="BodyText"/>
+      </w:pPr>
+      <w:r>
+        <w:t>I want to close this section on the Aghsán with an excerpt from the Tablet of Khalil, written sometime when Bahá’u’lláh was in Edirne. When asked about His sons (who are not called Branches yet), He says:</w:t>
+      </w:r>
+    </w:p>
+    <w:p>
+      <w:pPr>
+        <w:pStyle w:val="BlockText"/>
+      </w:pPr>
+      <w:r>
+        <w:t xml:space="preserve">As for what you asked about my son, know that if my sons follow God’s laws and do not exceed what has been specified in God’s book, the prevailing, the Ever Existing, and they command themselves and the servants to do good, and they forbid evil, and they testify to what God has testified in His decisive verses, the conclusive, the definitive, and they believe in whoever God reveals on the day in which the times of the former and the latter are counted, and on it, everyone presents themselves to their Lord, and they will not disagree on God’s command and will not stray from His ordained, written law. Then know that they are leaves of the tree of monotheism and its fruits, and with them, the clouds rain and the clouds lift with grace if you truly believe. They are God’s household among you and His family in your midst, and His mercy upon the worlds if you know. From them, the breeze of God blows on you, and the winds of dignity and love pass over those close. They are God’s pen, His command, and His word among His creatures, and with them, He takes and gives if you understand. Through </w:t>
+      </w:r>
+      <w:r>
+        <w:lastRenderedPageBreak/>
+        <w:t>them, the earth has shone with the light of your Lord, and the signs of His grace have appeared to those who do not deny God’s signs. However, those who hurt them have hurt me, and those who hurt me have deviated from God’s path, the prevailing, the Ever Existing. So, you will find the deviation of the deviators and their arrogance towards us and their transgression against ourselves without clear evidence or a preserved book.</w:t>
+      </w:r>
+    </w:p>
+    <w:p>
+      <w:pPr>
+        <w:pStyle w:val="BlockText"/>
+      </w:pPr>
+      <w:r>
+        <w:t>Say, O people, they are God’s signs among you, beware of arguing with them, or killing them, or be among those who oppress and do not realize. They are God’s secret on earth and returned under the hands of the oppressors on this earth that fell behind the elevated mountains. All of that was returned to them at the time when they were young in the kingdom, and they had no sin but in the path of God, the Capable, the Powerful, the Mighty, the Beloved, and those from them who appear naturally and God runs from their tongues signs of His power, and he is among those God has chosen for His command. There is no god but He, to Him belongs creation and command, and we are all commanded by His command. We ask God to make them successful in obeying Him and to provide them with what pleases their hearts and the hearts of those who inherit Paradise from God, the Mighty, the Prevailing, the Ever Existing.</w:t>
       </w:r>
     </w:p>
     <w:p>
@@ -25434,51 +25589,27 @@
         <w:pStyle w:val="FirstParagraph"/>
       </w:pPr>
       <w:r>
-        <w:t xml:space="preserve">The Kitab-i-Ahd and BH11278 were both testaments from Baha’u’llah. Abbas Effendi was entrusted to execute the final testament of Baha’u’llah. He was to witness, to be a trustee, and to help. Nothing more and nothing less. It was an incredible honor and reflection of the high hopes Baha’u’llah had for his eldest son. It was also a difficult position to be in. I will not explain further, but I can only say Baha’u’llah’s final testament was not fulfilled. God’s All-Knowing nature, while aware of all the probabilities any outcome could have, knew there was a chance of success and a chance of failure. I feel the greatest failure stemmed from self-exaltation and the proceeding inability to consult. When one Branch took sole authority, the subtle design, it broke the equation of Oneness. Consultation, guided by the Holy Spirit, </w:t>
-      </w:r>
-      <w:r>
-        <w:lastRenderedPageBreak/>
-        <w:t>requires the process designed by God through Baha’u’llah. By reducing consultation to a single person’s decree, the Holy Spirit could no longer be active.</w:t>
-      </w:r>
-    </w:p>
-    <w:p>
-      <w:pPr>
-        <w:pStyle w:val="BodyText"/>
-      </w:pPr>
-      <w:r>
-        <w:t>The People of Baha were denied the active force of the Holy Spirit.</w:t>
-      </w:r>
-    </w:p>
-    <w:p>
-      <w:pPr>
-        <w:pStyle w:val="BodyText"/>
-      </w:pPr>
-      <w:r>
-        <w:t>I want to close this section on the Aghsan with an excerpt from the Tablet of Khalil, written sometime when Baha’u’llah was in Edirne. When asked about His sons (who are not called Branches yet), He says:</w:t>
-      </w:r>
-    </w:p>
-    <w:p>
-      <w:pPr>
-        <w:pStyle w:val="BlockText"/>
-      </w:pPr>
-      <w:r>
-        <w:t>As for what you asked about my son, know that if my sons follow God’s laws and do not exceed what has been specified in God’s book, the prevailing, the Ever-Existing, and they command themselves and the servants to do good, and they forbid evil, and they testify to what God has testified in His decisive verses, the conclusive, the definitive, and they believe in whoever God reveals on the day in which the times of the former and the latter are counted, and on it, everyone presents themselves to their Lord, and they will not disagree on God’s command and will not stray from His ordained, written law. Then know that they are leaves of the tree of monotheism and its fruits, and with them, the clouds rain and the clouds lift with grace if you truly believe. They are God’s household among you and His family in your midst, and His mercy upon the worlds if you know. From them, the breeze of God blows on you, and the winds of dignity and love pass over those close. They are God’s pen, His command, and His word among His creatures, and with them, He takes and gives if you understand. Through them, the earth has shone with the light of your Lord, and the signs of His grace have appeared to those who do not deny God’s signs. However, those who hurt them have hurt me, and those who hurt me have deviated from God’s path, the prevailing, the Ever-Existing. So, you will find the deviation of the deviators and their arrogance towards us and their transgression against ourselves without clear evidence or a preserved book.</w:t>
-      </w:r>
-    </w:p>
-    <w:p>
-      <w:pPr>
-        <w:pStyle w:val="BlockText"/>
-      </w:pPr>
-      <w:r>
-        <w:t>Say, O people, they are God’s signs among you, beware of arguing with them, or killing them, or be among those who oppress and do not realize. They are God’s secret on earth and returned under the hands of the oppressors on this earth that fell behind the elevated mountains. All of that was returned to them at the time when they were young in the kingdom, and they had no sin but in the path of God, the Capable, the Powerful, the Mighty, the Beloved, and those from them who appear naturally and God runs from their tongues signs of His power, and he is among those God has chosen for His command. There is no god but He, to Him belongs creation and command, and we are all commanded by His command. We ask God to make them successful in obeying Him and to provide them with what pleases their hearts and the hearts of those who inherit Paradise from God, the Mighty, the Prevailing, the Ever-Existing.</w:t>
-      </w:r>
-    </w:p>
-    <w:p>
-      <w:pPr>
-        <w:pStyle w:val="FirstParagraph"/>
-      </w:pPr>
-      <w:r>
-        <w:t>It seems the sons were our greatest test. The failure of the Branches to consult was not just a family tragedy; it was a disruption of the ‘Subtle Order.’ Yet, as Baha’u’llah says, the Remnant of God is the Manifestation of Light. The Light (The Book) remains, even if the secondary mirrors (the branches) did not remain aligned. The hurting of the sons was an attempt to hurt the Cause of God. While the sons were our greatest test, there is a path forward.</w:t>
+        <w:t>It seems the sons were our greatest test. The failure of the Branches to consult was not just a family tragedy. It was a disruption of the Subtle Order. Yet, as Bahá’u’lláh says, the Remnant of God is the Manifestation of Light. The Light (the Book) remains, even if the secondary mirrors (the Branches) did not remain aligned. The hurting of the sons was an attempt to hurt the Cause of God. While the sons were our greatest test, there is a path forward.</w:t>
+      </w:r>
+    </w:p>
+    <w:p>
+      <w:pPr>
+        <w:pStyle w:val="BodyText"/>
+      </w:pPr>
+      <w:r>
+        <w:rPr>
+          <w:i/>
+          <w:iCs/>
+        </w:rPr>
+        <w:t>Reflection: If trusteeship is the moral heart of a testament, what happens to a community when trusteeship becomes personal rule?</w:t>
+      </w:r>
+    </w:p>
+    <w:p>
+      <w:pPr>
+        <w:pStyle w:val="BodyText"/>
+      </w:pPr>
+      <w:r>
+        <w:t>Seeing that consequence clearly is what makes the next steps feel urgent rather than abstract.</w:t>
       </w:r>
     </w:p>
     <w:p>
@@ -25489,40 +25620,43 @@
       <w:bookmarkEnd w:id="435"/>
       <w:bookmarkEnd w:id="436"/>
       <w:r>
+        <w:t>25.7 The Path Forward</w:t>
+      </w:r>
+    </w:p>
+    <w:p>
+      <w:pPr>
+        <w:pStyle w:val="FirstParagraph"/>
+      </w:pPr>
+      <w:r>
+        <w:t>While the Aghsán were unable to fulfill their purpose, we still have a path to move on. Bahá’u’lláh taught after the Aghsán, if the Houses of Justice are not yet established, the People of Baha are the spiritual successors. As you read this, you might be a Person of Baha. I invite you to this path forward, because liberation is not only promised. It is practiced.</w:t>
+      </w:r>
+    </w:p>
+    <w:p>
+      <w:pPr>
+        <w:pStyle w:val="BodyText"/>
+      </w:pPr>
+      <w:r>
+        <w:t>There are many roles we may take on as trustees. We can serve as scholars, we can organize remembrance services and the melodious recitation of the verses of God, we can promote our Holy Days and festivals, and we can nurture each other’s path. We can manage endowments for the needy, and strive for the elevated places of the Cause. The possibilities are endless as long as you believe. In this sense, the work of achieving true liberation is not postponed to a future age. It is built through local responsibility and faithful action.</w:t>
+      </w:r>
+    </w:p>
+    <w:p>
+      <w:pPr>
+        <w:pStyle w:val="BodyText"/>
+      </w:pPr>
+      <w:r>
+        <w:t xml:space="preserve">I believe this all starts with honoring not only the Kitáb-i-Aqdas, but also Bahá’u’lláh’s Testaments. If you hold any malice towards any of Bahá’u’lláh’s family, let it go. It is in the past. Pray for their spiritual well </w:t>
+      </w:r>
+      <w:r>
         <w:lastRenderedPageBreak/>
-        <w:t>25.7 The Path Forward</w:t>
-      </w:r>
-    </w:p>
-    <w:p>
-      <w:pPr>
-        <w:pStyle w:val="FirstParagraph"/>
-      </w:pPr>
-      <w:r>
-        <w:t>While the Aghsán were unable to fulfill their purpose, we still have a path to move on. Baha’u’llah taught after the Aghsán, if the Houses of Justice are not yet established, the People of Baha are the spiritual successors. As you read this, you might be a Person of Baha. I invite you to this path forward.</w:t>
-      </w:r>
-    </w:p>
-    <w:p>
-      <w:pPr>
-        <w:pStyle w:val="BodyText"/>
-      </w:pPr>
-      <w:r>
-        <w:t>There are many roles we may take on as trustees. We can serve as scholars, we can organize remembrance services and the melodious recitation of the verses of God, we can promote our Holy Days and festivals, and we can nurture each other’s path. We can manage endowments for the needy, and strive for the elevated places of the Cause. The possibilities are endless as long as you believe.</w:t>
-      </w:r>
-    </w:p>
-    <w:p>
-      <w:pPr>
-        <w:pStyle w:val="BodyText"/>
-      </w:pPr>
-      <w:r>
-        <w:t>I believe this all starts with honoring not only the Kitab-i-Aqdas, but also Baha’u’llah’s Testaments. If you hold any malice towards any of Baha’u’llah’s family, let it go. It is in the past. Pray for their spiritual well-being and union with God. If you hold onto any notions of infallibility, let it go. Infallibility is reserved for the next Manifestation of God which will exist no earlier than 1,000 years after Baha’u’llah, and no later than the Bab’s concept of Mustagith (about 1,500 years). Today is today and tomorrow is tomorrow.</w:t>
-      </w:r>
-    </w:p>
-    <w:p>
-      <w:pPr>
-        <w:pStyle w:val="BodyText"/>
-      </w:pPr>
-      <w:r>
-        <w:t>The next chapter will focus in on Trusteeship Governance, where we put the various concepts of Part 4 together. This is a path we can all walk on together in the name of Baha, and in honor of His ministry.</w:t>
+        <w:t>being and union with God. If you hold onto any notions of infallibility, let it go. Infallibility is reserved for the next Manifestation of God which will exist no earlier than 1,000 years after Bahá’u’lláh, and no later than the Báb’s concept of Mustagith (about 1,500 years). Today is today and tomorrow is tomorrow.</w:t>
+      </w:r>
+    </w:p>
+    <w:p>
+      <w:pPr>
+        <w:pStyle w:val="BodyText"/>
+      </w:pPr>
+      <w:r>
+        <w:t>To close, spiritual successorship is not only a story about what failed. It is a call to restore trusteeship as a living ethic, so that authority serves the Book and the people, rather than people serving authority. The next chapter will focus in on Trusteeship Governance, where we put the various concepts of Part 4 together. This is a path we can all walk on together in the name of Baha, and in honor of His ministry.</w:t>
       </w:r>
     </w:p>
     <w:p>
@@ -25535,7 +25669,7 @@
         <w:pStyle w:val="Heading1"/>
       </w:pPr>
       <w:bookmarkStart w:id="438" w:name="peace"/>
-      <w:bookmarkStart w:id="439" w:name="_Toc223295715"/>
+      <w:bookmarkStart w:id="439" w:name="_Toc223511225"/>
       <w:bookmarkEnd w:id="423"/>
       <w:bookmarkEnd w:id="437"/>
       <w:r>
@@ -25549,23 +25683,23 @@
         <w:pStyle w:val="FirstParagraph"/>
       </w:pPr>
       <w:r>
-        <w:t>Up to this point we have covered a wide variety of topics, all focused on believing God desires us to be liberated. The foundation of this belief circles back to the very beginning of this book. The Names of God. The Purpose of God. Why would God have created us out of love without a design born from that love? Peace is not established from miracles which defy the mathematical order God designed withing everything. Peace is not established from brute force and sheer acts of omnipotent and omnipresent power. God is Most Subtle. Peace is the design of everything. When we look inward, there is One. When we look outwards, there is One. Every multiplicity is from One and returns to One. Every Vahid leads to One. Every birth and death leads to One. Ever first and every last adds up to One. Peace is the end result of living within this reality, which is the foundational reality of all things.</w:t>
-      </w:r>
-    </w:p>
-    <w:p>
-      <w:pPr>
-        <w:pStyle w:val="BodyText"/>
-      </w:pPr>
-      <w:r>
-        <w:t>You might be sitting in a cozy chair, leaning back in a comfortable bed, or maybe taking a break from a busy day at work as you read this. What impact does a single soul such as yourself have in a world of institutions and wealth larger than one can imagine? A mirror free of dust, polished in all of its potential radiance, pointed at the divine Sun can effect the world in profound ways. The Kitab-i-Aqdas, when followed to the best of your ability, is the blueprint for the spiritual transformation of the individual, as well as every level of society. All of these levels are made of individuals just like you.</w:t>
-      </w:r>
-    </w:p>
-    <w:p>
-      <w:pPr>
-        <w:pStyle w:val="BodyText"/>
-      </w:pPr>
-      <w:r>
-        <w:t>The Houses of Justice is made of people just like you. Political leaders of governments throughout the world are people just like you. Spiritual leaders of all faith traditions are people just like you. Now imagine if all three of these layers were made of people who believed we were meant to be One? Instead of the corruptions of purity and oneness through oppressive man-made mechanisms, we are agents of the reordering of the world. We live Oneness together. This is achieving true liberation.</w:t>
+        <w:t>Up to this point we have covered a wide variety of topics, all focused on believing God desires us to be liberated. The foundation of this belief circles back to the very beginning of this book. The Names of God. The Purpose of God. Why would God have created us out of love without a design born from that love? Peace is not established from miracles which defy the mathematical order God designed within everything. Peace is not established from brute force and sheer acts of omnipotent and omnipresent power. God is Most Subtle. Peace is the design of everything. When we look inward, there is One. When we look outwards, there is One. Every multiplicity is from One and returns to One. Every Vahid leads to One. Every birth and death leads to One. Every first and every last adds up to One. Peace is the end result of living within this reality, which is the foundational reality of all things.</w:t>
+      </w:r>
+    </w:p>
+    <w:p>
+      <w:pPr>
+        <w:pStyle w:val="BodyText"/>
+      </w:pPr>
+      <w:r>
+        <w:t>You might be sitting in a cozy chair, leaning back in a comfortable bed, or maybe taking a break from a busy day at work as you read this. What impact does a single soul such as yourself have in a world of institutions and wealth larger than one can imagine? A mirror free of dust, polished in all of its potential radiance, pointed at the divine Sun can affect the world in profound ways. The Kitáb-i-Aqdas, when followed to the best of your ability, is the blueprint for the spiritual transformation of the individual, as well as every level of society. All of these levels are made of individuals just like you.</w:t>
+      </w:r>
+    </w:p>
+    <w:p>
+      <w:pPr>
+        <w:pStyle w:val="BodyText"/>
+      </w:pPr>
+      <w:r>
+        <w:t>The Houses of Justice are made of people just like you. Political leaders of governments throughout the world are people just like you. Spiritual leaders of all faith traditions are people just like you. Now imagine if all three of these layers were made of people who believed we were meant to be One. Instead of the corruptions of purity and oneness through oppressive man made mechanisms, we are agents of the reordering of the world. We live Oneness together. This is achieving true liberation.</w:t>
       </w:r>
     </w:p>
     <w:p>
@@ -25582,7 +25716,7 @@
         <w:pStyle w:val="FirstParagraph"/>
       </w:pPr>
       <w:r>
-        <w:t>In Chapter 22, we describe the world-wide House of Justice’s role in establishing the Most Great Peace, as described in the Ninth Leaf of Paradise in the Words of Paradise. The Most Great Peace is the unification of the world’s affairs towards a common goal or the unification of the world’s religions as one. Holy war is strictly prohibited, even if another religion or religious institution prescribes it.</w:t>
+        <w:t>In Chapter 22, we describe the worldwide House of Justice’s role in establishing the Most Great Peace, as described in the Ninth Leaf of Paradise in the Words of Paradise. The Most Great Peace is the unification of the world’s affairs towards a common goal or the unification of the world’s religions as one. Holy war is strictly prohibited, even if another religion or religious institution prescribes it.</w:t>
       </w:r>
       <w:r>
         <w:rPr>
@@ -25591,7 +25725,7 @@
         <w:footnoteReference w:id="560"/>
       </w:r>
       <w:r>
-        <w:t xml:space="preserve"> This is not a top-down enforcement of belief, but the final maturation of the Stage 1 Propogation authority granted to the House by a unified humanity.</w:t>
+        <w:t xml:space="preserve"> This is not a top down enforcement of belief, but the final maturation of the Stage 1 Propagation authority granted to the House by a unified humanity.</w:t>
       </w:r>
     </w:p>
     <w:p>
@@ -25608,7 +25742,7 @@
         <w:pStyle w:val="FirstParagraph"/>
       </w:pPr>
       <w:r>
-        <w:t xml:space="preserve">Baha’u’llah’s Epistle to the Son of the Wolf is a great review of many overarching themes Baha’u’llah had taught throughout His ministry. One of these themes is the Lesser Peace, which He describes as the greatest cause of the preservation of the world. It is not the only cause for the preservation of the world, but I do read this as there is risk the world may not be preserved if the Lesser Peace is not pursued. </w:t>
+        <w:t xml:space="preserve">Bahá’u’lláh’s Epistle to the Son of the Wolf is a great review of many overarching themes Bahá’u’lláh had taught throughout His ministry. One of these themes is the Lesser Peace, which He describes as the greatest cause of the preservation of the world. It is not the only cause for the preservation of the world, but I do read this as there is risk the world may not be preserved if the Lesser Peace is not pursued. </w:t>
       </w:r>
       <w:r>
         <w:lastRenderedPageBreak/>
@@ -25620,7 +25754,7 @@
         <w:pStyle w:val="BodyText"/>
       </w:pPr>
       <w:r>
-        <w:t>The first responsibility to establish the Lesser Peace are the kings of the world, who are the dawning places of wealth and power. Baha’u’llah describes they should establish an assembly where they or the ministers who act on their behalf, to create a decree of unity between nations. They should also agree to limiting weapons to only that which is necessary for the defense of their nations. Baha’u’llah says if any sovereign leader rises against another, a declaration of war, all the other nations should prevent this offense. This collective security acts as the a Global Trustee for the safety of the vulnerable, ensuring the Minor Trust described in earlier chapters is protected even at the level of nations. Instead of weapons, resources will be used for the reformation of the world.</w:t>
+        <w:t>The first responsibility to establish the Lesser Peace is for the kings of the world, who are the dawning places of wealth and power. Bahá’u’lláh describes they should establish an assembly where they or the ministers who act on their behalf, create a decree of unity between nations. They should also agree to limiting weapons to only that which is necessary for the defense of their nations. Bahá’u’lláh says if any sovereign leader rises against another, with a declaration of war, all the other nations should prevent this offense. This collective security acts as a Global Trustee for the safety of the vulnerable, ensuring the Minor Trust described in earlier chapters is protected even at the level of nations. Instead of weapons, resources will be used for the reformation of the world.</w:t>
       </w:r>
     </w:p>
     <w:p>
@@ -25654,7 +25788,7 @@
         <w:pStyle w:val="BodyText"/>
       </w:pPr>
       <w:r>
-        <w:t>This concept is affirmed in the Kitab-i-Ahd’s final paragraph, where Baha’u’llah states His Will and Testament. Those who lived when Baha’u’llah lived would hear his final Words being read, where He says:</w:t>
+        <w:t>This concept is affirmed in the Kitáb-i-’Ahd’s final paragraph, where Bahá’u’lláh states His Will and Testament. Those who lived when Bahá’u’lláh lived would hear His final Words being read, where He says:</w:t>
       </w:r>
     </w:p>
     <w:p>
@@ -25670,7 +25804,27 @@
         <w:pStyle w:val="FirstParagraph"/>
       </w:pPr>
       <w:r>
-        <w:t>Every single member of humankind is to be a trustee, if they are capable. To have liberation, we need to be responsible for another’s liberation. This does not happen automatically. This book has established all of the foundations for us to achieve the Lesser or the Most Great Peace. Let’s put everything we have learned together and see what we can do to achieve God’s vision through Baha’u’llah.</w:t>
+        <w:t>Every single member of humankind is to be a trustee, if they are capable. To have liberation, we need to be responsible for another’s liberation. This does not happen automatically. This book has established all of the foundations for us to achieve the Lesser or the Most Great Peace. Let’s put everything we have learned together and see what we can do to achieve God’s vision through Bahá’u’lláh.</w:t>
+      </w:r>
+    </w:p>
+    <w:p>
+      <w:pPr>
+        <w:pStyle w:val="BodyText"/>
+      </w:pPr>
+      <w:r>
+        <w:rPr>
+          <w:i/>
+          <w:iCs/>
+        </w:rPr>
+        <w:t>Reflection: Where in your own life have you seen that peace requires design, not force, and what would it mean to trust that design?</w:t>
+      </w:r>
+    </w:p>
+    <w:p>
+      <w:pPr>
+        <w:pStyle w:val="BodyText"/>
+      </w:pPr>
+      <w:r>
+        <w:t>Now we move from spiritual principle into social structure, because peace has a form as well as a spirit.</w:t>
       </w:r>
     </w:p>
     <w:p>
@@ -25689,35 +25843,55 @@
         <w:pStyle w:val="FirstParagraph"/>
       </w:pPr>
       <w:r>
-        <w:t>The Lesser Peace is conditioned upon a world assembly. An assembly is any group of people who have chosen to meet for a common purpose. In everyday life, assemblies can be related to legislative, religious, educational, and social purposes. A world assembly would not be a world government. Nations do not lose their sovereignty.</w:t>
-      </w:r>
-    </w:p>
-    <w:p>
-      <w:pPr>
-        <w:pStyle w:val="BodyText"/>
-      </w:pPr>
-      <w:r>
-        <w:t xml:space="preserve">There is no prerequisite required to convene a Lesser Peace assembly. This means this is not limited to the type of government a nation has. The participating governments can be decentralized or centralized </w:t>
+        <w:t xml:space="preserve">The Lesser Peace is conditioned upon a world assembly. An assembly is any group of people who have chosen to meet for a common purpose. In everyday life, assemblies can be related to legislative, religious, </w:t>
       </w:r>
       <w:r>
         <w:lastRenderedPageBreak/>
-        <w:t>power structures, capitalist or socialist economies, single-party or multi-party, and led by civilians or the military. Baha’u’llah did not describe any qualifications other than the attendees are sovereign leaders or the ministers acting on their behalf.</w:t>
-      </w:r>
-    </w:p>
-    <w:p>
-      <w:pPr>
-        <w:pStyle w:val="BodyText"/>
-      </w:pPr>
-      <w:r>
-        <w:t>The assembly is not the United Nations. The United Nations is a commendable attempt at creating a more peaceful world, but it was designed with 5 nations have veto power on any security actions. Two of these nations have attacked other nations preemptively in the last 20 years without any consequences by member nations of the UN. Another has several disputed borders, and has recently claimed marine territory other nations had controlled. The Lesser Peace assembly is only for nations to agree to no longer attack each other. Once again, there are no exceptions. The Lesser Peace assembly is for nations to disarm to only what is necessary to defend their nations. While some nations follow this guidance, a majority do not. The United Nations is not the Lesser Peace assembly. The Lesser Peace assembly would utilize the consultative process of “adorning the two with a third” to find a synthesis of truth. By adding new souls to a disagreement and drawing lots if necessary, the assembly moves past political stalemates into a space where the Holy Spirit can confirm a path forward.</w:t>
-      </w:r>
-    </w:p>
-    <w:p>
-      <w:pPr>
-        <w:pStyle w:val="BodyText"/>
-      </w:pPr>
-      <w:r>
-        <w:t>A world-wide House of Justice’s sole purpose is to work towards this assembly. This House of Justice does not have any authority at the assembly, but they can be the organizers. The members do everything they can to teach and spread the idea of a Lesser Peace and this type of world assembly. Local Houses of Justice can also promote the Lesser Peace within their jurisdictions, regardless of the authority level granted to them by the people. Baha’u’llah also does not require there to be a world-wide House of Justice for a Lesser Assembly to be convened. Any sovereign leader can call the assembly, if the choose to do so.</w:t>
+        <w:t>educational, and social purposes. A world assembly would not be a world government. Nations do not lose their sovereignty.</w:t>
+      </w:r>
+    </w:p>
+    <w:p>
+      <w:pPr>
+        <w:pStyle w:val="BodyText"/>
+      </w:pPr>
+      <w:r>
+        <w:t>There is no prerequisite required to convene a Lesser Peace assembly. This means this is not limited to the type of government a nation has. The participating governments can be decentralized or centralized power structures, capitalist or socialist economies, single party or multi party, and led by civilians or the military. Bahá’u’lláh did not describe any qualifications other than the attendees are sovereign leaders or the ministers acting on their behalf.</w:t>
+      </w:r>
+    </w:p>
+    <w:p>
+      <w:pPr>
+        <w:pStyle w:val="BodyText"/>
+      </w:pPr>
+      <w:r>
+        <w:t>The assembly is not the United Nations. The United Nations is a commendable attempt at creating a more peaceful world, but it was designed with 5 nations having veto power on any security actions. Two of these nations have attacked other nations preemptively in the last 20 years without any consequences by member nations of the UN. Another has several disputed borders, and has recently claimed marine territory other nations had controlled. The Lesser Peace assembly is only for nations to agree to no longer attack each other. Once again, there are no exceptions. The Lesser Peace assembly is for nations to disarm to only what is necessary to defend their nations. While some nations follow this guidance, a majority do not. The United Nations is not the Lesser Peace assembly. The Lesser Peace assembly would utilize the consultative process of “adorning the two with a third” to find a synthesis of truth. By adding new souls to a disagreement and drawing lots if necessary, the assembly moves past political stalemates into a space where the Holy Spirit can confirm a path forward.</w:t>
+      </w:r>
+    </w:p>
+    <w:p>
+      <w:pPr>
+        <w:pStyle w:val="BodyText"/>
+      </w:pPr>
+      <w:r>
+        <w:t>A worldwide House of Justice’s sole purpose is to work towards this assembly. This House of Justice does not have any authority at the assembly, but they can be the organizers. The members do everything they can to teach and spread the idea of a Lesser Peace and this type of world assembly. Local Houses of Justice can also promote the Lesser Peace within their jurisdictions, regardless of the authority level granted to them by the people. Bahá’u’lláh also does not require there to be a worldwide House of Justice for a Lesser Assembly to be convened. Any sovereign leader can call the assembly, if they choose to do so.</w:t>
+      </w:r>
+    </w:p>
+    <w:p>
+      <w:pPr>
+        <w:pStyle w:val="BodyText"/>
+      </w:pPr>
+      <w:r>
+        <w:rPr>
+          <w:i/>
+          <w:iCs/>
+        </w:rPr>
+        <w:t>Reflection: If an assembly is simply people gathering for a shared purpose, what would it take for nations to meet with trusteeship instead of rivalry?</w:t>
+      </w:r>
+    </w:p>
+    <w:p>
+      <w:pPr>
+        <w:pStyle w:val="BodyText"/>
+      </w:pPr>
+      <w:r>
+        <w:t>That shift sets the stage for peace to move from aspiration into binding practice.</w:t>
       </w:r>
     </w:p>
     <w:p>
@@ -25735,15 +25909,19 @@
         <w:pStyle w:val="FirstParagraph"/>
       </w:pPr>
       <w:r>
-        <w:t>The Most Great Peace has two modes. The first mode of achievement is to work towards a common affair. An affair is a transaction or other matters of public state business. These common affairs could be identified through a world assembly similar to the Lesser Peace assembly. One really good example of a successful common affair the world has achieved since Baha’u’llah’s call is when the nations of the world banned chlorofluorocarbons (CFCs).</w:t>
-      </w:r>
-    </w:p>
-    <w:p>
-      <w:pPr>
-        <w:pStyle w:val="BodyText"/>
-      </w:pPr>
-      <w:r>
-        <w:t>Common affairs could be a wide variety of issues. A good starting point could be the rights discussed throughout this book, such as a right to education. Nations might agree to promote various virtues associated with education, such as pure truthfulness which is not affected by ideology, state interest, or other power dynamics. Knowledge is not withheld nor is opinion treated as fact. In these matters, the world assembly functions through expert consultation, where the nations heed the prescriptions of those skilled in the sciences and virtues required to solve global crises, must as an individual heeds a physician.</w:t>
+        <w:t>The Most Great Peace has two modes. The first mode of achievement is to work towards a common affair. An affair is a transaction or other matters of public state business. These common affairs could be identified through a world assembly similar to the Lesser Peace assembly. One really good example of a successful common affair the world has achieved since Bahá’u’lláh’s call is when the nations of the world banned chlorofluorocarbons (CFCs) with the Montreal Protocol.</w:t>
+      </w:r>
+    </w:p>
+    <w:p>
+      <w:pPr>
+        <w:pStyle w:val="BodyText"/>
+      </w:pPr>
+      <w:r>
+        <w:t xml:space="preserve">Common affairs could be a wide variety of issues. A good starting point could be the rights discussed throughout this book, such as a right to education. Nations might agree to promote various virtues associated with education, such as pure truthfulness which is not affected by ideology, state interest, or </w:t>
+      </w:r>
+      <w:r>
+        <w:lastRenderedPageBreak/>
+        <w:t>other power dynamics. Knowledge is not withheld nor is opinion treated as fact. In these matters, the world assembly functions through expert consultation, where the nations heed the prescriptions of those skilled in the sciences and virtues required to solve global crises, much as an individual heeds a physician.</w:t>
       </w:r>
     </w:p>
     <w:p>
@@ -25759,8 +25937,27 @@
         <w:pStyle w:val="BodyText"/>
       </w:pPr>
       <w:r>
-        <w:lastRenderedPageBreak/>
-        <w:t>Houses of Justice can at the city level can help be public figures of these rights and causes. If a House of Justice is able to attain the fifth level of authority, they can guide their nation towards the common affairs of all nations. However, a sovereign leader can also call for assemblies of common affairs as we progress to the Most Great Peace.</w:t>
+        <w:t>Houses of Justice at the city level can help be public figures of these rights and causes. If a House of Justice is able to attain the fifth level of authority, they can guide their nation towards the common affairs of all nations. However, a sovereign leader can also call for assemblies of common affairs as we progress to the Most Great Peace.</w:t>
+      </w:r>
+    </w:p>
+    <w:p>
+      <w:pPr>
+        <w:pStyle w:val="BodyText"/>
+      </w:pPr>
+      <w:r>
+        <w:rPr>
+          <w:i/>
+          <w:iCs/>
+        </w:rPr>
+        <w:t>Reflection: What common affair feels most urgent to you, and how would you recognize it as genuinely common rather than politically convenient?</w:t>
+      </w:r>
+    </w:p>
+    <w:p>
+      <w:pPr>
+        <w:pStyle w:val="BodyText"/>
+      </w:pPr>
+      <w:r>
+        <w:t>Answering that keeps the Most Great Peace grounded in realities that protect the vulnerable.</w:t>
       </w:r>
     </w:p>
     <w:p>
@@ -25778,39 +25975,60 @@
         <w:pStyle w:val="FirstParagraph"/>
       </w:pPr>
       <w:r>
-        <w:t>The second mode of the Most Great Peace is the unification of religion. I feel it might be common to view this principle as all people are part of the same religion or a dominate majority. I see three potential parallel pathways unification can take. These pathways represent the liberation of the illusions and desires of sectarianism. Whether through the direct recognition of Baha’u’llah or through the evolution of existing traditions (refining the virtues), the goal is a constellation of faith that guides humanity towards a single horizon.</w:t>
-      </w:r>
-    </w:p>
-    <w:p>
-      <w:pPr>
-        <w:pStyle w:val="BodyText"/>
-      </w:pPr>
-      <w:r>
-        <w:t>Parallel Pathway #1: The world increasingly becomes more aware of Baha’u’llah and the Kitab-i-Aqdas. They learn about the Cause of God, the liberation of souls and societies, and believe Baha’u’llah is from God.</w:t>
-      </w:r>
-    </w:p>
-    <w:p>
-      <w:pPr>
-        <w:pStyle w:val="BodyText"/>
-      </w:pPr>
-      <w:r>
-        <w:t>Parallel Pathway #2: The religions of the world start to naturally adopt many of the teachings and beliefs of Baha’u’llah, such as the abolition of holy war and the full equality of women. These religions retain their names, their rituals, and traditions but evolve.</w:t>
-      </w:r>
-    </w:p>
-    <w:p>
-      <w:pPr>
-        <w:pStyle w:val="BodyText"/>
-      </w:pPr>
-      <w:r>
-        <w:t>Parallel Pathway #3: The leaders of religions find points of common belief between each other, choosing friendliness. They draw from each others strengths. A good test of such pathway is how interfaith marriages are perceived.</w:t>
-      </w:r>
-    </w:p>
-    <w:p>
-      <w:pPr>
-        <w:pStyle w:val="BodyText"/>
-      </w:pPr>
-      <w:r>
-        <w:t>None of these pathways are mutually exclusive and each can occur together. The world-wide House of Justice can work towards each of these 3 pathways, or any other pathway identified. Assemblies of religions can help foster these pathways.</w:t>
+        <w:t>The second mode of the Most Great Peace is the unification of religion. I feel it might be common to view this principle as all people are part of the same religion or a dominant majority. Instead, I see three potential parallel pathways unification can take. These pathways represent the liberation of the illusions and desires of sectarianism. Whether through the direct recognition of Bahá’u’lláh or through the evolution of existing traditions (refining the virtues), the goal is a constellation of faith that guides humanity towards a single horizon.</w:t>
+      </w:r>
+    </w:p>
+    <w:p>
+      <w:pPr>
+        <w:pStyle w:val="BodyText"/>
+      </w:pPr>
+      <w:r>
+        <w:t>Parallel Pathway #1: The world increasingly becomes more aware of Bahá’u’lláh and the Kitáb-i-Aqdas. They learn about the Cause of God, the liberation of souls and societies, and believe Bahá’u’lláh is from God.</w:t>
+      </w:r>
+    </w:p>
+    <w:p>
+      <w:pPr>
+        <w:pStyle w:val="BodyText"/>
+      </w:pPr>
+      <w:r>
+        <w:t>Parallel Pathway #2: The religions of the world start to naturally adopt many of the teachings and beliefs of Bahá’u’lláh, such as the abolition of holy war and the full equality of women. These religions retain their names, their rituals, and traditions but evolve.</w:t>
+      </w:r>
+    </w:p>
+    <w:p>
+      <w:pPr>
+        <w:pStyle w:val="BodyText"/>
+      </w:pPr>
+      <w:r>
+        <w:t>Parallel Pathway #3: The leaders of religions find points of common belief between each other, choosing friendliness. They draw from each other’s strengths. A good test of such a pathway is how interfaith marriages are perceived. Could it become normal for people of various faiths to see each other as spiritual kin which lead to courtship, engagement, and marriage approved through the consent of both spouses and both sets of parents?</w:t>
+      </w:r>
+    </w:p>
+    <w:p>
+      <w:pPr>
+        <w:pStyle w:val="BodyText"/>
+      </w:pPr>
+      <w:r>
+        <w:t>None of these pathways are mutually exclusive and each can occur together. The worldwide House of Justice can work towards each of these 3 pathways, or any other parallel pathway identified. Assemblies of religions can help foster these pathways.</w:t>
+      </w:r>
+    </w:p>
+    <w:p>
+      <w:pPr>
+        <w:pStyle w:val="BodyText"/>
+      </w:pPr>
+      <w:r>
+        <w:rPr>
+          <w:i/>
+          <w:iCs/>
+        </w:rPr>
+        <w:lastRenderedPageBreak/>
+        <w:t>Reflection: If sectarianism is an illusion that binds the heart, what would liberation from it look like in ordinary relationships?</w:t>
+      </w:r>
+    </w:p>
+    <w:p>
+      <w:pPr>
+        <w:pStyle w:val="BodyText"/>
+      </w:pPr>
+      <w:r>
+        <w:t>That question turns religious unification from abstraction into daily discipline.</w:t>
       </w:r>
     </w:p>
     <w:p>
@@ -25828,7 +26046,7 @@
         <w:pStyle w:val="FirstParagraph"/>
       </w:pPr>
       <w:r>
-        <w:t>We have a responsibility towards any sovereign leader who arises to serve the Cause of God. The Kitab-i-Aqdas #84 says:</w:t>
+        <w:t>We have a responsibility towards any sovereign leader who arises to serve the Cause of God. The Kitáb-i-Aqdas #84 says:</w:t>
       </w:r>
     </w:p>
     <w:p>
@@ -25837,6 +26055,26 @@
       </w:pPr>
       <w:r>
         <w:t>Blessed is the king who arises to support My Cause in My kingdom and detaches himself from all else. He is one of the people of the Crimson Ark, which God has made for the people of Bahá. It is fitting for everyone to honor, revere, and assist him, that he may conquer cities with the keys of My Name, the One Who rules over all in the realms of the unseen and the seen. He is as the sight of mankind, the most radiant crown upon the brow of creation, and the head of generosity for the body of the world. Support him, O people of Bahá, with wealth and lives.</w:t>
+      </w:r>
+    </w:p>
+    <w:p>
+      <w:pPr>
+        <w:pStyle w:val="FirstParagraph"/>
+      </w:pPr>
+      <w:r>
+        <w:rPr>
+          <w:i/>
+          <w:iCs/>
+        </w:rPr>
+        <w:t>Reflection: How does one recognize a leader who arises to serve the Cause of God? Once recognized, how might supporting them with your wealth and lives look like within your life?</w:t>
+      </w:r>
+    </w:p>
+    <w:p>
+      <w:pPr>
+        <w:pStyle w:val="BodyText"/>
+      </w:pPr>
+      <w:r>
+        <w:t>Knowing our responsibility towards the peace and a potential sovereign leader who serves the Cause of God can inspire us to be through a constant process of preparation, ready to help ourselves and others to achieve true liberation.</w:t>
       </w:r>
     </w:p>
     <w:p>
@@ -25846,52 +26084,51 @@
       <w:bookmarkStart w:id="447" w:name="X6cc0588fb99824e3444e9f2f07f61ae6ec01d05"/>
       <w:bookmarkEnd w:id="446"/>
       <w:r>
+        <w:t>26.6 Belief, Spiritual Practice, Social Life and Affectionate Relationships</w:t>
+      </w:r>
+    </w:p>
+    <w:p>
+      <w:pPr>
+        <w:pStyle w:val="FirstParagraph"/>
+      </w:pPr>
+      <w:r>
+        <w:t>We must be careful in how we pursue the Lesser and Most Great Peace. For example, it is incredibly difficult for a person to proclaim peace and unity if they struggle mightily to achieve such things in their personal life. Likewise, a community which fails to provide a healthy social life for its locality lacks the ability to prescribe more global measures. While it is entirely possible for top down centralized peace initiatives to be formed, such as through a monarch who arises to serve the Cause, every other institution Bahá’u’lláh described is highly decentralized.</w:t>
+      </w:r>
+    </w:p>
+    <w:p>
+      <w:pPr>
+        <w:pStyle w:val="BodyText"/>
+      </w:pPr>
+      <w:r>
+        <w:t>Decentralization is fundamentally more difficult and throughout history, decentralized institutions have regularly ceded increasing power and control towards centralization. Crises are especially noteworthy in authorities seeking more control to avert the crisis, and out of fear, people are willing to reduce their rights for an increased sense of security. While rights are inherently popular, individual responsibilities rarely are. I don’t want to seem cynical, as I enjoy my pleasures of life, but this has always been the most pressing philosophical issue regarding governance. What is our responsibility, and what am I willing to give up to pass that responsibility to a government composed of individuals, who also have the same self interests I do?</w:t>
+      </w:r>
+    </w:p>
+    <w:p>
+      <w:pPr>
+        <w:pStyle w:val="BodyText"/>
+      </w:pPr>
+      <w:r>
+        <w:t xml:space="preserve">This is why trusteeship, the same model that guides the Houses of Justice, is integral to every level of governance. For each right we hope to have, Bahá’u’lláh gives us an equal responsibility. Just as a King must verify news from a wicked or wretched person, we must verify the news of our own ego through the </w:t>
+      </w:r>
+      <w:r>
         <w:lastRenderedPageBreak/>
-        <w:t>26.6 Belief, Spiritual Practice, Social Life and Affectionate Relationships</w:t>
-      </w:r>
-    </w:p>
-    <w:p>
-      <w:pPr>
-        <w:pStyle w:val="FirstParagraph"/>
-      </w:pPr>
-      <w:r>
-        <w:t>We must be careful in how we pursue the Lesser and Most Great Peace. For example, it is incredibly difficult for a person to proclaim peace and unity if they struggle mightily to achieve such things in their personal life. Likewise, a community which fails to provide a healthy social life for its locality lacks the ability to prescribe more global measures. While it is entirely possible for top-down centralized peace initiatives to be formed, such as through a monarch who arises to serve the Cause, every other institution Baha’u’llah described is highly decentralized.</w:t>
-      </w:r>
-    </w:p>
-    <w:p>
-      <w:pPr>
-        <w:pStyle w:val="BodyText"/>
-      </w:pPr>
-      <w:r>
-        <w:t>Decentralization is fundamentally more difficult and throughout history, decentralized institutions have regularly ceded increasing power and control towards centralization. Crisis are especially noteworthy in authorities seeking more control to avert the crisis, and out of fear, people are willing to reduce their rights for an increased sense of security. While rights are inherently popular, individual responsibilities rarely are. I don’t want to seem cynical, as I enjoy my pleasures of life, but this has always been the most pressing philosophical issue regarding governance. What is our responsibility, and what am I willing to give up to pass that responsibility to a government composed of individuals, who also have the same self-interests I do?</w:t>
-      </w:r>
-    </w:p>
-    <w:p>
-      <w:pPr>
-        <w:pStyle w:val="BodyText"/>
-      </w:pPr>
-      <w:r>
-        <w:t>This is why trusteeship, the same model that guides the Houses of Justice, is integral to every level of governance. For each right we hope to have, Baha’u’llah gives us an equal responsibility. Just as a King must verify news from a wicked or wretched person, we must verify the news of our own ego through the spiritual practices of prayer and reflection. Everything comes down to the individual. There is a cyclical never-ending process we must practice to increase our chances of creating a Lesser and Most Great Peace. First, we must believe such a peace is possible. We believe in God, our souls, the spiritual worlds, the Day of Resurrection, God’s Command, and His Manifestation. We don’t have to believe perfectly, but we believe there is more than meets the eye, and it inspires us. We perform our spiritual practices which help inform the development of our virtues. These transform our personal lives and prepare us for a healthy social life, full of potential for affectionate relationships. Our belief is expressed in good deeds. These deeds and experiences, even negative experiences, provide a feedback loop enhancing our belief. Every day is a new opportunity for refinement. Practice may not lead to perfection, but it is the only pathway towards perfection. Always keep practicing.</w:t>
-      </w:r>
-    </w:p>
-    <w:p>
-      <w:pPr>
-        <w:pStyle w:val="BodyText"/>
-      </w:pPr>
-      <w:r>
-        <w:t>This feedback loop is the internal form of consultation, which ensures we are as capable as any person to participate in the emergence of peace. I recognize it can seem like hard work, and potentially a significant reorientation of our lifestyles. This work prepares us to be the knights, like those believers of Shiraz, capable of serving as trustees for the liberation of others. While being mindful Baha’u’llah did not want us overburdened, we can actively pursue good deeds. This can be as simple as helping an elderly person grab an item at a grocery store or as complex as raising another’s child. Being a trustee can also utilizing your skills to actively work in social, civic, and political roles.</w:t>
-      </w:r>
-    </w:p>
-    <w:p>
-      <w:pPr>
-        <w:pStyle w:val="BodyText"/>
-      </w:pPr>
-      <w:r>
-        <w:t xml:space="preserve">If Baha’u’llah envisioned a King to arise to serve the Cause, it requires not only an individual who believes, but an individual who believes and is willing to act on that belief. While not everyone can be a sovereign leader of a nation, there are countless ways we can serve as trustees. Use your imagination. Baha’u’llah </w:t>
-      </w:r>
-      <w:r>
-        <w:lastRenderedPageBreak/>
-        <w:t>eliminated the intermediaries who created veils over our imagination. We are no longer the ‘owl among the ruins’ of Rome or Istanbul, we are the builders of a new Ark. This Ark is designed by the captain of the Crimson Ark, and can lead us to the shores of Oneness in humanity.</w:t>
+        <w:t>spiritual practices of prayer and reflection. Everything comes down to the individual. There is a cyclical never ending process we must practice to increase our chances of creating a Lesser and Most Great Peace. First, we must believe such a peace is possible. We believe in God, our souls, the spiritual worlds, the Day of Resurrection, God’s Command, and His Manifestation. We don’t have to believe perfectly, but we believe there is more than meets the eye, and it inspires us. We perform our spiritual practices which help inform the development of our virtues. These transform our personal lives and prepare us for a healthy social life, full of potential for affectionate relationships. Our belief is expressed in good deeds. These deeds and experiences, even negative experiences, provide a feedback loop enhancing our belief. Every day is a new opportunity for refinement. Practice may not lead to perfection, but it is the only pathway towards perfection. Always keep practicing.</w:t>
+      </w:r>
+    </w:p>
+    <w:p>
+      <w:pPr>
+        <w:pStyle w:val="BodyText"/>
+      </w:pPr>
+      <w:r>
+        <w:t>This feedback loop is the internal form of consultation, which ensures we are as capable as any person to participate in the emergence of peace. I recognize it can seem like hard work, and potentially a significant reorientation of our lifestyles. This work prepares us to be the knights, like those believers of Shiraz, capable of serving as trustees for the liberation of others. While being mindful Bahá’u’lláh did not want us overburdened, we can actively pursue good deeds. This can be as simple as helping an elderly person grab an item at a grocery store or as complex as raising another’s child. Being a trustee can also utilize your skills to actively work in social, civic, and political roles.</w:t>
+      </w:r>
+    </w:p>
+    <w:p>
+      <w:pPr>
+        <w:pStyle w:val="BodyText"/>
+      </w:pPr>
+      <w:r>
+        <w:t>If Bahá’u’lláh envisioned a King to arise to serve the Cause, it requires not only an individual who believes, but an individual who believes and is willing to act on that belief. While not everyone can be a sovereign leader of a nation, there are countless ways we can serve as trustees. Use your imagination. Bahá’u’lláh eliminated the intermediaries who created veils over our imagination. We are no longer the ‘owl among the ruins’ of Rome or Istanbul, we are the builders of a new Ark. This Ark is designed by the captain of the Crimson Ark, and can lead us to the shores of Oneness in humanity.</w:t>
       </w:r>
     </w:p>
     <w:p>
@@ -25900,6 +26137,26 @@
       </w:pPr>
       <w:r>
         <w:t>Explore within yourself, within your developing God consciousness. As peace grows within you, that peace can help others attain peace.</w:t>
+      </w:r>
+    </w:p>
+    <w:p>
+      <w:pPr>
+        <w:pStyle w:val="BodyText"/>
+      </w:pPr>
+      <w:r>
+        <w:rPr>
+          <w:i/>
+          <w:iCs/>
+        </w:rPr>
+        <w:t>Reflection: If peace is built from daily virtues, what responsibility do you refuse to surrender, even when it would feel easier to do so?</w:t>
+      </w:r>
+    </w:p>
+    <w:p>
+      <w:pPr>
+        <w:pStyle w:val="BodyText"/>
+      </w:pPr>
+      <w:r>
+        <w:t>That refusal is where trusteeship becomes real, and where liberation theology becomes practice rather than slogan.</w:t>
       </w:r>
     </w:p>
     <w:p>
@@ -25917,7 +26174,19 @@
         <w:pStyle w:val="FirstParagraph"/>
       </w:pPr>
       <w:r>
-        <w:t>We cannot do any of this alone. The last chapter of this book is about teaching the Cause. We will look at Baha’u’llah’s guidance in teaching others. How will people know there is a Kitab-i-Aqdas created to liberate them starting today and for at least another 800 years?</w:t>
+        <w:t>We cannot do any of this alone. The last chapter of this book is about teaching the Cause. We will look at Bahá’u’lláh’s guidance in teaching others. How will people know there is a Kitáb-i-Aqdas created to liberate them starting today and for at least another 800 years?</w:t>
+      </w:r>
+    </w:p>
+    <w:p>
+      <w:pPr>
+        <w:pStyle w:val="BodyText"/>
+      </w:pPr>
+      <w:r>
+        <w:t xml:space="preserve">To close, this chapter has argued that peace is not a miracle imposed from above, but a subtle design expressed through trusteeship, consultation, and the steady purification of motives, so that the Lesser Peace can preserve the world and the Most Great Peace can unify its affairs and faiths. The next chapter </w:t>
+      </w:r>
+      <w:r>
+        <w:lastRenderedPageBreak/>
+        <w:t>turns to teaching because no structure of peace can endure unless hearts are awakened to the Book, the responsibilities it restores, and the oneness it asks us to live.</w:t>
       </w:r>
     </w:p>
     <w:p>
@@ -25930,7 +26199,7 @@
         <w:pStyle w:val="Heading1"/>
       </w:pPr>
       <w:bookmarkStart w:id="449" w:name="serving-the-cause"/>
-      <w:bookmarkStart w:id="450" w:name="_Toc223295716"/>
+      <w:bookmarkStart w:id="450" w:name="_Toc223511226"/>
       <w:bookmarkEnd w:id="438"/>
       <w:bookmarkEnd w:id="448"/>
       <w:r>
@@ -25944,7 +26213,7 @@
         <w:pStyle w:val="FirstParagraph"/>
       </w:pPr>
       <w:r>
-        <w:t>Throughout the Kitab-i-Aqdas, Baha’u’llah enjoins upon us to serve the Cause of God. This can be done through proclamation, teaching, and being a good example. We are also to support those who serve, in whichever ways we can.</w:t>
+        <w:t>Throughout the Kitáb-i-Aqdas, Bahá’u’lláh enjoins upon us to serve the Cause of God. This can be done through proclamation, teaching, and being a good example. We are also to support those who serve, in whichever ways we can.</w:t>
       </w:r>
       <w:r>
         <w:rPr>
@@ -25953,7 +26222,7 @@
         <w:footnoteReference w:id="561"/>
       </w:r>
       <w:r>
-        <w:t xml:space="preserve"> This book has covered in significant detail how to be a good example, or at least has shared the framework the Kitab-i-Aqdas provides. We have spent 26 chapters sharing what the Cause of God is. Now we close this final chapter on how to serve the Cause of God. You not only have access to the Crimson Ark, but you have the keys to pilot it. Your goal is not to cause others to be your followers, but your goal is to use your Crimson Ark to help others gain access to their Crimson Ark, complete with their own keys.</w:t>
+        <w:t xml:space="preserve"> This book has covered in significant detail how to be a good example, or at least has shared the framework the Kitáb-i-Aqdas provides. We have spent 26 chapters sharing what the Cause of God is. Now we close this final chapter on how to serve the Cause of God. You not only have access to the Crimson Ark, but you have the keys to pilot it. Your goal is not to cause others to be your followers. Your goal is to use your Crimson Ark to help others gain access to their Crimson Ark, complete with their own keys. In this sense, serving the Cause is not about authority over others. It is about helping souls discover their own pathway toward liberation and nearness to God.</w:t>
       </w:r>
     </w:p>
     <w:p>
@@ -25979,7 +26248,7 @@
         <w:pStyle w:val="FirstParagraph"/>
       </w:pPr>
       <w:r>
-        <w:t>Baha’u’llah tells us to proclaim the Cause to the followers of other religions.</w:t>
+        <w:t>Bahá’u’lláh tells us to proclaim the Cause to the followers of other religions.</w:t>
       </w:r>
       <w:r>
         <w:rPr>
@@ -26006,7 +26275,7 @@
         <w:pStyle w:val="FirstParagraph"/>
       </w:pPr>
       <w:r>
-        <w:t>Baha’u’llah has permitted, but not required, people to learn various languages to proclaim the Cause of God throughout both East and West.</w:t>
+        <w:t>Bahá’u’lláh has permitted, but not required, people to learn various languages to proclaim the Cause of God throughout both East and West.</w:t>
       </w:r>
       <w:r>
         <w:rPr>
@@ -26015,15 +26284,15 @@
         <w:footnoteReference w:id="563"/>
       </w:r>
       <w:r>
-        <w:t xml:space="preserve"> The Kitab-i-Aqdas also expresses a couple of proclamations God had made Himself through Baha’u’llah. I consider these proclamations to be examples of how to mention God among the nations and people.</w:t>
-      </w:r>
-    </w:p>
-    <w:p>
-      <w:pPr>
-        <w:pStyle w:val="BodyText"/>
-      </w:pPr>
-      <w:r>
-        <w:t>One example is for people to turn with radiant faces and hearts of joy towards the Sidrat-ul Muntaha which proclaims “There is no God but Me, the All-Possessing, the Self-Subsisting.”</w:t>
+        <w:t xml:space="preserve"> The Kitáb-i-Aqdas also expresses a couple of proclamations God had made Himself through Bahá’u’lláh. I consider these proclamations to be examples of how to mention God among the nations and people.</w:t>
+      </w:r>
+    </w:p>
+    <w:p>
+      <w:pPr>
+        <w:pStyle w:val="BodyText"/>
+      </w:pPr>
+      <w:r>
+        <w:t>One example is for people to turn with radiant faces and hearts of joy towards the Sidrat-ul-Muntahá which proclaims “There is no God but Me, the All Possessing, the Self Subsisting.”</w:t>
       </w:r>
       <w:r>
         <w:rPr>
@@ -26032,7 +26301,7 @@
         <w:footnoteReference w:id="564"/>
       </w:r>
       <w:r>
-        <w:t xml:space="preserve"> Another example is when Baha’u’llah counsels us to be manifestations of steadfastness when the Book proclaims “There is no God but Me, the Almighty, the All-Praised.”</w:t>
+        <w:t xml:space="preserve"> Another example is when Bahá’u’lláh counsels us to be manifestations of steadfastness when the Book proclaims “There is no God but Me, the Almighty, the All Praised.”</w:t>
       </w:r>
       <w:r>
         <w:rPr>
@@ -26057,15 +26326,35 @@
         <w:pStyle w:val="FirstParagraph"/>
       </w:pPr>
       <w:r>
-        <w:t>These two simple instructions parallel most of Baha’u’llah’s guidance in what a proclamation consists of. When associated with the Day of Resurrection, the proclamation is about the Great Announcement where God has announced He has arrived to speak and guide humankind. Thus, proclamation should be considered as an announcement. Ridván is the day when Baha’u’llah first made His announcement to the world, and this announcement continued throughout the rest of His ministry.</w:t>
-      </w:r>
-    </w:p>
-    <w:p>
-      <w:pPr>
-        <w:pStyle w:val="BodyText"/>
-      </w:pPr>
-      <w:r>
-        <w:t>We must be steadfast, radiant, and joyous in our proclamation. If we lack either trait or quality, the Great Announcement will not have the full effect. There are only four things which need proclaimed. The first is “there is no God but Me”, the second is God has spoken again through the name of Baha’u’llah, the Glory of God. The third proclamation is the Cause of God. You do not even have to explain the Cause of God in the proclamation, but that there is a Cause. A Cause can also be known as an effect of God’s Word. God exists, God speaks, and God affects you. If you were to say what the Cause is, I would advise to identify in one short sentence what the Cause is. For me, an effect could be as simple as saying “to usher in the Most Great Peace,” “to liberate the souls from oppression,” or “to purify all religion.” What is the Cause of God to you? If you believe in this Cause with radiance, joy, and steadfastness, share it but share it simply. The final part of the proclamation is the invitation. Invite the audience to the Cause.</w:t>
+        <w:t>These two simple instructions parallel most of Bahá’u’lláh’s guidance in what a proclamation consists of. When associated with the Day of Resurrection, the proclamation is about the Great Announcement where God has announced He has arrived to speak and guide humankind. Thus, proclamation should be considered as an announcement. Ridván is the day when Bahá’u’lláh first made His announcement to the world, and this announcement continued throughout the rest of His ministry.</w:t>
+      </w:r>
+    </w:p>
+    <w:p>
+      <w:pPr>
+        <w:pStyle w:val="BodyText"/>
+      </w:pPr>
+      <w:r>
+        <w:t>We must be steadfast, radiant, and joyous in our proclamation. If we lack either trait or quality, the Great Announcement will not have the full effect. There are only four things which need to be proclaimed. The first is “there is no God but Me.” The second is God has spoken again through the name of Bahá’u’lláh, the Glory of God. The third proclamation is the Cause of God. You do not even have to explain the Cause of God in the proclamation, but that there is a Cause. A Cause can also be known as an effect of God’s Word. God exists, God speaks, and God affects you. If you were to say what the Cause is, I would advise identifying in one short sentence what the Cause is. For me, an effect could be as simple as saying “to usher in the Most Great Peace,” “to liberate souls from oppression,” or “to purify all religion.” What is the Cause of God to you? If you believe in this Cause with radiance, joy, and steadfastness, share it, but share it simply. The final part of the proclamation is the invitation. Invite the audience to the Cause.</w:t>
+      </w:r>
+    </w:p>
+    <w:p>
+      <w:pPr>
+        <w:pStyle w:val="BodyText"/>
+      </w:pPr>
+      <w:r>
+        <w:rPr>
+          <w:i/>
+          <w:iCs/>
+        </w:rPr>
+        <w:t>Reflection: When you speak about God or truth, what qualities in your heart determine whether your words attract others or repel them?</w:t>
+      </w:r>
+    </w:p>
+    <w:p>
+      <w:pPr>
+        <w:pStyle w:val="BodyText"/>
+      </w:pPr>
+      <w:r>
+        <w:t>This question matters because proclamation depends as much on character as it does on speech.</w:t>
       </w:r>
     </w:p>
     <w:p>
@@ -26084,23 +26373,23 @@
         <w:pStyle w:val="FirstParagraph"/>
       </w:pPr>
       <w:r>
-        <w:t>The Kitab-i-Aqdas itself says very little about teaching, yet we know teaching has a high station. With the inheritance law, teachers are the only non-familial category to receive a share in the absence of a will. If anyone chose to model their inheritance after the Aqdas, teachers receive 3.6%. This means not only are teachers entrusted with a task, we are also entrusted to serve the teachers. There is no other profession in the Kitab-i-Aqdas held with such a high responsibility.</w:t>
-      </w:r>
-    </w:p>
-    <w:p>
-      <w:pPr>
-        <w:pStyle w:val="BodyText"/>
-      </w:pPr>
-      <w:r>
-        <w:t>Children are the first audience to teach, which is the responsibility of parents and the Houses of Justice in the absence of parents being able to fulfill this responsibility. Teaching is not limited to children, but it is for anyone who is interested in learning. In this capacity, even adults are children who are still developing their souls. Teaching comes after proclamation, if anyone had responded to the proclamation. If no one responded to the proclamation, we let go and move on.</w:t>
-      </w:r>
-    </w:p>
-    <w:p>
-      <w:pPr>
-        <w:pStyle w:val="BodyText"/>
-      </w:pPr>
-      <w:r>
-        <w:t>Baha’u’llah instructs us adorn ourselves with good deeds, then through wisdom and eloquence.</w:t>
+        <w:t>The Kitáb-i-Aqdas itself says very little about teaching, yet we know teaching has a high station. With the inheritance law, teachers are the only non familial category to receive a share in the absence of a will. If anyone chose to model their inheritance after the Aqdas, teachers receive 3.6 percent. This means not only are teachers entrusted with a task, we are also entrusted to serve the teachers. There is no other profession in the Kitáb-i-Aqdas held with such a high responsibility.</w:t>
+      </w:r>
+    </w:p>
+    <w:p>
+      <w:pPr>
+        <w:pStyle w:val="BodyText"/>
+      </w:pPr>
+      <w:r>
+        <w:t>Children are the first audience to teach, which is the responsibility of parents and the Houses of Justice in the absence of parents being able to fulfill this responsibility. Teaching is not limited to children, but it is for anyone who is interested in learning. In this capacity, even adults are children who are still developing their souls. Teaching comes after proclamation if anyone has responded to the proclamation. If no one responded to the proclamation, we let go and move on.</w:t>
+      </w:r>
+    </w:p>
+    <w:p>
+      <w:pPr>
+        <w:pStyle w:val="BodyText"/>
+      </w:pPr>
+      <w:r>
+        <w:t>Bahá’u’lláh instructs us to adorn ourselves with good deeds, then through wisdom and eloquence.</w:t>
       </w:r>
       <w:r>
         <w:rPr>
@@ -26109,7 +26398,31 @@
         <w:footnoteReference w:id="566"/>
       </w:r>
       <w:r>
-        <w:t xml:space="preserve"> Baha’u’llah expands upon this simple framework in an unnamed tablet BH02623. I’m personally calling it “Teaching with the Measure of Mercy.” It is a thorough but brief summary of all the ways Baha’u’llah Himself has taught others, and how we can teach using His example. The entirety of this section is derived from this tablet.</w:t>
+        <w:t xml:space="preserve"> Bahá’u’lláh expands upon this simple framework in an unnamed tablet BH02623. I am personally calling it “Teaching with the Measure of Mercy.” It is a thorough but brief summary of all the ways Bahá’u’lláh </w:t>
+      </w:r>
+      <w:r>
+        <w:lastRenderedPageBreak/>
+        <w:t>Himself has taught others, and how we can teach using His example. The entirety of this section is derived from this tablet.</w:t>
+      </w:r>
+    </w:p>
+    <w:p>
+      <w:pPr>
+        <w:pStyle w:val="BodyText"/>
+      </w:pPr>
+      <w:r>
+        <w:rPr>
+          <w:i/>
+          <w:iCs/>
+        </w:rPr>
+        <w:t>Reflection: What distinguishes teaching from proclamation, and why might a soul need both at different moments in their journey?</w:t>
+      </w:r>
+    </w:p>
+    <w:p>
+      <w:pPr>
+        <w:pStyle w:val="BodyText"/>
+      </w:pPr>
+      <w:r>
+        <w:t>Understanding this difference prepares us to approach teaching with patience rather than urgency.</w:t>
       </w:r>
     </w:p>
     <w:p>
@@ -26119,7 +26432,6 @@
       <w:bookmarkStart w:id="456" w:name="teaching-with-the-measure-of-mercy"/>
       <w:bookmarkEnd w:id="455"/>
       <w:r>
-        <w:lastRenderedPageBreak/>
         <w:t>27.3 Teaching With The Measure of Mercy</w:t>
       </w:r>
     </w:p>
@@ -26128,7 +26440,7 @@
         <w:pStyle w:val="FirstParagraph"/>
       </w:pPr>
       <w:r>
-        <w:t>Teaching with the measure of mercy begins with orientation. Baha’u’llah says the teacher is the “spiritual physician and the true sage.” A sage is one who is acclaimed and respected for their experience, judgment, and wisdom. Not every person who wants to teach is capable of teaching, but through time, practice, and patience, one can be a true sage if they desire to heal the spirit.</w:t>
+        <w:t>Teaching with the measure of mercy begins with orientation. Bahá’u’lláh says the teacher is the “spiritual physician and the true sage.” A sage is one who is acclaimed and respected for their experience, judgment, and wisdom. Not every person who wants to teach is capable of teaching, but through time, practice, and patience one can become a true sage if they desire to heal the spirit.</w:t>
       </w:r>
     </w:p>
     <w:p>
@@ -26153,7 +26465,7 @@
         <w:pStyle w:val="BodyText"/>
       </w:pPr>
       <w:r>
-        <w:t>The best way to ensure we are qualified to be a spiritual physician is to be immersed in the spiritual practices of the Kitab-i-Aqdas. Pray, recite, remember, reflect, and honor God with regularity. This keeps the mirror of the soul oriented and polished as well as it can be. As spiritual practice is regular, without a rush, and with a sense of detachment, teaching is the same way. When we seek to teach, we do not give all treatments, all at once, without knowing the patient or student. We take time to know them, for them to know us, and only develop a treatment plan (teaching mode) once we know what needs healing.</w:t>
+        <w:t>The best way to ensure we are qualified to be a spiritual physician is to be immersed in the spiritual practices of the Kitáb-i-Aqdas. Pray, recite, remember, reflect, and honor God with regularity. This keeps the mirror of the soul oriented and polished as well as it can be. As spiritual practice is regular, without a rush, and with a sense of detachment, teaching is the same way. When we seek to teach, we do not give all treatments at once without knowing the patient or student. We take time to know them, for them to know us, and only develop a treatment plan once we understand what needs healing.</w:t>
       </w:r>
     </w:p>
     <w:p>
@@ -26171,15 +26483,19 @@
         <w:pStyle w:val="FirstParagraph"/>
       </w:pPr>
       <w:r>
-        <w:t>Baha’u’llah describes what happens when people are subjected to spiritual leaders who are scholars of illusions. Remember the chapter on the private self and all of the illusions one may face. Imagine a soul who trusted a spiritual leader whose spirit was enraptured by their own illusions and desires, not the salvation or well-being of a soul? Baha’u’llah says this type of soul will be shaken by just the mention of spiritual leaders, let alone the divinity of God. He says in cases such as these, be wise by withholding teachings of command, power, manifestation, and such. Perhaps the focus would emphasize God’s names of Mercy and Love, without expecting the soul to want to submit to any type of spiritual leader. Guide the person to healing. Let them heal from their spiritual trauma.</w:t>
-      </w:r>
-    </w:p>
-    <w:p>
-      <w:pPr>
-        <w:pStyle w:val="BodyText"/>
-      </w:pPr>
-      <w:r>
-        <w:t>This trauma can be caused in a myriad of ways. I will not go in all the ways, but know if trusteeship is meant to be practiced in every level of human experience, so too have the expressions of oppression and tyranny. Be receptive and know this world has a lot of pain to heal. Even the teacher themselves could be healing as they heal.</w:t>
+        <w:t xml:space="preserve">Bahá’u’lláh describes what happens when people are subjected to spiritual leaders who are scholars of illusions. Remember the chapter on the private self and all of the illusions one may face. Imagine a soul who trusted a spiritual leader whose spirit was enraptured by their own illusions and desires, not the salvation or well being of a soul. Bahá’u’lláh says this type of soul will be shaken by just the mention of spiritual leaders, let alone the divinity of God. He says in cases such as these, be wise by withholding teachings of command, power, manifestation, and such. Perhaps the focus would emphasize God’s </w:t>
+      </w:r>
+      <w:r>
+        <w:lastRenderedPageBreak/>
+        <w:t>names of Mercy and Love, without expecting the soul to want to submit to any type of spiritual leader. Guide the person to healing. Let them heal from their spiritual trauma.</w:t>
+      </w:r>
+    </w:p>
+    <w:p>
+      <w:pPr>
+        <w:pStyle w:val="BodyText"/>
+      </w:pPr>
+      <w:r>
+        <w:t>This trauma can be caused in a myriad of ways. I will not go into all the ways, but know if trusteeship is meant to be practiced in every level of human experience, so too have the expressions of oppression and tyranny. Be receptive and know this world has a lot of pain to heal. Even the teacher themselves could be healing as they heal.</w:t>
       </w:r>
     </w:p>
     <w:p>
@@ -26189,7 +26505,6 @@
       <w:bookmarkStart w:id="459" w:name="milk-before-meat"/>
       <w:bookmarkEnd w:id="458"/>
       <w:r>
-        <w:lastRenderedPageBreak/>
         <w:t>27.3.3 Milk Before Meat</w:t>
       </w:r>
     </w:p>
@@ -26198,23 +26513,23 @@
         <w:pStyle w:val="FirstParagraph"/>
       </w:pPr>
       <w:r>
-        <w:t>Baha’u’llah uses the analogy that you do not give a child meat instead of milk. They start with milk. The medicine of teaching is based on the developmental capacity of the student. The milk begins with a goodly character and pure deeds. The teacher is the example of this milk, and teaches this goodly character and pure deeds. This duration we give milk can vary, and is entirely dependent on the soul receiving the milk. The person likes the ethics, but may not be ready for more difficult or challenging teachings.</w:t>
-      </w:r>
-    </w:p>
-    <w:p>
-      <w:pPr>
-        <w:pStyle w:val="BodyText"/>
-      </w:pPr>
-      <w:r>
-        <w:t>Once the soul’s capacity has been nurtured and has grown, the next stage is to give fruit. The fruit is guardianship (the Arabic word wilayat). A wali could be someone viewed as a saint or friend of God. This would be the stage where the teacher introduces Baha’u’llah as not merely a teacher of good character, but also as a friend who loves them. They are being prepared for maturity. They can view Baha’u’llah as an authority without panic or with suspicion. They can start to trust Baha’u’llah cares for them, and sees Him and their teacher as examples to follow. The spiritual practices can be introduced, instructed, and practiced. The soul explores these at their own pace and learn to develop a personal relationship with God. Even if there is a challenging time, or even a challenging teaching. Most importantly, the person feels safe to be themselves, a more regularly refining version of themselves. The soul may still wish God acted as they wanted, or that revelation more conformed to their wishes. Yet, because of their trust in Baha’u’llah, they still partake of their fruit. They remain friends.</w:t>
-      </w:r>
-    </w:p>
-    <w:p>
-      <w:pPr>
-        <w:pStyle w:val="BodyText"/>
-      </w:pPr>
-      <w:r>
-        <w:t>Over time, the fruit has nurtured the soul and when they are ready, the teacher may give them the meat. The meat would be the most difficult aspects of belief. This could include expressing the full station of Baha’u’llah. For many, just the idea there is not a final prophet is a huge psychological challenge to overcome. Or in the case of someone abused by a person who claimed to be a man of God, or acting on behalf of God, this could be scary. It could take years to achieve the stage of meat. Other forms of meat would be teachings which challenge the current culture or commonly accepted notions of how things are. Meat can be tough to chew, and has to be prepared just at the right temperature, for the right duration, and with the right seasoning. Once the soul is consuming this spiritual meat, they are at the stage where they are willing to transform beyond their who they once were. They are developing their own God consciousness. This is the stage of submission to God’s will.</w:t>
+        <w:t>Bahá’u’lláh uses the analogy that you do not give a child meat instead of milk. They start with milk. The medicine of teaching is based on the developmental capacity of the student. The milk begins with a goodly character and pure deeds. The teacher is the example of this milk and teaches this goodly character and pure deeds. This duration we give milk can vary and is entirely dependent on the soul receiving the milk. The person likes the ethics, but may not be ready for more difficult teachings.</w:t>
+      </w:r>
+    </w:p>
+    <w:p>
+      <w:pPr>
+        <w:pStyle w:val="BodyText"/>
+      </w:pPr>
+      <w:r>
+        <w:t>Once the soul’s capacity has been nurtured and has grown, the next stage is to give fruit. The fruit is guardianship (the Arabic word wilayat). A wali could be someone viewed as a saint or friend of God. This would be the stage where the teacher introduces Bahá’u’lláh not merely as a teacher of good character, but also as a friend who loves them. They are being prepared for maturity. They can view Bahá’u’lláh as an authority without panic or suspicion. They can start to trust Bahá’u’lláh cares for them and see Him and their teacher as examples to follow. The spiritual practices can be introduced, instructed, and practiced. The soul explores these at their own pace and learns to develop a personal relationship with God.</w:t>
+      </w:r>
+    </w:p>
+    <w:p>
+      <w:pPr>
+        <w:pStyle w:val="BodyText"/>
+      </w:pPr>
+      <w:r>
+        <w:t>Over time the fruit has nurtured the soul and when they are ready, the teacher may give them the meat. The meat would be the most difficult aspects of belief. This could include expressing the full station of Bahá’u’lláh. For many, just the idea there is not a final prophet is a huge psychological challenge to overcome. In other situations a person harmed by someone claiming spiritual authority may need years before such teachings feel safe. Meat can be tough to chew and must be prepared with care and patience. Once the soul is consuming this spiritual meat they are at the stage where they are willing to transform beyond who they once were. They are developing their own God consciousness. This is the stage of submission to God’s will.</w:t>
       </w:r>
     </w:p>
     <w:p>
@@ -26232,19 +26547,39 @@
         <w:pStyle w:val="FirstParagraph"/>
       </w:pPr>
       <w:r>
-        <w:t>Baha’u’llah explains that every soul is a seeker. They may not be actively seeking in the moment, but at some point they will. The reason why they stop seeking or turn away from God is due to what He calls the “fancies arranged beforehand.” These fancies are shaped by parents, friends, religious leaders, non-spiritual leaders, cultural icons, and other sources. Burning away these fancies is very difficult.</w:t>
-      </w:r>
-    </w:p>
-    <w:p>
-      <w:pPr>
-        <w:pStyle w:val="BodyText"/>
-      </w:pPr>
-      <w:r>
-        <w:t xml:space="preserve">The only way to burn through these fancies is for the spiritual physician to embrace mercy, kindness, and compassion. All souls were created in stages, and even if we desire a soul to be in a different stage for their own long-term well-being, we must never force upon the soul more than they are ready for. The journey is not on the teacher’s terms. A seeker may seek, stop, seek, stop, and continue this cycle. The true sage is detached from outcomes. All that is desired is the soul is free from the oppression of prior </w:t>
+        <w:t>Bahá’u’lláh explains that every soul is a seeker. They may not be actively seeking in the moment, but at some point they will. The reason why they stop seeking or turn away from God is due to what He calls the “fancies arranged beforehand.” These fancies are shaped by parents, friends, religious leaders, non-spiritual leaders, cultural icons, and other sources. Burning away these fancies is very difficult.</w:t>
+      </w:r>
+    </w:p>
+    <w:p>
+      <w:pPr>
+        <w:pStyle w:val="BodyText"/>
+      </w:pPr>
+      <w:r>
+        <w:t xml:space="preserve">The only way to burn through these fancies is for the spiritual physician to embrace mercy, kindness, and compassion. All souls were created in stages, and even if we desire a soul to be in a different stage for their own long term well being, we must never force upon the soul more than they are ready for. The journey is not on the teacher’s terms. A seeker may seek, stop, seek, stop, and continue this cycle. The </w:t>
       </w:r>
       <w:r>
         <w:lastRenderedPageBreak/>
-        <w:t>institutions. A liberated soul can love and navigate the spiritual worlds freely. Maybe this soul, nurtured with milk, fruit, and then meat will help the next soul who suffered with the ways of the world.</w:t>
+        <w:t>true sage is detached from outcomes. All that is desired is the soul is free from the oppression of prior institutions. A liberated soul can love and navigate the spiritual worlds freely. Maybe this soul, nurtured with milk, fruit, and then meat will help the next soul who suffered with the ways of the world.</w:t>
+      </w:r>
+    </w:p>
+    <w:p>
+      <w:pPr>
+        <w:pStyle w:val="BodyText"/>
+      </w:pPr>
+      <w:r>
+        <w:rPr>
+          <w:i/>
+          <w:iCs/>
+        </w:rPr>
+        <w:t>Reflection: When someone begins to search for truth, what kind of patience and humility must the teacher practice so that mercy remains the measure of teaching?</w:t>
+      </w:r>
+    </w:p>
+    <w:p>
+      <w:pPr>
+        <w:pStyle w:val="BodyText"/>
+      </w:pPr>
+      <w:r>
+        <w:t>This reflection reminds us that teaching is not persuasion but healing.</w:t>
       </w:r>
     </w:p>
     <w:p>
@@ -26263,23 +26598,31 @@
         <w:pStyle w:val="FirstParagraph"/>
       </w:pPr>
       <w:r>
-        <w:t>I want to close this book with one more observation. In real life, doctors work best when their top priority is the health of their patients. In the United States, healthcare has many bureaucratic layers which were originally designed to help facilitate the healthcare process. Over time, the bureaucratic layers became the process and the pathway to healing. The doctor has consumed more of their time in checking the boxes and filling out the appropriate forms more than actually being with their patients or leading care.</w:t>
-      </w:r>
-    </w:p>
-    <w:p>
-      <w:pPr>
-        <w:pStyle w:val="BodyText"/>
-      </w:pPr>
-      <w:r>
-        <w:t>I believe this is why Baha’u’llah did not create any other curriculum or any formal institution. The Teaching With Mercy method is purposefully open-ended. Each stage of milk, fruit, and meat when working with a true sage is specifically curated for the seeker’s needs. There is no standardized curriculum which works for every person. Yet, all potential curriculum can be derived from the Kitab-i-Aqdas and the letters, tablets, and books Baha’u’llah wrote to support the Kitab-i-Aqdas.</w:t>
-      </w:r>
-    </w:p>
-    <w:p>
-      <w:pPr>
-        <w:pStyle w:val="BodyText"/>
-      </w:pPr>
-      <w:r>
-        <w:t>I hope this book had done a good job in demonstrating one way the Kitab-i-Aqdas could be viewed. I also hope this book has inspired a desire to explore the Kitab-i-Aqdas further, on your own terms. Finally, I do also hope there was something in the book to inspire you. In all truth, each chapter could have been a book in and of itself. There will always be much more to explore. No matter what your future holds, I do hope you believe you have a soul, its purpose is to be liberated, and that you are willing to act as a trustee to your own soul. Thank you!</w:t>
+        <w:t>I want to close this book with one more observation. In real life, doctors work best when their top priority is the health of their patients. In the United States, healthcare has many bureaucratic layers which were originally designed to help facilitate the healthcare process. Over time, the bureaucratic layers became the process and the pathway to healing. The doctor has consumed more of their time checking boxes and filling out forms than actually being with their patients or leading care.</w:t>
+      </w:r>
+    </w:p>
+    <w:p>
+      <w:pPr>
+        <w:pStyle w:val="BodyText"/>
+      </w:pPr>
+      <w:r>
+        <w:t>I believe this is why Bahá’u’lláh did not create any other curriculum or any formal institution. The Teaching With Mercy method is purposefully open ended. Each stage of milk, fruit, and meat when working with a true sage is specifically curated for the seeker’s needs. There is no standardized curriculum which works for every person. Yet all potential curriculum can be derived from the Kitáb-i-Aqdas and the letters, tablets, and books Bahá’u’lláh wrote to support it.</w:t>
+      </w:r>
+    </w:p>
+    <w:p>
+      <w:pPr>
+        <w:pStyle w:val="BodyText"/>
+      </w:pPr>
+      <w:r>
+        <w:t>I hope this book has done a good job demonstrating one way the Kitáb-i-Aqdas could be viewed. I also hope this book has inspired a desire to explore the Kitáb-i-Aqdas further on your own terms. Finally, I also hope there was something in the book to inspire you. In truth each chapter could have been a book in itself. There will always be more to explore. No matter what your future holds I hope you believe you have a soul, its purpose is to be liberated, and that you are willing to act as a trustee to your own soul.</w:t>
+      </w:r>
+    </w:p>
+    <w:p>
+      <w:pPr>
+        <w:pStyle w:val="BodyText"/>
+      </w:pPr>
+      <w:r>
+        <w:t>This final chapter has argued that serving the Cause begins with proclamation, deepens through teaching, and matures through mercy, patience, and the example of a life aligned with the Kitáb-i-Aqdas. If the reader leaves this book with anything, let it be the conviction that liberation begins within the soul, spreads through deeds, and eventually shapes communities capable of building the peace and trusteeship envisioned throughout these chapters. Thank you.</w:t>
       </w:r>
     </w:p>
     <w:p>
@@ -26292,7 +26635,7 @@
         <w:pStyle w:val="Heading1"/>
       </w:pPr>
       <w:bookmarkStart w:id="462" w:name="appendix-1-names-of-god"/>
-      <w:bookmarkStart w:id="463" w:name="_Toc223295717"/>
+      <w:bookmarkStart w:id="463" w:name="_Toc223511227"/>
       <w:bookmarkEnd w:id="449"/>
       <w:bookmarkEnd w:id="461"/>
       <w:r>
@@ -26528,7 +26871,7 @@
         <w:pStyle w:val="Heading1"/>
       </w:pPr>
       <w:bookmarkStart w:id="464" w:name="Xdc6fdd6cea4703c7fb522cbc9372eecc7bc7347"/>
-      <w:bookmarkStart w:id="465" w:name="_Toc223295718"/>
+      <w:bookmarkStart w:id="465" w:name="_Toc223511228"/>
       <w:bookmarkEnd w:id="462"/>
       <w:r>
         <w:lastRenderedPageBreak/>
@@ -26711,7 +27054,7 @@
         <w:pStyle w:val="Heading1"/>
       </w:pPr>
       <w:bookmarkStart w:id="475" w:name="appendix-10-the-bayanic-calendar"/>
-      <w:bookmarkStart w:id="476" w:name="_Toc223295719"/>
+      <w:bookmarkStart w:id="476" w:name="_Toc223511229"/>
       <w:bookmarkEnd w:id="464"/>
       <w:bookmarkEnd w:id="474"/>
       <w:r>
@@ -27396,7 +27739,7 @@
         <w:pStyle w:val="Heading1"/>
       </w:pPr>
       <w:bookmarkStart w:id="477" w:name="appendix-2-spiritual-practices"/>
-      <w:bookmarkStart w:id="478" w:name="_Toc223295720"/>
+      <w:bookmarkStart w:id="478" w:name="_Toc223511230"/>
       <w:bookmarkEnd w:id="475"/>
       <w:r>
         <w:lastRenderedPageBreak/>
@@ -27676,7 +28019,7 @@
         <w:pStyle w:val="Heading1"/>
       </w:pPr>
       <w:bookmarkStart w:id="479" w:name="appendix-3-virtues"/>
-      <w:bookmarkStart w:id="480" w:name="_Toc223295721"/>
+      <w:bookmarkStart w:id="480" w:name="_Toc223511231"/>
       <w:bookmarkEnd w:id="477"/>
       <w:r>
         <w:lastRenderedPageBreak/>
@@ -28172,7 +28515,7 @@
         <w:pStyle w:val="Heading1"/>
       </w:pPr>
       <w:bookmarkStart w:id="484" w:name="appendix-4-the-bayanic-mithqal"/>
-      <w:bookmarkStart w:id="485" w:name="_Toc223295722"/>
+      <w:bookmarkStart w:id="485" w:name="_Toc223511232"/>
       <w:bookmarkEnd w:id="479"/>
       <w:bookmarkEnd w:id="483"/>
       <w:r>
@@ -28309,7 +28652,7 @@
         <w:pStyle w:val="Heading1"/>
       </w:pPr>
       <w:bookmarkStart w:id="487" w:name="appendix-5-letters-and-meanings"/>
-      <w:bookmarkStart w:id="488" w:name="_Toc223295723"/>
+      <w:bookmarkStart w:id="488" w:name="_Toc223511233"/>
       <w:bookmarkEnd w:id="484"/>
       <w:bookmarkEnd w:id="486"/>
       <w:r>
@@ -29975,7 +30318,7 @@
         <w:pStyle w:val="Heading1"/>
       </w:pPr>
       <w:bookmarkStart w:id="489" w:name="appendix-6-child-development-model"/>
-      <w:bookmarkStart w:id="490" w:name="_Toc223295724"/>
+      <w:bookmarkStart w:id="490" w:name="_Toc223511234"/>
       <w:bookmarkEnd w:id="487"/>
       <w:r>
         <w:lastRenderedPageBreak/>
@@ -31152,7 +31495,7 @@
         <w:pStyle w:val="Heading1"/>
       </w:pPr>
       <w:bookmarkStart w:id="493" w:name="appendix-7-political-leaders-in-1873"/>
-      <w:bookmarkStart w:id="494" w:name="_Toc223295725"/>
+      <w:bookmarkStart w:id="494" w:name="_Toc223511235"/>
       <w:bookmarkEnd w:id="489"/>
       <w:bookmarkEnd w:id="491"/>
       <w:bookmarkEnd w:id="492"/>
@@ -34980,7 +35323,7 @@
         <w:pStyle w:val="Heading1"/>
       </w:pPr>
       <w:bookmarkStart w:id="499" w:name="appendix-8-trusteeship-levels-and-roles"/>
-      <w:bookmarkStart w:id="500" w:name="_Toc223295726"/>
+      <w:bookmarkStart w:id="500" w:name="_Toc223511236"/>
       <w:bookmarkEnd w:id="493"/>
       <w:bookmarkEnd w:id="498"/>
       <w:r>
@@ -44409,7 +44752,7 @@
         <w:footnoteRef/>
       </w:r>
       <w:r>
-        <w:t xml:space="preserve"> Kitab-i-Aqdas #42</w:t>
+        <w:t xml:space="preserve"> Kitáb-i-Aqdas #42</w:t>
       </w:r>
     </w:p>
   </w:footnote>
@@ -44553,7 +44896,7 @@
         <w:footnoteRef/>
       </w:r>
       <w:r>
-        <w:t xml:space="preserve"> Kitab-i-Aqdas #174</w:t>
+        <w:t xml:space="preserve"> Kitáb-i-Aqdas #174</w:t>
       </w:r>
     </w:p>
   </w:footnote>
@@ -44585,7 +44928,7 @@
         <w:footnoteRef/>
       </w:r>
       <w:r>
-        <w:t xml:space="preserve"> Kitab-i-Aqdas #117</w:t>
+        <w:t xml:space="preserve"> Kitáb-i-Aqdas #117</w:t>
       </w:r>
     </w:p>
   </w:footnote>
@@ -44601,7 +44944,7 @@
         <w:footnoteRef/>
       </w:r>
       <w:r>
-        <w:t xml:space="preserve"> Kitab-i-Aqdas #75</w:t>
+        <w:t xml:space="preserve"> Kitáb-i-Aqdas #75</w:t>
       </w:r>
     </w:p>
   </w:footnote>
@@ -44617,7 +44960,7 @@
         <w:footnoteRef/>
       </w:r>
       <w:r>
-        <w:t xml:space="preserve"> Kitab-i-Aqdas #118</w:t>
+        <w:t xml:space="preserve"> Kitáb-i-Aqdas #118</w:t>
       </w:r>
     </w:p>
   </w:footnote>
@@ -44633,7 +44976,7 @@
         <w:footnoteRef/>
       </w:r>
       <w:r>
-        <w:t xml:space="preserve"> Kitab-i-Aqdas #100</w:t>
+        <w:t xml:space="preserve"> Kitáb-i-Aqdas #100</w:t>
       </w:r>
     </w:p>
   </w:footnote>
@@ -44649,7 +44992,7 @@
         <w:footnoteRef/>
       </w:r>
       <w:r>
-        <w:t xml:space="preserve"> Kitab-i-Aqdas #134</w:t>
+        <w:t xml:space="preserve"> Kitáb-i-Aqdas #134</w:t>
       </w:r>
     </w:p>
   </w:footnote>
@@ -44665,7 +45008,19 @@
         <w:footnoteRef/>
       </w:r>
       <w:r>
-        <w:t xml:space="preserve"> Kitab-i-Aqdas #73</w:t>
+        <w:t xml:space="preserve"> </w:t>
+      </w:r>
+      <w:r>
+        <w:rPr>
+          <w:b/>
+          <w:bCs/>
+          <w:i/>
+          <w:iCs/>
+        </w:rPr>
+        <w:t>Kitáb-i-Aqdas</w:t>
+      </w:r>
+      <w:r>
+        <w:t xml:space="preserve"> #73</w:t>
       </w:r>
     </w:p>
   </w:footnote>
@@ -44764,7 +45119,7 @@
   <w:abstractNum w:abstractNumId="0" w15:restartNumberingAfterBreak="0">
     <w:nsid w:val="0000A990"/>
     <w:multiLevelType w:val="multilevel"/>
-    <w:tmpl w:val="F380235C"/>
+    <w:tmpl w:val="D3BC7654"/>
     <w:lvl w:ilvl="0">
       <w:numFmt w:val="bullet"/>
       <w:lvlText w:val=" "/>
@@ -44841,7 +45196,7 @@
   <w:abstractNum w:abstractNumId="1" w15:restartNumberingAfterBreak="0">
     <w:nsid w:val="0000A991"/>
     <w:multiLevelType w:val="multilevel"/>
-    <w:tmpl w:val="56100F92"/>
+    <w:tmpl w:val="54F837D4"/>
     <w:lvl w:ilvl="0">
       <w:numFmt w:val="bullet"/>
       <w:lvlText w:val="•"/>
@@ -44918,7 +45273,7 @@
   <w:abstractNum w:abstractNumId="2" w15:restartNumberingAfterBreak="0">
     <w:nsid w:val="00A99411"/>
     <w:multiLevelType w:val="multilevel"/>
-    <w:tmpl w:val="56D6DF20"/>
+    <w:tmpl w:val="E77ABB6E"/>
     <w:lvl w:ilvl="0">
       <w:start w:val="1"/>
       <w:numFmt w:val="decimal"/>
@@ -45004,7 +45359,7 @@
   <w:abstractNum w:abstractNumId="3" w15:restartNumberingAfterBreak="0">
     <w:nsid w:val="00A99415"/>
     <w:multiLevelType w:val="multilevel"/>
-    <w:tmpl w:val="10B0B264"/>
+    <w:tmpl w:val="99A24A82"/>
     <w:lvl w:ilvl="0">
       <w:start w:val="5"/>
       <w:numFmt w:val="decimal"/>
@@ -45090,7 +45445,7 @@
   <w:abstractNum w:abstractNumId="4" w15:restartNumberingAfterBreak="0">
     <w:nsid w:val="00A99611"/>
     <w:multiLevelType w:val="multilevel"/>
-    <w:tmpl w:val="9E1E8966"/>
+    <w:tmpl w:val="7C78A5EC"/>
     <w:lvl w:ilvl="0">
       <w:start w:val="1"/>
       <w:numFmt w:val="upperRoman"/>
@@ -45176,7 +45531,7 @@
   <w:abstractNum w:abstractNumId="5" w15:restartNumberingAfterBreak="0">
     <w:nsid w:val="0A994114"/>
     <w:multiLevelType w:val="multilevel"/>
-    <w:tmpl w:val="C0308E80"/>
+    <w:tmpl w:val="3274006A"/>
     <w:lvl w:ilvl="0">
       <w:start w:val="14"/>
       <w:numFmt w:val="decimal"/>
@@ -45262,7 +45617,7 @@
   <w:abstractNum w:abstractNumId="6" w15:restartNumberingAfterBreak="0">
     <w:nsid w:val="0A994117"/>
     <w:multiLevelType w:val="multilevel"/>
-    <w:tmpl w:val="A3661E0E"/>
+    <w:tmpl w:val="1F461E02"/>
     <w:lvl w:ilvl="0">
       <w:start w:val="17"/>
       <w:numFmt w:val="decimal"/>
@@ -45348,7 +45703,7 @@
   <w:abstractNum w:abstractNumId="7" w15:restartNumberingAfterBreak="0">
     <w:nsid w:val="0A994118"/>
     <w:multiLevelType w:val="multilevel"/>
-    <w:tmpl w:val="248695DC"/>
+    <w:tmpl w:val="61ECF0F8"/>
     <w:lvl w:ilvl="0">
       <w:start w:val="18"/>
       <w:numFmt w:val="decimal"/>
@@ -45434,7 +45789,7 @@
   <w:abstractNum w:abstractNumId="8" w15:restartNumberingAfterBreak="0">
     <w:nsid w:val="0A994120"/>
     <w:multiLevelType w:val="multilevel"/>
-    <w:tmpl w:val="8D5205AC"/>
+    <w:tmpl w:val="2864D464"/>
     <w:lvl w:ilvl="0">
       <w:start w:val="20"/>
       <w:numFmt w:val="decimal"/>
@@ -45520,7 +45875,7 @@
   <w:abstractNum w:abstractNumId="9" w15:restartNumberingAfterBreak="0">
     <w:nsid w:val="0A994122"/>
     <w:multiLevelType w:val="multilevel"/>
-    <w:tmpl w:val="5B227EEC"/>
+    <w:tmpl w:val="45D201F6"/>
     <w:lvl w:ilvl="0">
       <w:start w:val="22"/>
       <w:numFmt w:val="decimal"/>
@@ -45606,7 +45961,7 @@
   <w:abstractNum w:abstractNumId="10" w15:restartNumberingAfterBreak="0">
     <w:nsid w:val="0A994126"/>
     <w:multiLevelType w:val="multilevel"/>
-    <w:tmpl w:val="29B466A6"/>
+    <w:tmpl w:val="8EB6452E"/>
     <w:lvl w:ilvl="0">
       <w:start w:val="26"/>
       <w:numFmt w:val="decimal"/>
@@ -45912,13 +46267,13 @@
   <w:num w:numId="11" w16cid:durableId="2033913365">
     <w:abstractNumId w:val="11"/>
   </w:num>
-  <w:num w:numId="12" w16cid:durableId="1395931240">
+  <w:num w:numId="12" w16cid:durableId="920334450">
     <w:abstractNumId w:val="0"/>
   </w:num>
-  <w:num w:numId="13" w16cid:durableId="1695307403">
+  <w:num w:numId="13" w16cid:durableId="809636348">
     <w:abstractNumId w:val="1"/>
   </w:num>
-  <w:num w:numId="14" w16cid:durableId="902640393">
+  <w:num w:numId="14" w16cid:durableId="1292861298">
     <w:abstractNumId w:val="2"/>
     <w:lvlOverride w:ilvl="0">
       <w:startOverride w:val="1"/>
@@ -45948,7 +46303,7 @@
       <w:startOverride w:val="1"/>
     </w:lvlOverride>
   </w:num>
-  <w:num w:numId="15" w16cid:durableId="1815099266">
+  <w:num w:numId="15" w16cid:durableId="1141655753">
     <w:abstractNumId w:val="2"/>
     <w:lvlOverride w:ilvl="0">
       <w:startOverride w:val="1"/>
@@ -45978,7 +46333,7 @@
       <w:startOverride w:val="1"/>
     </w:lvlOverride>
   </w:num>
-  <w:num w:numId="16" w16cid:durableId="783504621">
+  <w:num w:numId="16" w16cid:durableId="1355109253">
     <w:abstractNumId w:val="2"/>
     <w:lvlOverride w:ilvl="0">
       <w:startOverride w:val="1"/>
@@ -46008,7 +46363,7 @@
       <w:startOverride w:val="1"/>
     </w:lvlOverride>
   </w:num>
-  <w:num w:numId="17" w16cid:durableId="64880900">
+  <w:num w:numId="17" w16cid:durableId="1807233252">
     <w:abstractNumId w:val="2"/>
     <w:lvlOverride w:ilvl="0">
       <w:startOverride w:val="1"/>
@@ -46038,7 +46393,7 @@
       <w:startOverride w:val="1"/>
     </w:lvlOverride>
   </w:num>
-  <w:num w:numId="18" w16cid:durableId="903682164">
+  <w:num w:numId="18" w16cid:durableId="395711348">
     <w:abstractNumId w:val="4"/>
     <w:lvlOverride w:ilvl="0">
       <w:startOverride w:val="1"/>
@@ -46068,7 +46423,7 @@
       <w:startOverride w:val="1"/>
     </w:lvlOverride>
   </w:num>
-  <w:num w:numId="19" w16cid:durableId="1741756869">
+  <w:num w:numId="19" w16cid:durableId="1654679822">
     <w:abstractNumId w:val="2"/>
     <w:lvlOverride w:ilvl="0">
       <w:startOverride w:val="1"/>
@@ -46098,7 +46453,7 @@
       <w:startOverride w:val="1"/>
     </w:lvlOverride>
   </w:num>
-  <w:num w:numId="20" w16cid:durableId="774715547">
+  <w:num w:numId="20" w16cid:durableId="673726155">
     <w:abstractNumId w:val="3"/>
     <w:lvlOverride w:ilvl="0">
       <w:startOverride w:val="5"/>
@@ -46128,7 +46483,7 @@
       <w:startOverride w:val="5"/>
     </w:lvlOverride>
   </w:num>
-  <w:num w:numId="21" w16cid:durableId="1217428669">
+  <w:num w:numId="21" w16cid:durableId="60178950">
     <w:abstractNumId w:val="5"/>
     <w:lvlOverride w:ilvl="0">
       <w:startOverride w:val="14"/>
@@ -46158,7 +46513,7 @@
       <w:startOverride w:val="14"/>
     </w:lvlOverride>
   </w:num>
-  <w:num w:numId="22" w16cid:durableId="367219375">
+  <w:num w:numId="22" w16cid:durableId="1962682442">
     <w:abstractNumId w:val="6"/>
     <w:lvlOverride w:ilvl="0">
       <w:startOverride w:val="17"/>
@@ -46188,7 +46543,7 @@
       <w:startOverride w:val="17"/>
     </w:lvlOverride>
   </w:num>
-  <w:num w:numId="23" w16cid:durableId="2020157095">
+  <w:num w:numId="23" w16cid:durableId="1722436799">
     <w:abstractNumId w:val="7"/>
     <w:lvlOverride w:ilvl="0">
       <w:startOverride w:val="18"/>
@@ -46218,7 +46573,7 @@
       <w:startOverride w:val="18"/>
     </w:lvlOverride>
   </w:num>
-  <w:num w:numId="24" w16cid:durableId="1138764810">
+  <w:num w:numId="24" w16cid:durableId="360935109">
     <w:abstractNumId w:val="8"/>
     <w:lvlOverride w:ilvl="0">
       <w:startOverride w:val="20"/>
@@ -46248,7 +46603,7 @@
       <w:startOverride w:val="20"/>
     </w:lvlOverride>
   </w:num>
-  <w:num w:numId="25" w16cid:durableId="1876650979">
+  <w:num w:numId="25" w16cid:durableId="786045430">
     <w:abstractNumId w:val="2"/>
     <w:lvlOverride w:ilvl="0">
       <w:startOverride w:val="1"/>
@@ -46278,7 +46633,7 @@
       <w:startOverride w:val="1"/>
     </w:lvlOverride>
   </w:num>
-  <w:num w:numId="26" w16cid:durableId="1848128018">
+  <w:num w:numId="26" w16cid:durableId="969556286">
     <w:abstractNumId w:val="9"/>
     <w:lvlOverride w:ilvl="0">
       <w:startOverride w:val="22"/>
@@ -46308,7 +46663,7 @@
       <w:startOverride w:val="22"/>
     </w:lvlOverride>
   </w:num>
-  <w:num w:numId="27" w16cid:durableId="679478282">
+  <w:num w:numId="27" w16cid:durableId="477118094">
     <w:abstractNumId w:val="10"/>
     <w:lvlOverride w:ilvl="0">
       <w:startOverride w:val="26"/>
@@ -46338,28 +46693,28 @@
       <w:startOverride w:val="26"/>
     </w:lvlOverride>
   </w:num>
-  <w:num w:numId="28" w16cid:durableId="668027361">
+  <w:num w:numId="28" w16cid:durableId="2104302624">
     <w:abstractNumId w:val="1"/>
   </w:num>
-  <w:num w:numId="29" w16cid:durableId="644746797">
+  <w:num w:numId="29" w16cid:durableId="1512179249">
     <w:abstractNumId w:val="1"/>
   </w:num>
-  <w:num w:numId="30" w16cid:durableId="653873353">
+  <w:num w:numId="30" w16cid:durableId="2082827664">
     <w:abstractNumId w:val="1"/>
   </w:num>
-  <w:num w:numId="31" w16cid:durableId="1296524513">
+  <w:num w:numId="31" w16cid:durableId="1832600081">
     <w:abstractNumId w:val="1"/>
   </w:num>
-  <w:num w:numId="32" w16cid:durableId="2005082289">
+  <w:num w:numId="32" w16cid:durableId="117573764">
     <w:abstractNumId w:val="1"/>
   </w:num>
-  <w:num w:numId="33" w16cid:durableId="966861351">
+  <w:num w:numId="33" w16cid:durableId="1512722655">
     <w:abstractNumId w:val="1"/>
   </w:num>
-  <w:num w:numId="34" w16cid:durableId="1745831045">
+  <w:num w:numId="34" w16cid:durableId="1583905276">
     <w:abstractNumId w:val="1"/>
   </w:num>
-  <w:num w:numId="35" w16cid:durableId="26953049">
+  <w:num w:numId="35" w16cid:durableId="1363438889">
     <w:abstractNumId w:val="2"/>
     <w:lvlOverride w:ilvl="0">
       <w:startOverride w:val="1"/>
@@ -46389,7 +46744,7 @@
       <w:startOverride w:val="1"/>
     </w:lvlOverride>
   </w:num>
-  <w:num w:numId="36" w16cid:durableId="2109814741">
+  <w:num w:numId="36" w16cid:durableId="231045882">
     <w:abstractNumId w:val="2"/>
     <w:lvlOverride w:ilvl="0">
       <w:startOverride w:val="1"/>
@@ -46419,7 +46774,7 @@
       <w:startOverride w:val="1"/>
     </w:lvlOverride>
   </w:num>
-  <w:num w:numId="37" w16cid:durableId="1494908049">
+  <w:num w:numId="37" w16cid:durableId="926158209">
     <w:abstractNumId w:val="2"/>
     <w:lvlOverride w:ilvl="0">
       <w:startOverride w:val="1"/>
@@ -46449,7 +46804,7 @@
       <w:startOverride w:val="1"/>
     </w:lvlOverride>
   </w:num>
-  <w:num w:numId="38" w16cid:durableId="226182934">
+  <w:num w:numId="38" w16cid:durableId="466901569">
     <w:abstractNumId w:val="2"/>
     <w:lvlOverride w:ilvl="0">
       <w:startOverride w:val="1"/>
@@ -46479,19 +46834,19 @@
       <w:startOverride w:val="1"/>
     </w:lvlOverride>
   </w:num>
-  <w:num w:numId="39" w16cid:durableId="263072205">
+  <w:num w:numId="39" w16cid:durableId="1453861268">
     <w:abstractNumId w:val="1"/>
   </w:num>
-  <w:num w:numId="40" w16cid:durableId="1936667866">
+  <w:num w:numId="40" w16cid:durableId="320306154">
     <w:abstractNumId w:val="1"/>
   </w:num>
-  <w:num w:numId="41" w16cid:durableId="151720289">
+  <w:num w:numId="41" w16cid:durableId="2125608999">
     <w:abstractNumId w:val="1"/>
   </w:num>
-  <w:num w:numId="42" w16cid:durableId="1651133003">
+  <w:num w:numId="42" w16cid:durableId="107823720">
     <w:abstractNumId w:val="1"/>
   </w:num>
-  <w:num w:numId="43" w16cid:durableId="1053388536">
+  <w:num w:numId="43" w16cid:durableId="287778984">
     <w:abstractNumId w:val="2"/>
     <w:lvlOverride w:ilvl="0">
       <w:startOverride w:val="1"/>
@@ -46521,7 +46876,7 @@
       <w:startOverride w:val="1"/>
     </w:lvlOverride>
   </w:num>
-  <w:num w:numId="44" w16cid:durableId="718941182">
+  <w:num w:numId="44" w16cid:durableId="949240307">
     <w:abstractNumId w:val="2"/>
     <w:lvlOverride w:ilvl="0">
       <w:startOverride w:val="1"/>
@@ -46551,7 +46906,7 @@
       <w:startOverride w:val="1"/>
     </w:lvlOverride>
   </w:num>
-  <w:num w:numId="45" w16cid:durableId="1978796518">
+  <w:num w:numId="45" w16cid:durableId="411783607">
     <w:abstractNumId w:val="2"/>
     <w:lvlOverride w:ilvl="0">
       <w:startOverride w:val="1"/>
@@ -46581,7 +46936,7 @@
       <w:startOverride w:val="1"/>
     </w:lvlOverride>
   </w:num>
-  <w:num w:numId="46" w16cid:durableId="1767385429">
+  <w:num w:numId="46" w16cid:durableId="670257920">
     <w:abstractNumId w:val="2"/>
     <w:lvlOverride w:ilvl="0">
       <w:startOverride w:val="1"/>
@@ -46611,7 +46966,7 @@
       <w:startOverride w:val="1"/>
     </w:lvlOverride>
   </w:num>
-  <w:num w:numId="47" w16cid:durableId="40061687">
+  <w:num w:numId="47" w16cid:durableId="543368222">
     <w:abstractNumId w:val="2"/>
     <w:lvlOverride w:ilvl="0">
       <w:startOverride w:val="1"/>
@@ -46641,7 +46996,7 @@
       <w:startOverride w:val="1"/>
     </w:lvlOverride>
   </w:num>
-  <w:num w:numId="48" w16cid:durableId="2132045126">
+  <w:num w:numId="48" w16cid:durableId="1430614783">
     <w:abstractNumId w:val="2"/>
     <w:lvlOverride w:ilvl="0">
       <w:startOverride w:val="1"/>
@@ -46671,7 +47026,7 @@
       <w:startOverride w:val="1"/>
     </w:lvlOverride>
   </w:num>
-  <w:num w:numId="49" w16cid:durableId="708845580">
+  <w:num w:numId="49" w16cid:durableId="66922742">
     <w:abstractNumId w:val="2"/>
     <w:lvlOverride w:ilvl="0">
       <w:startOverride w:val="1"/>
@@ -46701,7 +47056,7 @@
       <w:startOverride w:val="1"/>
     </w:lvlOverride>
   </w:num>
-  <w:num w:numId="50" w16cid:durableId="1700736122">
+  <w:num w:numId="50" w16cid:durableId="701395538">
     <w:abstractNumId w:val="2"/>
     <w:lvlOverride w:ilvl="0">
       <w:startOverride w:val="1"/>
@@ -46731,13 +47086,13 @@
       <w:startOverride w:val="1"/>
     </w:lvlOverride>
   </w:num>
-  <w:num w:numId="51" w16cid:durableId="1628923986">
+  <w:num w:numId="51" w16cid:durableId="271740697">
     <w:abstractNumId w:val="1"/>
   </w:num>
-  <w:num w:numId="52" w16cid:durableId="422263278">
+  <w:num w:numId="52" w16cid:durableId="741290004">
     <w:abstractNumId w:val="1"/>
   </w:num>
-  <w:num w:numId="53" w16cid:durableId="1966346098">
+  <w:num w:numId="53" w16cid:durableId="278728016">
     <w:abstractNumId w:val="1"/>
   </w:num>
 </w:numbering>
@@ -48369,7 +48724,7 @@
     <w:autoRedefine/>
     <w:uiPriority w:val="39"/>
     <w:unhideWhenUsed/>
-    <w:rsid w:val="00960C43"/>
+    <w:rsid w:val="007A5FFC"/>
     <w:pPr>
       <w:spacing w:after="100"/>
     </w:pPr>

</xml_diff>